<commit_message>
Update Actividad 2 - Documento de formulación del proyecto.docx
Se realiza ajuste del documento se agrega el punto 7 - 8
</commit_message>
<xml_diff>
--- a/Actividad 2 - Documento de formulación del proyecto.docx
+++ b/Actividad 2 - Documento de formulación del proyecto.docx
@@ -38,12 +38,12 @@
           <w:lang w:val="es-CO" w:bidi="ar-SA"/>
         </w:rPr>
       </w:r>
-      <w:bookmarkStart w:id="2" w:name="_Toc185035819"/>
+      <w:bookmarkStart w:id="2" w:name="_Toc61935805_Copia_1"/>
       <w:bookmarkStart w:id="3" w:name="_Toc185035946"/>
-      <w:bookmarkStart w:id="4" w:name="_Toc61935805_Copia_1"/>
-      <w:bookmarkStart w:id="5" w:name="_Toc185035819"/>
+      <w:bookmarkStart w:id="4" w:name="_Toc185035819"/>
+      <w:bookmarkStart w:id="5" w:name="_Toc61935805_Copia_1"/>
       <w:bookmarkStart w:id="6" w:name="_Toc185035946"/>
-      <w:bookmarkStart w:id="7" w:name="_Toc61935805_Copia_1"/>
+      <w:bookmarkStart w:id="7" w:name="_Toc185035819"/>
       <w:bookmarkEnd w:id="5"/>
       <w:bookmarkEnd w:id="6"/>
       <w:bookmarkEnd w:id="7"/>
@@ -159,7 +159,7 @@
           <w:lang w:val="es-CO" w:bidi="ar-SA"/>
         </w:rPr>
         <w:drawing>
-          <wp:anchor distT="0" distB="0" distL="0" distR="0" simplePos="0" relativeHeight="22" behindDoc="0" locked="0" layoutInCell="0" allowOverlap="1">
+          <wp:anchor distT="0" distB="0" distL="0" distR="0" simplePos="0" relativeHeight="27" behindDoc="0" locked="0" layoutInCell="0" allowOverlap="1">
             <wp:simplePos x="0" y="0"/>
             <wp:positionH relativeFrom="column">
               <wp:posOffset>1684655</wp:posOffset>
@@ -603,28 +603,28 @@
           <w:lang w:val="es-CO" w:bidi="ar-SA"/>
         </w:rPr>
       </w:pPr>
-      <w:bookmarkStart w:id="8" w:name="_Toc55962612"/>
-      <w:bookmarkStart w:id="9" w:name="_Toc55962767"/>
-      <w:bookmarkStart w:id="10" w:name="_Toc55962868"/>
-      <w:bookmarkStart w:id="11" w:name="_Toc55972098"/>
-      <w:bookmarkStart w:id="12" w:name="_Toc57258272"/>
-      <w:bookmarkStart w:id="13" w:name="_Toc57258424"/>
-      <w:bookmarkStart w:id="14" w:name="_Toc57258726"/>
-      <w:bookmarkStart w:id="15" w:name="_Toc57260719"/>
-      <w:bookmarkStart w:id="16" w:name="_Toc57261154"/>
-      <w:bookmarkStart w:id="17" w:name="_Toc61935807"/>
-      <w:bookmarkStart w:id="18" w:name="_Toc262170287"/>
-      <w:bookmarkStart w:id="19" w:name="_Toc136600878"/>
-      <w:bookmarkStart w:id="20" w:name="_Toc156952358"/>
-      <w:bookmarkStart w:id="21" w:name="_Toc184890569"/>
-      <w:bookmarkStart w:id="22" w:name="_Toc184891358"/>
-      <w:bookmarkStart w:id="23" w:name="_Toc184891792"/>
-      <w:bookmarkStart w:id="24" w:name="_Toc185035825"/>
-      <w:bookmarkStart w:id="25" w:name="_Toc185035952"/>
-      <w:bookmarkStart w:id="26" w:name="_Toc185063559"/>
-      <w:bookmarkStart w:id="27" w:name="_Toc185067740"/>
-      <w:bookmarkStart w:id="28" w:name="_Toc185035819_Copia_1"/>
-      <w:bookmarkStart w:id="29" w:name="_Toc185035946_Copia_1"/>
+      <w:bookmarkStart w:id="8" w:name="_Toc185035946_Copia_1"/>
+      <w:bookmarkStart w:id="9" w:name="_Toc185035819_Copia_1"/>
+      <w:bookmarkStart w:id="10" w:name="_Toc185067740"/>
+      <w:bookmarkStart w:id="11" w:name="_Toc185063559"/>
+      <w:bookmarkStart w:id="12" w:name="_Toc185035952"/>
+      <w:bookmarkStart w:id="13" w:name="_Toc185035825"/>
+      <w:bookmarkStart w:id="14" w:name="_Toc184891792"/>
+      <w:bookmarkStart w:id="15" w:name="_Toc184891358"/>
+      <w:bookmarkStart w:id="16" w:name="_Toc184890569"/>
+      <w:bookmarkStart w:id="17" w:name="_Toc156952358"/>
+      <w:bookmarkStart w:id="18" w:name="_Toc136600878"/>
+      <w:bookmarkStart w:id="19" w:name="_Toc262170287"/>
+      <w:bookmarkStart w:id="20" w:name="_Toc61935807"/>
+      <w:bookmarkStart w:id="21" w:name="_Toc57261154"/>
+      <w:bookmarkStart w:id="22" w:name="_Toc57260719"/>
+      <w:bookmarkStart w:id="23" w:name="_Toc57258726"/>
+      <w:bookmarkStart w:id="24" w:name="_Toc57258424"/>
+      <w:bookmarkStart w:id="25" w:name="_Toc57258272"/>
+      <w:bookmarkStart w:id="26" w:name="_Toc55972098"/>
+      <w:bookmarkStart w:id="27" w:name="_Toc55962868"/>
+      <w:bookmarkStart w:id="28" w:name="_Toc55962767"/>
+      <w:bookmarkStart w:id="29" w:name="_Toc55962612"/>
       <w:bookmarkEnd w:id="8"/>
       <w:bookmarkEnd w:id="9"/>
       <w:bookmarkEnd w:id="10"/>
@@ -871,10 +871,7 @@
               <w:tab w:val="right" w:pos="9009" w:leader="dot"/>
             </w:tabs>
             <w:jc w:val="both"/>
-            <w:rPr>
-              <w:vanish w:val="false"/>
-              <w:lang w:val="es-CO" w:eastAsia="en-US" w:bidi="ar-SA"/>
-            </w:rPr>
+            <w:rPr/>
           </w:pPr>
           <w:r>
             <w:rPr>
@@ -1150,10 +1147,7 @@
               <w:tab w:val="right" w:pos="9009" w:leader="dot"/>
             </w:tabs>
             <w:jc w:val="both"/>
-            <w:rPr>
-              <w:vanish w:val="false"/>
-              <w:lang w:val="es-CO" w:bidi="ar-SA"/>
-            </w:rPr>
+            <w:rPr/>
           </w:pPr>
           <w:r>
             <w:rPr>
@@ -1192,32 +1186,26 @@
             <w:rPr/>
           </w:pPr>
           <w:r>
-            <w:rPr/>
-            <w:t>4</w:t>
-          </w:r>
-          <w:r>
-            <w:rPr/>
-            <w:t>.</w:t>
-          </w:r>
-          <w:r>
-            <w:rPr/>
-            <w:t>1</w:t>
-          </w:r>
-          <w:r>
-            <w:rPr/>
-            <w:t xml:space="preserve"> Descripción general de Scrum</w:t>
+            <w:rPr>
+              <w:lang w:val="es-CO" w:bidi="ar-SA"/>
+            </w:rPr>
+            <w:t>4.1 Descripción general de Scrum</w:t>
           </w:r>
           <w:hyperlink w:anchor="_Toc62801090">
             <w:r>
               <w:rPr>
                 <w:rStyle w:val="Enlacedelndice"/>
+                <w:vanish w:val="false"/>
                 <w:webHidden/>
+                <w:lang w:val="es-CO" w:bidi="ar-SA"/>
               </w:rPr>
               <w:tab/>
             </w:r>
           </w:hyperlink>
           <w:r>
-            <w:rPr/>
+            <w:rPr>
+              <w:lang w:val="es-CO" w:bidi="ar-SA"/>
+            </w:rPr>
             <w:t>6</w:t>
           </w:r>
         </w:p>
@@ -1232,32 +1220,26 @@
             <w:rPr/>
           </w:pPr>
           <w:r>
-            <w:rPr/>
-            <w:t>4</w:t>
-          </w:r>
-          <w:r>
-            <w:rPr/>
-            <w:t>.</w:t>
-          </w:r>
-          <w:r>
-            <w:rPr/>
-            <w:t>2</w:t>
-          </w:r>
-          <w:r>
-            <w:rPr/>
-            <w:t xml:space="preserve"> Descripción general de Scrum</w:t>
+            <w:rPr>
+              <w:lang w:val="es-CO" w:bidi="ar-SA"/>
+            </w:rPr>
+            <w:t>4.2 Descripción general de Scrum</w:t>
           </w:r>
           <w:hyperlink w:anchor="_Toc62801090">
             <w:r>
               <w:rPr>
                 <w:rStyle w:val="Enlacedelndice"/>
+                <w:vanish w:val="false"/>
                 <w:webHidden/>
+                <w:lang w:val="es-CO" w:bidi="ar-SA"/>
               </w:rPr>
               <w:tab/>
             </w:r>
           </w:hyperlink>
           <w:r>
-            <w:rPr/>
+            <w:rPr>
+              <w:lang w:val="es-CO" w:bidi="ar-SA"/>
+            </w:rPr>
             <w:t>6</w:t>
           </w:r>
         </w:p>
@@ -1272,32 +1254,26 @@
             <w:rPr/>
           </w:pPr>
           <w:r>
-            <w:rPr/>
-            <w:t>4</w:t>
-          </w:r>
-          <w:r>
-            <w:rPr/>
-            <w:t>.</w:t>
-          </w:r>
-          <w:r>
-            <w:rPr/>
-            <w:t>3</w:t>
-          </w:r>
-          <w:r>
-            <w:rPr/>
-            <w:t xml:space="preserve"> Descripción general de Scrum</w:t>
+            <w:rPr>
+              <w:lang w:val="es-CO" w:bidi="ar-SA"/>
+            </w:rPr>
+            <w:t>4.3 Descripción general de Scrum</w:t>
           </w:r>
           <w:hyperlink w:anchor="_Toc62801090">
             <w:r>
               <w:rPr>
                 <w:rStyle w:val="Enlacedelndice"/>
+                <w:vanish w:val="false"/>
                 <w:webHidden/>
+                <w:lang w:val="es-CO" w:bidi="ar-SA"/>
               </w:rPr>
               <w:tab/>
             </w:r>
           </w:hyperlink>
           <w:r>
-            <w:rPr/>
+            <w:rPr>
+              <w:lang w:val="es-CO" w:bidi="ar-SA"/>
+            </w:rPr>
             <w:t>6</w:t>
           </w:r>
         </w:p>
@@ -1312,32 +1288,26 @@
             <w:rPr/>
           </w:pPr>
           <w:r>
-            <w:rPr/>
-            <w:t>4</w:t>
-          </w:r>
-          <w:r>
-            <w:rPr/>
-            <w:t>.</w:t>
-          </w:r>
-          <w:r>
-            <w:rPr/>
-            <w:t>4</w:t>
-          </w:r>
-          <w:r>
-            <w:rPr/>
-            <w:t xml:space="preserve"> Organización del trabajo mediante Sprints</w:t>
+            <w:rPr>
+              <w:lang w:val="es-CO" w:bidi="ar-SA"/>
+            </w:rPr>
+            <w:t>4.4 Organización del trabajo mediante Sprints</w:t>
           </w:r>
           <w:hyperlink w:anchor="_Toc62801090">
             <w:r>
               <w:rPr>
                 <w:rStyle w:val="Enlacedelndice"/>
+                <w:vanish w:val="false"/>
                 <w:webHidden/>
+                <w:lang w:val="es-CO" w:bidi="ar-SA"/>
               </w:rPr>
               <w:tab/>
             </w:r>
           </w:hyperlink>
           <w:r>
-            <w:rPr/>
+            <w:rPr>
+              <w:lang w:val="es-CO" w:bidi="ar-SA"/>
+            </w:rPr>
             <w:t>6</w:t>
           </w:r>
         </w:p>
@@ -1637,6 +1607,190 @@
               <w:tab w:val="right" w:pos="9009" w:leader="dot"/>
             </w:tabs>
             <w:jc w:val="both"/>
+            <w:rPr>
+              <w:lang w:val="es-CO" w:bidi="ar-SA"/>
+            </w:rPr>
+          </w:pPr>
+          <w:r>
+            <w:rPr>
+              <w:lang w:val="es-CO" w:bidi="ar-SA"/>
+            </w:rPr>
+            <w:t>8. Flujos de solución</w:t>
+          </w:r>
+          <w:hyperlink w:anchor="_Toc62801091">
+            <w:r>
+              <w:rPr>
+                <w:rStyle w:val="Enlacedelndice"/>
+                <w:webHidden/>
+                <w:lang w:val="es-CO" w:bidi="ar-SA"/>
+              </w:rPr>
+              <w:tab/>
+            </w:r>
+          </w:hyperlink>
+          <w:r>
+            <w:rPr>
+              <w:lang w:val="es-CO" w:bidi="ar-SA"/>
+            </w:rPr>
+            <w:t>13</w:t>
+          </w:r>
+        </w:p>
+        <w:p>
+          <w:pPr>
+            <w:pStyle w:val="TOC2"/>
+            <w:tabs>
+              <w:tab w:val="clear" w:pos="708"/>
+              <w:tab w:val="right" w:pos="9009" w:leader="dot"/>
+            </w:tabs>
+            <w:jc w:val="both"/>
+            <w:rPr/>
+          </w:pPr>
+          <w:r>
+            <w:rPr/>
+            <w:t>8.1</w:t>
+          </w:r>
+          <w:r>
+            <w:rPr/>
+            <w:t xml:space="preserve"> User Flow </w:t>
+          </w:r>
+          <w:hyperlink w:anchor="_Toc62801090">
+            <w:r>
+              <w:rPr>
+                <w:rStyle w:val="Enlacedelndice"/>
+                <w:vanish w:val="false"/>
+                <w:webHidden/>
+              </w:rPr>
+              <w:tab/>
+            </w:r>
+          </w:hyperlink>
+          <w:r>
+            <w:rPr>
+              <w:vanish w:val="false"/>
+            </w:rPr>
+            <w:t>9</w:t>
+          </w:r>
+        </w:p>
+        <w:p>
+          <w:pPr>
+            <w:pStyle w:val="TOC2"/>
+            <w:tabs>
+              <w:tab w:val="clear" w:pos="708"/>
+              <w:tab w:val="right" w:pos="9009" w:leader="dot"/>
+            </w:tabs>
+            <w:jc w:val="both"/>
+            <w:rPr/>
+          </w:pPr>
+          <w:r>
+            <w:rPr/>
+            <w:t>8.2</w:t>
+          </w:r>
+          <w:r>
+            <w:rPr/>
+            <w:t xml:space="preserve"> Diagrama de flujo del sistema </w:t>
+          </w:r>
+          <w:hyperlink w:anchor="_Toc62801090">
+            <w:r>
+              <w:rPr>
+                <w:rStyle w:val="Enlacedelndice"/>
+                <w:webHidden/>
+              </w:rPr>
+              <w:tab/>
+            </w:r>
+          </w:hyperlink>
+          <w:r>
+            <w:rPr/>
+            <w:t>9</w:t>
+          </w:r>
+        </w:p>
+        <w:p>
+          <w:pPr>
+            <w:pStyle w:val="TOC1"/>
+            <w:tabs>
+              <w:tab w:val="clear" w:pos="708"/>
+              <w:tab w:val="right" w:pos="9009" w:leader="dot"/>
+            </w:tabs>
+            <w:jc w:val="both"/>
+            <w:rPr>
+              <w:lang w:val="es-CO" w:bidi="ar-SA"/>
+            </w:rPr>
+          </w:pPr>
+          <w:r>
+            <w:rPr>
+              <w:lang w:val="es-CO" w:bidi="ar-SA"/>
+            </w:rPr>
+            <w:t>9</w:t>
+          </w:r>
+          <w:r>
+            <w:rPr>
+              <w:lang w:val="es-CO" w:bidi="ar-SA"/>
+            </w:rPr>
+            <w:t>. Solución tecnológica a implementar</w:t>
+          </w:r>
+          <w:hyperlink w:anchor="_Toc62801091">
+            <w:r>
+              <w:rPr>
+                <w:rStyle w:val="Enlacedelndice"/>
+                <w:webHidden/>
+                <w:lang w:val="es-CO" w:bidi="ar-SA"/>
+              </w:rPr>
+              <w:tab/>
+            </w:r>
+          </w:hyperlink>
+          <w:r>
+            <w:rPr>
+              <w:lang w:val="es-CO" w:bidi="ar-SA"/>
+            </w:rPr>
+            <w:t>13</w:t>
+          </w:r>
+        </w:p>
+        <w:p>
+          <w:pPr>
+            <w:pStyle w:val="TOC1"/>
+            <w:tabs>
+              <w:tab w:val="clear" w:pos="708"/>
+              <w:tab w:val="right" w:pos="9009" w:leader="dot"/>
+            </w:tabs>
+            <w:jc w:val="both"/>
+            <w:rPr>
+              <w:lang w:val="es-CO" w:bidi="ar-SA"/>
+            </w:rPr>
+          </w:pPr>
+          <w:r>
+            <w:rPr>
+              <w:lang w:val="es-CO" w:bidi="ar-SA"/>
+            </w:rPr>
+            <w:t>10</w:t>
+          </w:r>
+          <w:r>
+            <w:rPr>
+              <w:lang w:val="es-CO" w:bidi="ar-SA"/>
+            </w:rPr>
+            <w:t>. Modelamiento del sistema</w:t>
+          </w:r>
+          <w:hyperlink w:anchor="_Toc62801091">
+            <w:r>
+              <w:rPr>
+                <w:rStyle w:val="Enlacedelndice"/>
+                <w:webHidden/>
+                <w:lang w:val="es-CO" w:bidi="ar-SA"/>
+              </w:rPr>
+              <w:tab/>
+            </w:r>
+          </w:hyperlink>
+          <w:r>
+            <w:rPr>
+              <w:lang w:val="es-CO" w:bidi="ar-SA"/>
+            </w:rPr>
+            <w:t>13</w:t>
+          </w:r>
+        </w:p>
+        <w:p>
+          <w:pPr>
+            <w:pStyle w:val="TOC1"/>
+            <w:tabs>
+              <w:tab w:val="clear" w:pos="708"/>
+              <w:tab w:val="right" w:pos="9009" w:leader="dot"/>
+            </w:tabs>
+            <w:jc w:val="both"/>
             <w:rPr/>
           </w:pPr>
           <w:r>
@@ -1644,7 +1798,14 @@
               <w:vanish w:val="false"/>
               <w:lang w:val="es-CO" w:eastAsia="en-US" w:bidi="ar-SA"/>
             </w:rPr>
-            <w:t xml:space="preserve">8. Conclusiones </w:t>
+            <w:t>11</w:t>
+          </w:r>
+          <w:r>
+            <w:rPr>
+              <w:vanish w:val="false"/>
+              <w:lang w:val="es-CO" w:eastAsia="en-US" w:bidi="ar-SA"/>
+            </w:rPr>
+            <w:t xml:space="preserve">. Conclusiones </w:t>
           </w:r>
           <w:hyperlink w:anchor="_Toc62801091">
             <w:r>
@@ -1712,14 +1873,14 @@
         </w:rPr>
         <w:t>1. Necesidad y problema del proyecto</w:t>
       </w:r>
-      <w:bookmarkStart w:id="30" w:name="_Toc316718173"/>
-      <w:bookmarkStart w:id="31" w:name="_Toc26076889"/>
-      <w:bookmarkStart w:id="32" w:name="_Toc26079248"/>
-      <w:bookmarkStart w:id="33" w:name="_Toc62799672"/>
-      <w:bookmarkStart w:id="34" w:name="_Toc62800392"/>
-      <w:bookmarkStart w:id="35" w:name="_Toc62800548"/>
-      <w:bookmarkStart w:id="36" w:name="_Toc62800635"/>
-      <w:bookmarkStart w:id="37" w:name="_Toc62801083"/>
+      <w:bookmarkStart w:id="30" w:name="_Toc62801083"/>
+      <w:bookmarkStart w:id="31" w:name="_Toc62800635"/>
+      <w:bookmarkStart w:id="32" w:name="_Toc62800548"/>
+      <w:bookmarkStart w:id="33" w:name="_Toc62800392"/>
+      <w:bookmarkStart w:id="34" w:name="_Toc62799672"/>
+      <w:bookmarkStart w:id="35" w:name="_Toc26079248"/>
+      <w:bookmarkStart w:id="36" w:name="_Toc26076889"/>
+      <w:bookmarkStart w:id="37" w:name="_Toc316718173"/>
       <w:r>
         <w:rPr>
           <w:lang w:val="es-CO" w:bidi="ar-SA"/>
@@ -1766,15 +1927,7 @@
         <w:spacing w:lineRule="auto" w:line="240"/>
         <w:jc w:val="left"/>
         <w:rPr>
-          <w:rFonts w:ascii="Times New Roman" w:hAnsi="Times New Roman" w:eastAsia="Times New Roman" w:cs="Times New Roman"/>
-          <w:b w:val="false"/>
-          <w:bCs w:val="false"/>
-          <w:color w:val="auto"/>
-          <w:kern w:val="0"/>
-          <w:sz w:val="24"/>
-          <w:szCs w:val="32"/>
-          <w:u w:val="none"/>
-          <w:lang w:val="es-CO" w:eastAsia="en-US" w:bidi="ar-SA"/>
+          <w:lang w:val="es-CO" w:bidi="ar-SA"/>
         </w:rPr>
       </w:pPr>
       <w:r>
@@ -1801,15 +1954,7 @@
         <w:spacing w:lineRule="auto" w:line="240"/>
         <w:jc w:val="left"/>
         <w:rPr>
-          <w:rFonts w:ascii="Times New Roman" w:hAnsi="Times New Roman" w:eastAsia="Times New Roman" w:cs="Times New Roman"/>
-          <w:b w:val="false"/>
-          <w:bCs w:val="false"/>
-          <w:color w:val="auto"/>
-          <w:kern w:val="0"/>
-          <w:sz w:val="24"/>
-          <w:szCs w:val="32"/>
-          <w:u w:val="none"/>
-          <w:lang w:val="es-CO" w:eastAsia="en-US" w:bidi="ar-SA"/>
+          <w:lang w:val="es-CO" w:bidi="ar-SA"/>
         </w:rPr>
       </w:pPr>
       <w:r>
@@ -1859,13 +2004,7 @@
         <w:ind w:hanging="0"/>
         <w:jc w:val="both"/>
         <w:rPr>
-          <w:rFonts w:ascii="Times New Roman" w:hAnsi="Times New Roman" w:eastAsia="Times New Roman" w:cs="Times New Roman"/>
-          <w:color w:val="000000"/>
-          <w:kern w:val="0"/>
-          <w:sz w:val="24"/>
-          <w:szCs w:val="24"/>
-          <w:shd w:fill="FFFFFF" w:val="clear"/>
-          <w:lang w:val="es-CO" w:eastAsia="en-US" w:bidi="ar-SA"/>
+          <w:lang w:val="es-CO" w:bidi="ar-SA"/>
         </w:rPr>
       </w:pPr>
       <w:r>
@@ -1922,13 +2061,7 @@
         <w:ind w:hanging="0"/>
         <w:jc w:val="both"/>
         <w:rPr>
-          <w:rFonts w:ascii="Times New Roman" w:hAnsi="Times New Roman" w:eastAsia="Times New Roman" w:cs="Times New Roman"/>
-          <w:color w:val="000000"/>
-          <w:kern w:val="0"/>
-          <w:sz w:val="24"/>
-          <w:szCs w:val="24"/>
-          <w:shd w:fill="FFFFFF" w:val="clear"/>
-          <w:lang w:val="es-CO" w:eastAsia="en-US" w:bidi="ar-SA"/>
+          <w:lang w:val="es-CO" w:bidi="ar-SA"/>
         </w:rPr>
       </w:pPr>
       <w:r>
@@ -1973,15 +2106,6 @@
         <w:ind w:hanging="0"/>
         <w:jc w:val="both"/>
         <w:rPr>
-          <w:rFonts w:ascii="Times New Roman" w:hAnsi="Times New Roman"/>
-          <w:b w:val="false"/>
-          <w:i w:val="false"/>
-          <w:caps w:val="false"/>
-          <w:smallCaps w:val="false"/>
-          <w:color w:val="000000"/>
-          <w:spacing w:val="0"/>
-          <w:sz w:val="24"/>
-          <w:szCs w:val="24"/>
           <w:lang w:val="es-CO" w:bidi="ar-SA"/>
         </w:rPr>
       </w:pPr>
@@ -2010,16 +2134,6 @@
         <w:spacing w:lineRule="auto" w:line="240" w:before="0" w:after="83"/>
         <w:jc w:val="both"/>
         <w:rPr>
-          <w:rFonts w:ascii="Times New Roman" w:hAnsi="Times New Roman"/>
-          <w:b/>
-          <w:bCs/>
-          <w:i w:val="false"/>
-          <w:caps w:val="false"/>
-          <w:smallCaps w:val="false"/>
-          <w:color w:val="000000"/>
-          <w:spacing w:val="0"/>
-          <w:sz w:val="24"/>
-          <w:szCs w:val="24"/>
           <w:lang w:val="es-CO" w:bidi="ar-SA"/>
         </w:rPr>
       </w:pPr>
@@ -2064,16 +2178,6 @@
         <w:spacing w:lineRule="auto" w:line="240" w:before="0" w:after="83"/>
         <w:jc w:val="both"/>
         <w:rPr>
-          <w:rFonts w:ascii="Times New Roman" w:hAnsi="Times New Roman"/>
-          <w:b/>
-          <w:bCs/>
-          <w:i w:val="false"/>
-          <w:caps w:val="false"/>
-          <w:smallCaps w:val="false"/>
-          <w:color w:val="000000"/>
-          <w:spacing w:val="0"/>
-          <w:sz w:val="24"/>
-          <w:szCs w:val="24"/>
           <w:lang w:val="es-CO" w:bidi="ar-SA"/>
         </w:rPr>
       </w:pPr>
@@ -2172,12 +2276,6 @@
         <w:bidi w:val="0"/>
         <w:spacing w:lineRule="auto" w:line="240" w:before="360" w:after="240"/>
         <w:rPr>
-          <w:b w:val="false"/>
-          <w:bCs w:val="false"/>
-          <w:i w:val="false"/>
-          <w:iCs w:val="false"/>
-          <w:color w:val="auto"/>
-          <w:szCs w:val="32"/>
           <w:lang w:val="es-CO" w:bidi="ar-SA"/>
         </w:rPr>
       </w:pPr>
@@ -2202,12 +2300,6 @@
         <w:bidi w:val="0"/>
         <w:spacing w:lineRule="auto" w:line="240" w:before="360" w:after="240"/>
         <w:rPr>
-          <w:b w:val="false"/>
-          <w:bCs w:val="false"/>
-          <w:i w:val="false"/>
-          <w:iCs w:val="false"/>
-          <w:color w:val="auto"/>
-          <w:szCs w:val="32"/>
           <w:lang w:val="es-CO" w:bidi="ar-SA"/>
         </w:rPr>
       </w:pPr>
@@ -2246,8 +2338,6 @@
         <w:ind w:hanging="0"/>
         <w:jc w:val="center"/>
         <w:rPr>
-          <w:b/>
-          <w:bCs/>
           <w:lang w:val="es-CO" w:bidi="ar-SA"/>
         </w:rPr>
       </w:pPr>
@@ -2269,15 +2359,7 @@
         <w:spacing w:lineRule="auto" w:line="240" w:before="360" w:after="240"/>
         <w:jc w:val="left"/>
         <w:rPr>
-          <w:rFonts w:ascii="Times New Roman" w:hAnsi="Times New Roman" w:eastAsia="Times New Roman" w:cs="Times New Roman"/>
-          <w:b/>
-          <w:bCs/>
-          <w:color w:val="auto"/>
-          <w:kern w:val="0"/>
-          <w:sz w:val="24"/>
-          <w:szCs w:val="32"/>
-          <w:u w:val="none"/>
-          <w:lang w:val="es-CO" w:eastAsia="en-US" w:bidi="ar-SA"/>
+          <w:lang w:val="es-CO" w:bidi="ar-SA"/>
         </w:rPr>
       </w:pPr>
       <w:r>
@@ -2304,16 +2386,7 @@
         <w:spacing w:lineRule="auto" w:line="240" w:before="132" w:after="12"/>
         <w:jc w:val="left"/>
         <w:rPr>
-          <w:rFonts w:ascii="Times New Roman" w:hAnsi="Times New Roman" w:eastAsia="Times New Roman" w:cs="Times New Roman"/>
-          <w:b w:val="false"/>
-          <w:bCs w:val="false"/>
-          <w:i w:val="false"/>
-          <w:iCs w:val="false"/>
-          <w:kern w:val="0"/>
-          <w:sz w:val="24"/>
-          <w:szCs w:val="24"/>
-          <w:u w:val="none"/>
-          <w:lang w:val="es-CO" w:eastAsia="en-US" w:bidi="ar-SA"/>
+          <w:lang w:val="es-CO" w:bidi="ar-SA"/>
         </w:rPr>
       </w:pPr>
       <w:r>
@@ -2362,17 +2435,7 @@
         <w:spacing w:lineRule="auto" w:line="240"/>
         <w:jc w:val="left"/>
         <w:rPr>
-          <w:rFonts w:ascii="Times New Roman" w:hAnsi="Times New Roman" w:eastAsia="Times New Roman" w:cs="Times New Roman"/>
-          <w:b/>
-          <w:bCs/>
-          <w:i w:val="false"/>
-          <w:iCs w:val="false"/>
-          <w:color w:val="auto"/>
-          <w:kern w:val="0"/>
-          <w:sz w:val="24"/>
-          <w:szCs w:val="32"/>
-          <w:u w:val="none"/>
-          <w:lang w:val="es-CO" w:eastAsia="en-US" w:bidi="ar-SA"/>
+          <w:lang w:val="es-CO" w:bidi="ar-SA"/>
         </w:rPr>
       </w:pPr>
       <w:r>
@@ -2402,10 +2465,12 @@
         </w:numPr>
         <w:suppressAutoHyphens w:val="true"/>
         <w:bidi w:val="0"/>
-        <w:spacing w:lineRule="auto" w:line="240" w:before="246" w:after="126"/>
+        <w:spacing w:lineRule="auto" w:line="240"/>
         <w:jc w:val="left"/>
         <w:rPr>
           <w:rFonts w:ascii="Times New Roman" w:hAnsi="Times New Roman" w:eastAsia="Times New Roman" w:cs="Times New Roman"/>
+          <w:b w:val="false"/>
+          <w:bCs w:val="false"/>
           <w:i w:val="false"/>
           <w:iCs w:val="false"/>
           <w:color w:val="auto"/>
@@ -2419,6 +2484,8 @@
       <w:r>
         <w:rPr>
           <w:rFonts w:eastAsia="Times New Roman" w:cs="Times New Roman"/>
+          <w:b w:val="false"/>
+          <w:bCs w:val="false"/>
           <w:i w:val="false"/>
           <w:iCs w:val="false"/>
           <w:color w:val="auto"/>
@@ -2441,10 +2508,12 @@
         </w:numPr>
         <w:suppressAutoHyphens w:val="true"/>
         <w:bidi w:val="0"/>
-        <w:spacing w:lineRule="auto" w:line="240" w:before="246" w:after="126"/>
+        <w:spacing w:lineRule="auto" w:line="240"/>
         <w:jc w:val="left"/>
         <w:rPr>
           <w:rFonts w:ascii="Times New Roman" w:hAnsi="Times New Roman" w:eastAsia="Times New Roman" w:cs="Times New Roman"/>
+          <w:b w:val="false"/>
+          <w:bCs w:val="false"/>
           <w:i w:val="false"/>
           <w:iCs w:val="false"/>
           <w:color w:val="auto"/>
@@ -2458,6 +2527,8 @@
       <w:r>
         <w:rPr>
           <w:rFonts w:eastAsia="Times New Roman" w:cs="Times New Roman"/>
+          <w:b w:val="false"/>
+          <w:bCs w:val="false"/>
           <w:i w:val="false"/>
           <w:iCs w:val="false"/>
           <w:color w:val="auto"/>
@@ -2480,10 +2551,12 @@
         </w:numPr>
         <w:suppressAutoHyphens w:val="true"/>
         <w:bidi w:val="0"/>
-        <w:spacing w:lineRule="auto" w:line="240" w:before="246" w:after="126"/>
+        <w:spacing w:lineRule="auto" w:line="240"/>
         <w:jc w:val="left"/>
         <w:rPr>
           <w:rFonts w:ascii="Times New Roman" w:hAnsi="Times New Roman" w:eastAsia="Times New Roman" w:cs="Times New Roman"/>
+          <w:b w:val="false"/>
+          <w:bCs w:val="false"/>
           <w:i w:val="false"/>
           <w:iCs w:val="false"/>
           <w:color w:val="auto"/>
@@ -2497,6 +2570,8 @@
       <w:r>
         <w:rPr>
           <w:rFonts w:eastAsia="Times New Roman" w:cs="Times New Roman"/>
+          <w:b w:val="false"/>
+          <w:bCs w:val="false"/>
           <w:i w:val="false"/>
           <w:iCs w:val="false"/>
           <w:color w:val="auto"/>
@@ -2519,10 +2594,12 @@
         </w:numPr>
         <w:suppressAutoHyphens w:val="true"/>
         <w:bidi w:val="0"/>
-        <w:spacing w:lineRule="auto" w:line="240" w:before="246" w:after="126"/>
+        <w:spacing w:lineRule="auto" w:line="240"/>
         <w:jc w:val="left"/>
         <w:rPr>
           <w:rFonts w:ascii="Times New Roman" w:hAnsi="Times New Roman" w:eastAsia="Times New Roman" w:cs="Times New Roman"/>
+          <w:b w:val="false"/>
+          <w:bCs w:val="false"/>
           <w:i w:val="false"/>
           <w:iCs w:val="false"/>
           <w:color w:val="auto"/>
@@ -2536,6 +2613,8 @@
       <w:r>
         <w:rPr>
           <w:rFonts w:eastAsia="Times New Roman" w:cs="Times New Roman"/>
+          <w:b w:val="false"/>
+          <w:bCs w:val="false"/>
           <w:i w:val="false"/>
           <w:iCs w:val="false"/>
           <w:color w:val="auto"/>
@@ -2558,10 +2637,12 @@
         </w:numPr>
         <w:suppressAutoHyphens w:val="true"/>
         <w:bidi w:val="0"/>
-        <w:spacing w:lineRule="auto" w:line="240" w:before="246" w:after="126"/>
+        <w:spacing w:lineRule="auto" w:line="240"/>
         <w:jc w:val="left"/>
         <w:rPr>
           <w:rFonts w:ascii="Times New Roman" w:hAnsi="Times New Roman" w:eastAsia="Times New Roman" w:cs="Times New Roman"/>
+          <w:b w:val="false"/>
+          <w:bCs w:val="false"/>
           <w:i w:val="false"/>
           <w:iCs w:val="false"/>
           <w:color w:val="auto"/>
@@ -2575,6 +2656,8 @@
       <w:r>
         <w:rPr>
           <w:rFonts w:eastAsia="Times New Roman" w:cs="Times New Roman"/>
+          <w:b w:val="false"/>
+          <w:bCs w:val="false"/>
           <w:i w:val="false"/>
           <w:iCs w:val="false"/>
           <w:color w:val="auto"/>
@@ -2631,8 +2714,6 @@
         <w:ind w:hanging="0"/>
         <w:jc w:val="center"/>
         <w:rPr>
-          <w:b/>
-          <w:bCs/>
           <w:lang w:val="es-CO" w:bidi="ar-SA"/>
         </w:rPr>
       </w:pPr>
@@ -2673,17 +2754,7 @@
         <w:spacing w:lineRule="auto" w:line="240"/>
         <w:jc w:val="left"/>
         <w:rPr>
-          <w:rFonts w:ascii="Times New Roman" w:hAnsi="Times New Roman" w:eastAsia="Times New Roman" w:cs="Times New Roman"/>
-          <w:b/>
-          <w:bCs/>
-          <w:i w:val="false"/>
-          <w:iCs w:val="false"/>
-          <w:color w:val="auto"/>
-          <w:kern w:val="0"/>
-          <w:sz w:val="24"/>
-          <w:szCs w:val="32"/>
-          <w:u w:val="none"/>
-          <w:lang w:val="es-CO" w:eastAsia="en-US" w:bidi="ar-SA"/>
+          <w:lang w:val="es-CO" w:bidi="ar-SA"/>
         </w:rPr>
       </w:pPr>
       <w:r>
@@ -2712,17 +2783,7 @@
         <w:spacing w:lineRule="auto" w:line="240"/>
         <w:jc w:val="left"/>
         <w:rPr>
-          <w:rFonts w:ascii="Times New Roman" w:hAnsi="Times New Roman" w:eastAsia="Times New Roman" w:cs="Times New Roman"/>
-          <w:b w:val="false"/>
-          <w:bCs w:val="false"/>
-          <w:i w:val="false"/>
-          <w:iCs w:val="false"/>
-          <w:color w:val="auto"/>
-          <w:kern w:val="0"/>
-          <w:sz w:val="24"/>
-          <w:szCs w:val="32"/>
-          <w:u w:val="none"/>
-          <w:lang w:val="es-CO" w:eastAsia="en-US" w:bidi="ar-SA"/>
+          <w:lang w:val="es-CO" w:bidi="ar-SA"/>
         </w:rPr>
       </w:pPr>
       <w:r>
@@ -2789,17 +2850,7 @@
         <w:spacing w:lineRule="auto" w:line="240"/>
         <w:jc w:val="left"/>
         <w:rPr>
-          <w:rFonts w:ascii="Times New Roman" w:hAnsi="Times New Roman" w:eastAsia="Times New Roman" w:cs="Times New Roman"/>
-          <w:b/>
-          <w:bCs/>
-          <w:i w:val="false"/>
-          <w:iCs w:val="false"/>
-          <w:color w:val="auto"/>
-          <w:kern w:val="0"/>
-          <w:sz w:val="24"/>
-          <w:szCs w:val="32"/>
-          <w:u w:val="none"/>
-          <w:lang w:val="es-CO" w:eastAsia="en-US" w:bidi="ar-SA"/>
+          <w:lang w:val="es-CO" w:bidi="ar-SA"/>
         </w:rPr>
       </w:pPr>
       <w:r>
@@ -2828,15 +2879,7 @@
         <w:spacing w:lineRule="auto" w:line="240" w:before="246" w:after="126"/>
         <w:jc w:val="left"/>
         <w:rPr>
-          <w:rFonts w:ascii="Times New Roman" w:hAnsi="Times New Roman" w:eastAsia="Times New Roman" w:cs="Times New Roman"/>
-          <w:i w:val="false"/>
-          <w:iCs w:val="false"/>
-          <w:color w:val="auto"/>
-          <w:kern w:val="0"/>
-          <w:sz w:val="24"/>
-          <w:szCs w:val="32"/>
-          <w:u w:val="none"/>
-          <w:lang w:val="es-CO" w:eastAsia="en-US" w:bidi="ar-SA"/>
+          <w:lang w:val="es-CO" w:bidi="ar-SA"/>
         </w:rPr>
       </w:pPr>
       <w:r>
@@ -2867,17 +2910,7 @@
         <w:spacing w:lineRule="auto" w:line="240"/>
         <w:jc w:val="left"/>
         <w:rPr>
-          <w:rFonts w:ascii="Times New Roman" w:hAnsi="Times New Roman" w:eastAsia="Times New Roman" w:cs="Times New Roman"/>
-          <w:b w:val="false"/>
-          <w:bCs w:val="false"/>
-          <w:i w:val="false"/>
-          <w:iCs w:val="false"/>
-          <w:color w:val="auto"/>
-          <w:kern w:val="0"/>
-          <w:sz w:val="24"/>
-          <w:szCs w:val="32"/>
-          <w:u w:val="none"/>
-          <w:lang w:val="es-CO" w:eastAsia="en-US" w:bidi="ar-SA"/>
+          <w:lang w:val="es-CO" w:bidi="ar-SA"/>
         </w:rPr>
       </w:pPr>
       <w:r>
@@ -2910,9 +2943,40 @@
         <w:spacing w:lineRule="auto" w:line="240"/>
         <w:jc w:val="left"/>
         <w:rPr>
+          <w:lang w:val="es-CO" w:bidi="ar-SA"/>
+        </w:rPr>
+      </w:pPr>
+      <w:r>
+        <w:rPr>
+          <w:rFonts w:eastAsia="Times New Roman" w:cs="Times New Roman"/>
+          <w:b w:val="false"/>
+          <w:bCs w:val="false"/>
+          <w:i w:val="false"/>
+          <w:iCs w:val="false"/>
+          <w:color w:val="auto"/>
+          <w:kern w:val="0"/>
+          <w:sz w:val="24"/>
+          <w:szCs w:val="32"/>
+          <w:u w:val="none"/>
+          <w:lang w:val="es-CO" w:eastAsia="en-US" w:bidi="ar-SA"/>
+        </w:rPr>
+        <w:t>Creación de actividades académicas por parte del docente.</w:t>
+      </w:r>
+    </w:p>
+    <w:p>
+      <w:pPr>
+        <w:pStyle w:val="APALevel2"/>
+        <w:widowControl/>
+        <w:numPr>
+          <w:ilvl w:val="0"/>
+          <w:numId w:val="5"/>
+        </w:numPr>
+        <w:suppressAutoHyphens w:val="true"/>
+        <w:bidi w:val="0"/>
+        <w:spacing w:lineRule="auto" w:line="240" w:before="132" w:after="12"/>
+        <w:jc w:val="left"/>
+        <w:rPr>
           <w:rFonts w:ascii="Times New Roman" w:hAnsi="Times New Roman" w:eastAsia="Times New Roman" w:cs="Times New Roman"/>
-          <w:b w:val="false"/>
-          <w:bCs w:val="false"/>
           <w:i w:val="false"/>
           <w:iCs w:val="false"/>
           <w:color w:val="auto"/>
@@ -2926,8 +2990,6 @@
       <w:r>
         <w:rPr>
           <w:rFonts w:eastAsia="Times New Roman" w:cs="Times New Roman"/>
-          <w:b w:val="false"/>
-          <w:bCs w:val="false"/>
           <w:i w:val="false"/>
           <w:iCs w:val="false"/>
           <w:color w:val="auto"/>
@@ -2937,7 +2999,7 @@
           <w:u w:val="none"/>
           <w:lang w:val="es-CO" w:eastAsia="en-US" w:bidi="ar-SA"/>
         </w:rPr>
-        <w:t>Creación de actividades académicas por parte del docente.</w:t>
+        <w:t>Visualización de actividades por parte del estudiante.</w:t>
       </w:r>
     </w:p>
     <w:p>
@@ -2953,7 +3015,14 @@
         <w:spacing w:lineRule="auto" w:line="240"/>
         <w:jc w:val="left"/>
         <w:rPr>
-          <w:rFonts w:ascii="Times New Roman" w:hAnsi="Times New Roman" w:eastAsia="Times New Roman" w:cs="Times New Roman"/>
+          <w:lang w:val="es-CO" w:bidi="ar-SA"/>
+        </w:rPr>
+      </w:pPr>
+      <w:r>
+        <w:rPr>
+          <w:rFonts w:eastAsia="Times New Roman" w:cs="Times New Roman"/>
+          <w:b w:val="false"/>
+          <w:bCs w:val="false"/>
           <w:i w:val="false"/>
           <w:iCs w:val="false"/>
           <w:color w:val="auto"/>
@@ -2963,20 +3032,7 @@
           <w:u w:val="none"/>
           <w:lang w:val="es-CO" w:eastAsia="en-US" w:bidi="ar-SA"/>
         </w:rPr>
-      </w:pPr>
-      <w:r>
-        <w:rPr>
-          <w:rFonts w:eastAsia="Times New Roman" w:cs="Times New Roman"/>
-          <w:i w:val="false"/>
-          <w:iCs w:val="false"/>
-          <w:color w:val="auto"/>
-          <w:kern w:val="0"/>
-          <w:sz w:val="24"/>
-          <w:szCs w:val="32"/>
-          <w:u w:val="none"/>
-          <w:lang w:val="es-CO" w:eastAsia="en-US" w:bidi="ar-SA"/>
-        </w:rPr>
-        <w:t>Visualización de actividades por parte del estudiante.</w:t>
+        <w:t>Entrega de tareas</w:t>
       </w:r>
     </w:p>
     <w:p>
@@ -2992,7 +3048,12 @@
         <w:spacing w:lineRule="auto" w:line="240"/>
         <w:jc w:val="left"/>
         <w:rPr>
-          <w:rFonts w:ascii="Times New Roman" w:hAnsi="Times New Roman" w:eastAsia="Times New Roman" w:cs="Times New Roman"/>
+          <w:lang w:val="es-CO" w:bidi="ar-SA"/>
+        </w:rPr>
+      </w:pPr>
+      <w:r>
+        <w:rPr>
+          <w:rFonts w:eastAsia="Times New Roman" w:cs="Times New Roman"/>
           <w:b w:val="false"/>
           <w:bCs w:val="false"/>
           <w:i w:val="false"/>
@@ -3004,22 +3065,7 @@
           <w:u w:val="none"/>
           <w:lang w:val="es-CO" w:eastAsia="en-US" w:bidi="ar-SA"/>
         </w:rPr>
-      </w:pPr>
-      <w:r>
-        <w:rPr>
-          <w:rFonts w:eastAsia="Times New Roman" w:cs="Times New Roman"/>
-          <w:b w:val="false"/>
-          <w:bCs w:val="false"/>
-          <w:i w:val="false"/>
-          <w:iCs w:val="false"/>
-          <w:color w:val="auto"/>
-          <w:kern w:val="0"/>
-          <w:sz w:val="24"/>
-          <w:szCs w:val="32"/>
-          <w:u w:val="none"/>
-          <w:lang w:val="es-CO" w:eastAsia="en-US" w:bidi="ar-SA"/>
-        </w:rPr>
-        <w:t>Entrega de tareas</w:t>
+        <w:t>Revisión y retroalimentación de actividades entregas por parte del docente.</w:t>
       </w:r>
     </w:p>
     <w:p>
@@ -3035,60 +3081,7 @@
         <w:spacing w:lineRule="auto" w:line="240"/>
         <w:jc w:val="left"/>
         <w:rPr>
-          <w:rFonts w:ascii="Times New Roman" w:hAnsi="Times New Roman" w:eastAsia="Times New Roman" w:cs="Times New Roman"/>
-          <w:b w:val="false"/>
-          <w:bCs w:val="false"/>
-          <w:i w:val="false"/>
-          <w:iCs w:val="false"/>
-          <w:color w:val="auto"/>
-          <w:kern w:val="0"/>
-          <w:sz w:val="24"/>
-          <w:szCs w:val="32"/>
-          <w:u w:val="none"/>
-          <w:lang w:val="es-CO" w:eastAsia="en-US" w:bidi="ar-SA"/>
-        </w:rPr>
-      </w:pPr>
-      <w:r>
-        <w:rPr>
-          <w:rFonts w:eastAsia="Times New Roman" w:cs="Times New Roman"/>
-          <w:b w:val="false"/>
-          <w:bCs w:val="false"/>
-          <w:i w:val="false"/>
-          <w:iCs w:val="false"/>
-          <w:color w:val="auto"/>
-          <w:kern w:val="0"/>
-          <w:sz w:val="24"/>
-          <w:szCs w:val="32"/>
-          <w:u w:val="none"/>
-          <w:lang w:val="es-CO" w:eastAsia="en-US" w:bidi="ar-SA"/>
-        </w:rPr>
-        <w:t>Revisión y retroalimentación de actividades entregas por parte del docente.</w:t>
-      </w:r>
-    </w:p>
-    <w:p>
-      <w:pPr>
-        <w:pStyle w:val="APALevel2"/>
-        <w:widowControl/>
-        <w:numPr>
-          <w:ilvl w:val="0"/>
-          <w:numId w:val="5"/>
-        </w:numPr>
-        <w:suppressAutoHyphens w:val="true"/>
-        <w:bidi w:val="0"/>
-        <w:spacing w:lineRule="auto" w:line="240"/>
-        <w:jc w:val="left"/>
-        <w:rPr>
-          <w:rFonts w:ascii="Times New Roman" w:hAnsi="Times New Roman" w:eastAsia="Times New Roman" w:cs="Times New Roman"/>
-          <w:b w:val="false"/>
-          <w:bCs w:val="false"/>
-          <w:i w:val="false"/>
-          <w:iCs w:val="false"/>
-          <w:color w:val="auto"/>
-          <w:kern w:val="0"/>
-          <w:sz w:val="24"/>
-          <w:szCs w:val="32"/>
-          <w:u w:val="none"/>
-          <w:lang w:val="es-CO" w:eastAsia="en-US" w:bidi="ar-SA"/>
+          <w:lang w:val="es-CO" w:bidi="ar-SA"/>
         </w:rPr>
       </w:pPr>
       <w:r>
@@ -3147,14 +3140,7 @@
         <w:spacing w:lineRule="auto" w:line="240"/>
         <w:jc w:val="left"/>
         <w:rPr>
-          <w:rFonts w:eastAsia="Times New Roman" w:cs="Times New Roman"/>
-          <w:b/>
-          <w:bCs/>
-          <w:color w:val="auto"/>
-          <w:kern w:val="0"/>
-          <w:sz w:val="24"/>
-          <w:szCs w:val="32"/>
-          <w:lang w:val="es-CO" w:eastAsia="en-US" w:bidi="ar-SA"/>
+          <w:lang w:val="es-CO" w:bidi="ar-SA"/>
         </w:rPr>
       </w:pPr>
       <w:r>
@@ -3183,20 +3169,16 @@
         <w:spacing w:lineRule="auto" w:line="240" w:before="132" w:after="12"/>
         <w:jc w:val="left"/>
         <w:rPr>
-          <w:rFonts w:ascii="Times New Roman" w:hAnsi="Times New Roman" w:eastAsia="Times New Roman" w:cs="Times New Roman"/>
-          <w:i w:val="false"/>
-          <w:iCs w:val="false"/>
-          <w:color w:val="auto"/>
-          <w:kern w:val="0"/>
-          <w:sz w:val="24"/>
-          <w:szCs w:val="32"/>
-          <w:u w:val="none"/>
-          <w:lang w:val="es-CO" w:eastAsia="en-US" w:bidi="ar-SA"/>
-        </w:rPr>
-      </w:pPr>
-      <w:r>
-        <w:rPr>
-          <w:rFonts w:eastAsia="Times New Roman" w:cs="Times New Roman"/>
+          <w:b w:val="false"/>
+          <w:bCs w:val="false"/>
+          <w:lang w:val="es-CO" w:bidi="ar-SA"/>
+        </w:rPr>
+      </w:pPr>
+      <w:r>
+        <w:rPr>
+          <w:rFonts w:eastAsia="Times New Roman" w:cs="Times New Roman"/>
+          <w:b w:val="false"/>
+          <w:bCs w:val="false"/>
           <w:i w:val="false"/>
           <w:iCs w:val="false"/>
           <w:color w:val="auto"/>
@@ -3219,10 +3201,12 @@
         </w:numPr>
         <w:suppressAutoHyphens w:val="true"/>
         <w:bidi w:val="0"/>
-        <w:spacing w:lineRule="auto" w:line="240" w:before="132" w:after="12"/>
+        <w:spacing w:lineRule="auto" w:line="240"/>
         <w:jc w:val="left"/>
         <w:rPr>
           <w:rFonts w:ascii="Times New Roman" w:hAnsi="Times New Roman" w:eastAsia="Times New Roman" w:cs="Times New Roman"/>
+          <w:b w:val="false"/>
+          <w:bCs w:val="false"/>
           <w:i w:val="false"/>
           <w:iCs w:val="false"/>
           <w:color w:val="auto"/>
@@ -3236,6 +3220,8 @@
       <w:r>
         <w:rPr>
           <w:rFonts w:eastAsia="Times New Roman" w:cs="Times New Roman"/>
+          <w:b w:val="false"/>
+          <w:bCs w:val="false"/>
           <w:i w:val="false"/>
           <w:iCs w:val="false"/>
           <w:color w:val="auto"/>
@@ -3258,10 +3244,12 @@
         </w:numPr>
         <w:suppressAutoHyphens w:val="true"/>
         <w:bidi w:val="0"/>
-        <w:spacing w:lineRule="auto" w:line="240" w:before="132" w:after="12"/>
+        <w:spacing w:lineRule="auto" w:line="240"/>
         <w:jc w:val="left"/>
         <w:rPr>
           <w:rFonts w:ascii="Times New Roman" w:hAnsi="Times New Roman" w:eastAsia="Times New Roman" w:cs="Times New Roman"/>
+          <w:b w:val="false"/>
+          <w:bCs w:val="false"/>
           <w:i w:val="false"/>
           <w:iCs w:val="false"/>
           <w:color w:val="auto"/>
@@ -3275,6 +3263,8 @@
       <w:r>
         <w:rPr>
           <w:rFonts w:eastAsia="Times New Roman" w:cs="Times New Roman"/>
+          <w:b w:val="false"/>
+          <w:bCs w:val="false"/>
           <w:i w:val="false"/>
           <w:iCs w:val="false"/>
           <w:color w:val="auto"/>
@@ -3297,10 +3287,12 @@
         </w:numPr>
         <w:suppressAutoHyphens w:val="true"/>
         <w:bidi w:val="0"/>
-        <w:spacing w:lineRule="auto" w:line="240" w:before="132" w:after="12"/>
+        <w:spacing w:lineRule="auto" w:line="240"/>
         <w:jc w:val="left"/>
         <w:rPr>
           <w:rFonts w:ascii="Times New Roman" w:hAnsi="Times New Roman" w:eastAsia="Times New Roman" w:cs="Times New Roman"/>
+          <w:b w:val="false"/>
+          <w:bCs w:val="false"/>
           <w:i w:val="false"/>
           <w:iCs w:val="false"/>
           <w:color w:val="auto"/>
@@ -3314,6 +3306,8 @@
       <w:r>
         <w:rPr>
           <w:rFonts w:eastAsia="Times New Roman" w:cs="Times New Roman"/>
+          <w:b w:val="false"/>
+          <w:bCs w:val="false"/>
           <w:i w:val="false"/>
           <w:iCs w:val="false"/>
           <w:color w:val="auto"/>
@@ -3336,10 +3330,12 @@
         </w:numPr>
         <w:suppressAutoHyphens w:val="true"/>
         <w:bidi w:val="0"/>
-        <w:spacing w:lineRule="auto" w:line="240" w:before="132" w:after="12"/>
+        <w:spacing w:lineRule="auto" w:line="240"/>
         <w:jc w:val="left"/>
         <w:rPr>
           <w:rFonts w:ascii="Times New Roman" w:hAnsi="Times New Roman" w:eastAsia="Times New Roman" w:cs="Times New Roman"/>
+          <w:b w:val="false"/>
+          <w:bCs w:val="false"/>
           <w:i w:val="false"/>
           <w:iCs w:val="false"/>
           <w:color w:val="auto"/>
@@ -3353,6 +3349,8 @@
       <w:r>
         <w:rPr>
           <w:rFonts w:eastAsia="Times New Roman" w:cs="Times New Roman"/>
+          <w:b w:val="false"/>
+          <w:bCs w:val="false"/>
           <w:i w:val="false"/>
           <w:iCs w:val="false"/>
           <w:color w:val="auto"/>
@@ -3375,10 +3373,12 @@
         </w:numPr>
         <w:suppressAutoHyphens w:val="true"/>
         <w:bidi w:val="0"/>
-        <w:spacing w:lineRule="auto" w:line="240" w:before="132" w:after="12"/>
+        <w:spacing w:lineRule="auto" w:line="240"/>
         <w:jc w:val="left"/>
         <w:rPr>
           <w:rFonts w:ascii="Times New Roman" w:hAnsi="Times New Roman" w:eastAsia="Times New Roman" w:cs="Times New Roman"/>
+          <w:b w:val="false"/>
+          <w:bCs w:val="false"/>
           <w:i w:val="false"/>
           <w:iCs w:val="false"/>
           <w:color w:val="auto"/>
@@ -3392,6 +3392,8 @@
       <w:r>
         <w:rPr>
           <w:rFonts w:eastAsia="Times New Roman" w:cs="Times New Roman"/>
+          <w:b w:val="false"/>
+          <w:bCs w:val="false"/>
           <w:i w:val="false"/>
           <w:iCs w:val="false"/>
           <w:color w:val="auto"/>
@@ -3447,14 +3449,7 @@
         <w:spacing w:lineRule="auto" w:line="240"/>
         <w:jc w:val="left"/>
         <w:rPr>
-          <w:rFonts w:eastAsia="Times New Roman" w:cs="Times New Roman"/>
-          <w:b/>
-          <w:bCs/>
-          <w:color w:val="auto"/>
-          <w:kern w:val="0"/>
-          <w:sz w:val="24"/>
-          <w:szCs w:val="32"/>
-          <w:lang w:val="es-CO" w:eastAsia="en-US" w:bidi="ar-SA"/>
+          <w:lang w:val="es-CO" w:bidi="ar-SA"/>
         </w:rPr>
       </w:pPr>
       <w:r>
@@ -3480,20 +3475,16 @@
         <w:spacing w:lineRule="auto" w:line="240" w:before="132" w:after="12"/>
         <w:jc w:val="left"/>
         <w:rPr>
-          <w:rFonts w:ascii="Times New Roman" w:hAnsi="Times New Roman" w:eastAsia="Times New Roman" w:cs="Times New Roman"/>
-          <w:i w:val="false"/>
-          <w:iCs w:val="false"/>
-          <w:color w:val="auto"/>
-          <w:kern w:val="0"/>
-          <w:sz w:val="24"/>
-          <w:szCs w:val="32"/>
-          <w:u w:val="none"/>
-          <w:lang w:val="es-CO" w:eastAsia="en-US" w:bidi="ar-SA"/>
-        </w:rPr>
-      </w:pPr>
-      <w:r>
-        <w:rPr>
-          <w:rFonts w:eastAsia="Times New Roman" w:cs="Times New Roman"/>
+          <w:b w:val="false"/>
+          <w:bCs w:val="false"/>
+          <w:lang w:val="es-CO" w:bidi="ar-SA"/>
+        </w:rPr>
+      </w:pPr>
+      <w:r>
+        <w:rPr>
+          <w:rFonts w:eastAsia="Times New Roman" w:cs="Times New Roman"/>
+          <w:b w:val="false"/>
+          <w:bCs w:val="false"/>
           <w:i w:val="false"/>
           <w:iCs w:val="false"/>
           <w:color w:val="auto"/>
@@ -3516,10 +3507,12 @@
         </w:numPr>
         <w:suppressAutoHyphens w:val="true"/>
         <w:bidi w:val="0"/>
-        <w:spacing w:lineRule="auto" w:line="240" w:before="132" w:after="12"/>
+        <w:spacing w:lineRule="auto" w:line="240"/>
         <w:jc w:val="left"/>
         <w:rPr>
           <w:rFonts w:ascii="Times New Roman" w:hAnsi="Times New Roman" w:eastAsia="Times New Roman" w:cs="Times New Roman"/>
+          <w:b w:val="false"/>
+          <w:bCs w:val="false"/>
           <w:i w:val="false"/>
           <w:iCs w:val="false"/>
           <w:color w:val="auto"/>
@@ -3533,6 +3526,8 @@
       <w:r>
         <w:rPr>
           <w:rFonts w:eastAsia="Times New Roman" w:cs="Times New Roman"/>
+          <w:b w:val="false"/>
+          <w:bCs w:val="false"/>
           <w:i w:val="false"/>
           <w:iCs w:val="false"/>
           <w:color w:val="auto"/>
@@ -3555,10 +3550,12 @@
         </w:numPr>
         <w:suppressAutoHyphens w:val="true"/>
         <w:bidi w:val="0"/>
-        <w:spacing w:lineRule="auto" w:line="240" w:before="132" w:after="12"/>
+        <w:spacing w:lineRule="auto" w:line="240"/>
         <w:jc w:val="left"/>
         <w:rPr>
           <w:rFonts w:ascii="Times New Roman" w:hAnsi="Times New Roman" w:eastAsia="Times New Roman" w:cs="Times New Roman"/>
+          <w:b w:val="false"/>
+          <w:bCs w:val="false"/>
           <w:i w:val="false"/>
           <w:iCs w:val="false"/>
           <w:color w:val="auto"/>
@@ -3572,6 +3569,8 @@
       <w:r>
         <w:rPr>
           <w:rFonts w:eastAsia="Times New Roman" w:cs="Times New Roman"/>
+          <w:b w:val="false"/>
+          <w:bCs w:val="false"/>
           <w:i w:val="false"/>
           <w:iCs w:val="false"/>
           <w:color w:val="auto"/>
@@ -3594,10 +3593,12 @@
         </w:numPr>
         <w:suppressAutoHyphens w:val="true"/>
         <w:bidi w:val="0"/>
-        <w:spacing w:lineRule="auto" w:line="240" w:before="132" w:after="12"/>
+        <w:spacing w:lineRule="auto" w:line="240"/>
         <w:jc w:val="left"/>
         <w:rPr>
           <w:rFonts w:ascii="Times New Roman" w:hAnsi="Times New Roman" w:eastAsia="Times New Roman" w:cs="Times New Roman"/>
+          <w:b w:val="false"/>
+          <w:bCs w:val="false"/>
           <w:i w:val="false"/>
           <w:iCs w:val="false"/>
           <w:color w:val="auto"/>
@@ -3611,6 +3612,8 @@
       <w:r>
         <w:rPr>
           <w:rFonts w:eastAsia="Times New Roman" w:cs="Times New Roman"/>
+          <w:b w:val="false"/>
+          <w:bCs w:val="false"/>
           <w:i w:val="false"/>
           <w:iCs w:val="false"/>
           <w:color w:val="auto"/>
@@ -3633,10 +3636,12 @@
         </w:numPr>
         <w:suppressAutoHyphens w:val="true"/>
         <w:bidi w:val="0"/>
-        <w:spacing w:lineRule="auto" w:line="240" w:before="132" w:after="12"/>
+        <w:spacing w:lineRule="auto" w:line="240"/>
         <w:jc w:val="left"/>
         <w:rPr>
           <w:rFonts w:ascii="Times New Roman" w:hAnsi="Times New Roman" w:eastAsia="Times New Roman" w:cs="Times New Roman"/>
+          <w:b w:val="false"/>
+          <w:bCs w:val="false"/>
           <w:i w:val="false"/>
           <w:iCs w:val="false"/>
           <w:color w:val="auto"/>
@@ -3650,6 +3655,8 @@
       <w:r>
         <w:rPr>
           <w:rFonts w:eastAsia="Times New Roman" w:cs="Times New Roman"/>
+          <w:b w:val="false"/>
+          <w:bCs w:val="false"/>
           <w:i w:val="false"/>
           <w:iCs w:val="false"/>
           <w:color w:val="auto"/>
@@ -3672,10 +3679,12 @@
         </w:numPr>
         <w:suppressAutoHyphens w:val="true"/>
         <w:bidi w:val="0"/>
-        <w:spacing w:lineRule="auto" w:line="240" w:before="132" w:after="12"/>
+        <w:spacing w:lineRule="auto" w:line="240"/>
         <w:jc w:val="left"/>
         <w:rPr>
           <w:rFonts w:ascii="Times New Roman" w:hAnsi="Times New Roman" w:eastAsia="Times New Roman" w:cs="Times New Roman"/>
+          <w:b w:val="false"/>
+          <w:bCs w:val="false"/>
           <w:i w:val="false"/>
           <w:iCs w:val="false"/>
           <w:color w:val="auto"/>
@@ -3689,6 +3698,8 @@
       <w:r>
         <w:rPr>
           <w:rFonts w:eastAsia="Times New Roman" w:cs="Times New Roman"/>
+          <w:b w:val="false"/>
+          <w:bCs w:val="false"/>
           <w:i w:val="false"/>
           <w:iCs w:val="false"/>
           <w:color w:val="auto"/>
@@ -3745,8 +3756,6 @@
         <w:ind w:hanging="0"/>
         <w:jc w:val="center"/>
         <w:rPr>
-          <w:b/>
-          <w:bCs/>
           <w:lang w:val="es-CO" w:bidi="ar-SA"/>
         </w:rPr>
       </w:pPr>
@@ -3787,6 +3796,11 @@
         <w:spacing w:lineRule="auto" w:line="240"/>
         <w:jc w:val="left"/>
         <w:rPr>
+          <w:lang w:val="es-CO" w:bidi="ar-SA"/>
+        </w:rPr>
+      </w:pPr>
+      <w:r>
+        <w:rPr>
           <w:rFonts w:eastAsia="Times New Roman" w:cs="Times New Roman"/>
           <w:b/>
           <w:bCs/>
@@ -3796,55 +3810,20 @@
           <w:szCs w:val="32"/>
           <w:lang w:val="es-CO" w:eastAsia="en-US" w:bidi="ar-SA"/>
         </w:rPr>
-      </w:pPr>
-      <w:r>
-        <w:rPr>
-          <w:rFonts w:eastAsia="Times New Roman" w:cs="Times New Roman"/>
+        <w:t xml:space="preserve">4.1 </w:t>
+      </w:r>
+      <w:r>
+        <w:rPr>
           <w:b/>
           <w:bCs/>
-          <w:color w:val="auto"/>
-          <w:kern w:val="0"/>
-          <w:sz w:val="24"/>
-          <w:szCs w:val="32"/>
-          <w:lang w:eastAsia="en-US"/>
-        </w:rPr>
-        <w:t>4.</w:t>
-      </w:r>
-      <w:r>
-        <w:rPr>
-          <w:rFonts w:eastAsia="Times New Roman" w:cs="Times New Roman"/>
-          <w:b/>
-          <w:bCs/>
-          <w:color w:val="auto"/>
-          <w:kern w:val="0"/>
-          <w:sz w:val="24"/>
-          <w:szCs w:val="32"/>
-          <w:lang w:eastAsia="en-US"/>
-        </w:rPr>
-        <w:t>1</w:t>
-      </w:r>
-      <w:r>
-        <w:rPr>
-          <w:rFonts w:eastAsia="Times New Roman" w:cs="Times New Roman"/>
-          <w:b/>
-          <w:bCs/>
-          <w:color w:val="auto"/>
-          <w:kern w:val="0"/>
-          <w:sz w:val="24"/>
-          <w:szCs w:val="32"/>
-          <w:lang w:eastAsia="en-US"/>
-        </w:rPr>
-        <w:t xml:space="preserve"> </w:t>
-      </w:r>
-      <w:r>
-        <w:rPr>
-          <w:b/>
-          <w:bCs/>
+          <w:lang w:val="es-CO" w:bidi="ar-SA"/>
         </w:rPr>
         <w:t>Descripción general de Scrum</w:t>
       </w:r>
       <w:r>
-        <w:rPr/>
+        <w:rPr>
+          <w:lang w:val="es-CO" w:bidi="ar-SA"/>
+        </w:rPr>
         <w:t xml:space="preserve"> </w:t>
       </w:r>
     </w:p>
@@ -3857,18 +3836,17 @@
         <w:spacing w:lineRule="auto" w:line="240"/>
         <w:jc w:val="left"/>
         <w:rPr>
-          <w:rFonts w:eastAsia="Times New Roman" w:cs="Times New Roman"/>
-          <w:b/>
-          <w:bCs/>
-          <w:color w:val="auto"/>
-          <w:kern w:val="0"/>
-          <w:sz w:val="24"/>
-          <w:szCs w:val="32"/>
-          <w:lang w:val="es-CO" w:eastAsia="en-US" w:bidi="ar-SA"/>
-        </w:rPr>
-      </w:pPr>
-      <w:r>
-        <w:rPr/>
+          <w:b w:val="false"/>
+          <w:bCs w:val="false"/>
+          <w:lang w:val="es-CO" w:bidi="ar-SA"/>
+        </w:rPr>
+      </w:pPr>
+      <w:r>
+        <w:rPr>
+          <w:b w:val="false"/>
+          <w:bCs w:val="false"/>
+          <w:lang w:val="es-CO" w:bidi="ar-SA"/>
+        </w:rPr>
         <w:t>Scrum es un tipo de metodológica ágil de desarrollo de software que ayuda a gestionar proyectos de manera iterativa e incremental. Se basa en la colaboración del equipo, adapatandose al cambio y entrega continua de funcionalidades en ciclos cortos llamados sprints.</w:t>
       </w:r>
     </w:p>
@@ -3882,8 +3860,8 @@
         <w:jc w:val="left"/>
         <w:rPr>
           <w:rFonts w:eastAsia="Times New Roman" w:cs="Times New Roman"/>
-          <w:b/>
-          <w:bCs/>
+          <w:b w:val="false"/>
+          <w:bCs w:val="false"/>
           <w:color w:val="auto"/>
           <w:kern w:val="0"/>
           <w:sz w:val="24"/>
@@ -3892,7 +3870,16 @@
         </w:rPr>
       </w:pPr>
       <w:r>
-        <w:rPr/>
+        <w:rPr>
+          <w:rFonts w:eastAsia="Times New Roman" w:cs="Times New Roman"/>
+          <w:b w:val="false"/>
+          <w:bCs w:val="false"/>
+          <w:color w:val="auto"/>
+          <w:kern w:val="0"/>
+          <w:sz w:val="24"/>
+          <w:szCs w:val="32"/>
+          <w:lang w:val="es-CO" w:eastAsia="en-US" w:bidi="ar-SA"/>
+        </w:rPr>
       </w:r>
     </w:p>
     <w:p>
@@ -3904,18 +3891,17 @@
         <w:spacing w:lineRule="auto" w:line="240"/>
         <w:jc w:val="left"/>
         <w:rPr>
-          <w:rFonts w:eastAsia="Times New Roman" w:cs="Times New Roman"/>
-          <w:b/>
-          <w:bCs/>
-          <w:color w:val="auto"/>
-          <w:kern w:val="0"/>
-          <w:sz w:val="24"/>
-          <w:szCs w:val="32"/>
-          <w:lang w:val="es-CO" w:eastAsia="en-US" w:bidi="ar-SA"/>
-        </w:rPr>
-      </w:pPr>
-      <w:r>
-        <w:rPr/>
+          <w:b w:val="false"/>
+          <w:bCs w:val="false"/>
+          <w:lang w:val="es-CO" w:bidi="ar-SA"/>
+        </w:rPr>
+      </w:pPr>
+      <w:r>
+        <w:rPr>
+          <w:b w:val="false"/>
+          <w:bCs w:val="false"/>
+          <w:lang w:val="es-CO" w:bidi="ar-SA"/>
+        </w:rPr>
         <w:t>Esta metodología facilita la organización del trabajo, permite identificar problemas de manera temprana y mejora la calidad del producto final.</w:t>
       </w:r>
     </w:p>
@@ -3939,7 +3925,16 @@
         </w:rPr>
       </w:pPr>
       <w:r>
-        <w:rPr/>
+        <w:rPr>
+          <w:rFonts w:eastAsia="Times New Roman" w:cs="Times New Roman"/>
+          <w:b/>
+          <w:bCs/>
+          <w:color w:val="auto"/>
+          <w:kern w:val="0"/>
+          <w:sz w:val="24"/>
+          <w:szCs w:val="32"/>
+          <w:lang w:val="es-CO" w:eastAsia="en-US" w:bidi="ar-SA"/>
+        </w:rPr>
       </w:r>
     </w:p>
     <w:p>
@@ -3951,6 +3946,11 @@
         <w:spacing w:lineRule="auto" w:line="240"/>
         <w:jc w:val="left"/>
         <w:rPr>
+          <w:lang w:val="es-CO" w:bidi="ar-SA"/>
+        </w:rPr>
+      </w:pPr>
+      <w:r>
+        <w:rPr>
           <w:rFonts w:eastAsia="Times New Roman" w:cs="Times New Roman"/>
           <w:b/>
           <w:bCs/>
@@ -3960,45 +3960,7 @@
           <w:szCs w:val="32"/>
           <w:lang w:val="es-CO" w:eastAsia="en-US" w:bidi="ar-SA"/>
         </w:rPr>
-      </w:pPr>
-      <w:r>
-        <w:rPr>
-          <w:rFonts w:eastAsia="Times New Roman" w:cs="Times New Roman"/>
-          <w:b/>
-          <w:bCs/>
-          <w:color w:val="auto"/>
-          <w:kern w:val="0"/>
-          <w:sz w:val="24"/>
-          <w:szCs w:val="32"/>
-          <w:lang w:eastAsia="en-US"/>
-        </w:rPr>
-        <w:t>4.</w:t>
-      </w:r>
-      <w:r>
-        <w:rPr>
-          <w:rFonts w:eastAsia="Times New Roman" w:cs="Times New Roman"/>
-          <w:b/>
-          <w:bCs/>
-          <w:color w:val="auto"/>
-          <w:kern w:val="0"/>
-          <w:sz w:val="24"/>
-          <w:szCs w:val="32"/>
-          <w:lang w:eastAsia="en-US"/>
-        </w:rPr>
-        <w:t>2</w:t>
-      </w:r>
-      <w:r>
-        <w:rPr>
-          <w:rFonts w:eastAsia="Times New Roman" w:cs="Times New Roman"/>
-          <w:b/>
-          <w:bCs/>
-          <w:color w:val="auto"/>
-          <w:kern w:val="0"/>
-          <w:sz w:val="24"/>
-          <w:szCs w:val="32"/>
-          <w:lang w:eastAsia="en-US"/>
-        </w:rPr>
-        <w:t xml:space="preserve"> Roles del equipo de trabajo</w:t>
+        <w:t>4.2 Roles del equipo de trabajo</w:t>
       </w:r>
     </w:p>
     <w:p>
@@ -4010,31 +3972,26 @@
         <w:spacing w:lineRule="auto" w:line="240"/>
         <w:jc w:val="left"/>
         <w:rPr>
-          <w:rFonts w:eastAsia="Times New Roman" w:cs="Times New Roman"/>
-          <w:b/>
-          <w:bCs/>
+          <w:lang w:val="es-CO" w:bidi="ar-SA"/>
+        </w:rPr>
+      </w:pPr>
+      <w:r>
+        <w:rPr>
+          <w:rFonts w:eastAsia="Times New Roman" w:cs="Times New Roman"/>
+          <w:b w:val="false"/>
+          <w:bCs w:val="false"/>
           <w:color w:val="auto"/>
           <w:kern w:val="0"/>
           <w:sz w:val="24"/>
           <w:szCs w:val="32"/>
           <w:lang w:val="es-CO" w:eastAsia="en-US" w:bidi="ar-SA"/>
         </w:rPr>
-      </w:pPr>
-      <w:r>
-        <w:rPr>
-          <w:rFonts w:eastAsia="Times New Roman" w:cs="Times New Roman"/>
-          <w:b w:val="false"/>
-          <w:bCs w:val="false"/>
-          <w:color w:val="auto"/>
-          <w:kern w:val="0"/>
-          <w:sz w:val="24"/>
-          <w:szCs w:val="32"/>
-          <w:lang w:eastAsia="en-US"/>
-        </w:rPr>
         <w:t>Para el desarrollo del proyecto EduTech, el equipo de trabajo corresponde a los siguientes roles:</w:t>
       </w:r>
       <w:r>
-        <w:rPr/>
+        <w:rPr>
+          <w:lang w:val="es-CO" w:bidi="ar-SA"/>
+        </w:rPr>
         <w:t xml:space="preserve"> </w:t>
       </w:r>
     </w:p>
@@ -4051,33 +4008,30 @@
         <w:spacing w:lineRule="auto" w:line="240"/>
         <w:jc w:val="left"/>
         <w:rPr>
-          <w:rFonts w:eastAsia="Times New Roman" w:cs="Times New Roman"/>
-          <w:b/>
-          <w:bCs/>
-          <w:color w:val="auto"/>
-          <w:kern w:val="0"/>
-          <w:sz w:val="24"/>
-          <w:szCs w:val="32"/>
-          <w:lang w:val="es-CO" w:eastAsia="en-US" w:bidi="ar-SA"/>
-        </w:rPr>
-      </w:pPr>
-      <w:r>
-        <w:rPr>
-          <w:b/>
-          <w:bCs/>
-        </w:rPr>
-        <w:t xml:space="preserve">Product Owner </w:t>
-      </w:r>
-      <w:r>
-        <w:rPr>
-          <w:b/>
-          <w:bCs/>
-        </w:rPr>
-        <w:t>(Alejandro Rodriguez)</w:t>
-      </w:r>
-      <w:r>
-        <w:rPr/>
-        <w:t xml:space="preserve">: Define y prioriza los requisitos del sistema, asegurando que las funcionalidades de registro, autenticación y gestión de usuarios cumplan con las necesidades del proyecto. </w:t>
+          <w:rFonts w:ascii="Times New Roman" w:hAnsi="Times New Roman" w:eastAsia="Times New Roman" w:cs="Times New Roman"/>
+          <w:i w:val="false"/>
+          <w:iCs w:val="false"/>
+          <w:color w:val="auto"/>
+          <w:kern w:val="0"/>
+          <w:sz w:val="24"/>
+          <w:szCs w:val="24"/>
+          <w:u w:val="none"/>
+          <w:lang w:val="es-CO" w:eastAsia="en-US" w:bidi="ar-SA"/>
+        </w:rPr>
+      </w:pPr>
+      <w:r>
+        <w:rPr>
+          <w:rFonts w:eastAsia="Times New Roman" w:cs="Times New Roman"/>
+          <w:i w:val="false"/>
+          <w:iCs w:val="false"/>
+          <w:color w:val="auto"/>
+          <w:kern w:val="0"/>
+          <w:sz w:val="24"/>
+          <w:szCs w:val="24"/>
+          <w:u w:val="none"/>
+          <w:lang w:val="es-CO" w:eastAsia="en-US" w:bidi="ar-SA"/>
+        </w:rPr>
+        <w:t xml:space="preserve">Product Owner (Alejandro Rodriguez): Define y prioriza los requisitos del sistema, asegurando que las funcionalidades de registro, autenticación y gestión de usuarios cumplan con las necesidades del proyecto. </w:t>
       </w:r>
     </w:p>
     <w:p>
@@ -4093,33 +4047,30 @@
         <w:spacing w:lineRule="auto" w:line="240"/>
         <w:jc w:val="left"/>
         <w:rPr>
-          <w:rFonts w:eastAsia="Times New Roman" w:cs="Times New Roman"/>
-          <w:b/>
-          <w:bCs/>
-          <w:color w:val="auto"/>
-          <w:kern w:val="0"/>
-          <w:sz w:val="24"/>
-          <w:szCs w:val="32"/>
-          <w:lang w:val="es-CO" w:eastAsia="en-US" w:bidi="ar-SA"/>
-        </w:rPr>
-      </w:pPr>
-      <w:r>
-        <w:rPr>
-          <w:b/>
-          <w:bCs/>
-        </w:rPr>
-        <w:t xml:space="preserve">Scrum Master </w:t>
-      </w:r>
-      <w:r>
-        <w:rPr>
-          <w:b/>
-          <w:bCs/>
-        </w:rPr>
-        <w:t>(Andrés Luengas)</w:t>
-      </w:r>
-      <w:r>
-        <w:rPr/>
-        <w:t xml:space="preserve">: Facilita el desarrollo del sprint, organiza las reuniones y elimina impedimentos, garantizando el cumplimiento de la metodología Scrum. </w:t>
+          <w:rFonts w:ascii="Times New Roman" w:hAnsi="Times New Roman" w:eastAsia="Times New Roman" w:cs="Times New Roman"/>
+          <w:i w:val="false"/>
+          <w:iCs w:val="false"/>
+          <w:color w:val="auto"/>
+          <w:kern w:val="0"/>
+          <w:sz w:val="24"/>
+          <w:szCs w:val="24"/>
+          <w:u w:val="none"/>
+          <w:lang w:val="es-CO" w:eastAsia="en-US" w:bidi="ar-SA"/>
+        </w:rPr>
+      </w:pPr>
+      <w:r>
+        <w:rPr>
+          <w:rFonts w:eastAsia="Times New Roman" w:cs="Times New Roman"/>
+          <w:i w:val="false"/>
+          <w:iCs w:val="false"/>
+          <w:color w:val="auto"/>
+          <w:kern w:val="0"/>
+          <w:sz w:val="24"/>
+          <w:szCs w:val="24"/>
+          <w:u w:val="none"/>
+          <w:lang w:val="es-CO" w:eastAsia="en-US" w:bidi="ar-SA"/>
+        </w:rPr>
+        <w:t xml:space="preserve">Scrum Master (Andrés Luengas): Facilita el desarrollo del sprint, organiza las reuniones y elimina impedimentos, garantizando el cumplimiento de la metodología Scrum. </w:t>
       </w:r>
     </w:p>
     <w:p>
@@ -4135,33 +4086,30 @@
         <w:spacing w:lineRule="auto" w:line="240"/>
         <w:jc w:val="left"/>
         <w:rPr>
-          <w:rFonts w:eastAsia="Times New Roman" w:cs="Times New Roman"/>
-          <w:b/>
-          <w:bCs/>
-          <w:color w:val="auto"/>
-          <w:kern w:val="0"/>
-          <w:sz w:val="24"/>
-          <w:szCs w:val="32"/>
-          <w:lang w:val="es-CO" w:eastAsia="en-US" w:bidi="ar-SA"/>
-        </w:rPr>
-      </w:pPr>
-      <w:r>
-        <w:rPr>
-          <w:b/>
-          <w:bCs/>
-        </w:rPr>
-        <w:t xml:space="preserve">El equipo de desarrollo </w:t>
-      </w:r>
-      <w:r>
-        <w:rPr>
-          <w:b/>
-          <w:bCs/>
-        </w:rPr>
-        <w:t>(Andrés y Alejandro)</w:t>
-      </w:r>
-      <w:r>
-        <w:rPr/>
-        <w:t xml:space="preserve">: Implementa las funcionalidades del sistema, incluyendo el registro de usuarios, inicio de sesión, gestión de roles y edición de perfil, además de la estructura inicial de la base de datos. </w:t>
+          <w:rFonts w:ascii="Times New Roman" w:hAnsi="Times New Roman" w:eastAsia="Times New Roman" w:cs="Times New Roman"/>
+          <w:i w:val="false"/>
+          <w:iCs w:val="false"/>
+          <w:color w:val="auto"/>
+          <w:kern w:val="0"/>
+          <w:sz w:val="24"/>
+          <w:szCs w:val="24"/>
+          <w:u w:val="none"/>
+          <w:lang w:val="es-CO" w:eastAsia="en-US" w:bidi="ar-SA"/>
+        </w:rPr>
+      </w:pPr>
+      <w:r>
+        <w:rPr>
+          <w:rFonts w:eastAsia="Times New Roman" w:cs="Times New Roman"/>
+          <w:i w:val="false"/>
+          <w:iCs w:val="false"/>
+          <w:color w:val="auto"/>
+          <w:kern w:val="0"/>
+          <w:sz w:val="24"/>
+          <w:szCs w:val="24"/>
+          <w:u w:val="none"/>
+          <w:lang w:val="es-CO" w:eastAsia="en-US" w:bidi="ar-SA"/>
+        </w:rPr>
+        <w:t xml:space="preserve">El equipo de desarrollo (Andrés y Alejandro): Implementa las funcionalidades del sistema, incluyendo el registro de usuarios, inicio de sesión, gestión de roles y edición de perfil, además de la estructura inicial de la base de datos. </w:t>
       </w:r>
     </w:p>
     <w:p>
@@ -4177,33 +4125,30 @@
         <w:spacing w:lineRule="auto" w:line="240"/>
         <w:jc w:val="left"/>
         <w:rPr>
-          <w:rFonts w:eastAsia="Times New Roman" w:cs="Times New Roman"/>
+          <w:lang w:val="es-CO" w:bidi="ar-SA"/>
+        </w:rPr>
+      </w:pPr>
+      <w:r>
+        <w:rPr>
           <w:b/>
           <w:bCs/>
-          <w:color w:val="auto"/>
-          <w:kern w:val="0"/>
-          <w:sz w:val="24"/>
-          <w:szCs w:val="32"/>
-          <w:lang w:val="es-CO" w:eastAsia="en-US" w:bidi="ar-SA"/>
-        </w:rPr>
-      </w:pPr>
-      <w:r>
-        <w:rPr>
-          <w:b/>
-          <w:bCs/>
-        </w:rPr>
-        <w:t xml:space="preserve">Tester </w:t>
-      </w:r>
-      <w:r>
-        <w:rPr>
-          <w:b/>
-          <w:bCs/>
-        </w:rPr>
-        <w:t>(Andrés Luengas)</w:t>
-      </w:r>
-      <w:r>
-        <w:rPr/>
-        <w:t xml:space="preserve">: Validará que todas las funcionalidades desarrolladas funcionen correctamente, verificando la seguridad de los datos, la correcta autenticación y la usabilidad de la interfaz. </w:t>
+          <w:lang w:val="es-CO" w:bidi="ar-SA"/>
+        </w:rPr>
+        <w:t>Tester (Andrés Luengas)</w:t>
+      </w:r>
+      <w:r>
+        <w:rPr>
+          <w:lang w:val="es-CO" w:bidi="ar-SA"/>
+        </w:rPr>
+        <w:t xml:space="preserve">: </w:t>
+      </w:r>
+      <w:r>
+        <w:rPr>
+          <w:b w:val="false"/>
+          <w:bCs w:val="false"/>
+          <w:lang w:val="es-CO" w:bidi="ar-SA"/>
+        </w:rPr>
+        <w:t xml:space="preserve">Validará que todas las funcionalidades desarrolladas funcionen correctamente, verificando la seguridad de los datos, la correcta autenticación y la usabilidad de la interfaz. </w:t>
       </w:r>
     </w:p>
     <w:p>
@@ -4226,7 +4171,16 @@
         </w:rPr>
       </w:pPr>
       <w:r>
-        <w:rPr/>
+        <w:rPr>
+          <w:rFonts w:eastAsia="Times New Roman" w:cs="Times New Roman"/>
+          <w:b/>
+          <w:bCs/>
+          <w:color w:val="auto"/>
+          <w:kern w:val="0"/>
+          <w:sz w:val="24"/>
+          <w:szCs w:val="32"/>
+          <w:lang w:val="es-CO" w:eastAsia="en-US" w:bidi="ar-SA"/>
+        </w:rPr>
       </w:r>
     </w:p>
     <w:p>
@@ -4238,14 +4192,7 @@
         <w:spacing w:lineRule="auto" w:line="240"/>
         <w:jc w:val="left"/>
         <w:rPr>
-          <w:rFonts w:eastAsia="Times New Roman" w:cs="Times New Roman"/>
-          <w:b w:val="false"/>
-          <w:bCs w:val="false"/>
-          <w:color w:val="auto"/>
-          <w:kern w:val="0"/>
-          <w:sz w:val="24"/>
-          <w:szCs w:val="32"/>
-          <w:lang w:val="es-CO" w:eastAsia="en-US" w:bidi="ar-SA"/>
+          <w:lang w:val="es-CO" w:bidi="ar-SA"/>
         </w:rPr>
       </w:pPr>
       <w:r>
@@ -4257,35 +4204,9 @@
           <w:kern w:val="0"/>
           <w:sz w:val="24"/>
           <w:szCs w:val="32"/>
-          <w:lang w:eastAsia="en-US"/>
-        </w:rPr>
-        <w:t>4.</w:t>
-      </w:r>
-      <w:r>
-        <w:rPr>
-          <w:rFonts w:eastAsia="Times New Roman" w:cs="Times New Roman"/>
-          <w:b/>
-          <w:bCs/>
-          <w:color w:val="auto"/>
-          <w:kern w:val="0"/>
-          <w:sz w:val="24"/>
-          <w:szCs w:val="32"/>
-          <w:lang w:eastAsia="en-US"/>
-        </w:rPr>
-        <w:t>3</w:t>
-      </w:r>
-      <w:r>
-        <w:rPr>
-          <w:rFonts w:eastAsia="Times New Roman" w:cs="Times New Roman"/>
-          <w:b/>
-          <w:bCs/>
-          <w:color w:val="auto"/>
-          <w:kern w:val="0"/>
-          <w:sz w:val="24"/>
-          <w:szCs w:val="32"/>
-          <w:lang w:eastAsia="en-US"/>
-        </w:rPr>
-        <w:t xml:space="preserve"> Organización del trabajo mediante Sprints</w:t>
+          <w:lang w:val="es-CO" w:eastAsia="en-US" w:bidi="ar-SA"/>
+        </w:rPr>
+        <w:t>4.3 Organización del trabajo mediante Sprints</w:t>
       </w:r>
     </w:p>
     <w:p>
@@ -4297,6 +4218,11 @@
         <w:spacing w:lineRule="auto" w:line="240"/>
         <w:jc w:val="left"/>
         <w:rPr>
+          <w:lang w:val="es-CO" w:bidi="ar-SA"/>
+        </w:rPr>
+      </w:pPr>
+      <w:r>
+        <w:rPr>
           <w:rFonts w:eastAsia="Times New Roman" w:cs="Times New Roman"/>
           <w:b w:val="false"/>
           <w:bCs w:val="false"/>
@@ -4305,18 +4231,6 @@
           <w:sz w:val="24"/>
           <w:szCs w:val="32"/>
           <w:lang w:val="es-CO" w:eastAsia="en-US" w:bidi="ar-SA"/>
-        </w:rPr>
-      </w:pPr>
-      <w:r>
-        <w:rPr>
-          <w:rFonts w:eastAsia="Times New Roman" w:cs="Times New Roman"/>
-          <w:b w:val="false"/>
-          <w:bCs w:val="false"/>
-          <w:color w:val="auto"/>
-          <w:kern w:val="0"/>
-          <w:sz w:val="24"/>
-          <w:szCs w:val="32"/>
-          <w:lang w:eastAsia="en-US"/>
         </w:rPr>
         <w:t>Para el desarrollo del proyecto EduTech se organizara por sprints comprendidos en una duración de dos semanas cada sprint en los cuales se desarrollara funcionalidades especificas, cada sprint debe incluir:</w:t>
       </w:r>
@@ -4334,6 +4248,11 @@
         <w:spacing w:lineRule="auto" w:line="240"/>
         <w:jc w:val="left"/>
         <w:rPr>
+          <w:lang w:val="es-CO" w:bidi="ar-SA"/>
+        </w:rPr>
+      </w:pPr>
+      <w:r>
+        <w:rPr>
           <w:rFonts w:eastAsia="Times New Roman" w:cs="Times New Roman"/>
           <w:b w:val="false"/>
           <w:bCs w:val="false"/>
@@ -4341,47 +4260,9 @@
           <w:kern w:val="0"/>
           <w:sz w:val="24"/>
           <w:szCs w:val="32"/>
-          <w:lang w:eastAsia="en-US"/>
-        </w:rPr>
-      </w:pPr>
-      <w:r>
-        <w:rPr>
-          <w:rFonts w:eastAsia="Times New Roman" w:cs="Times New Roman"/>
-          <w:b w:val="false"/>
-          <w:bCs w:val="false"/>
-          <w:color w:val="auto"/>
-          <w:kern w:val="0"/>
-          <w:sz w:val="24"/>
-          <w:szCs w:val="32"/>
-          <w:lang w:eastAsia="en-US"/>
-        </w:rPr>
-        <w:t xml:space="preserve">Planificación de </w:t>
-      </w:r>
-      <w:r>
-        <w:rPr>
-          <w:rFonts w:eastAsia="Times New Roman" w:cs="Times New Roman"/>
-          <w:b w:val="false"/>
-          <w:bCs w:val="false"/>
-          <w:color w:val="auto"/>
-          <w:kern w:val="0"/>
-          <w:sz w:val="24"/>
-          <w:szCs w:val="32"/>
-          <w:lang w:eastAsia="en-US"/>
-        </w:rPr>
-        <w:t>a</w:t>
-      </w:r>
-      <w:r>
-        <w:rPr>
-          <w:rFonts w:eastAsia="Times New Roman" w:cs="Times New Roman"/>
-          <w:b w:val="false"/>
-          <w:bCs w:val="false"/>
-          <w:color w:val="auto"/>
-          <w:kern w:val="0"/>
-          <w:sz w:val="24"/>
-          <w:szCs w:val="32"/>
-          <w:lang w:eastAsia="en-US"/>
-        </w:rPr>
-        <w:t>ctividades</w:t>
+          <w:lang w:val="es-CO" w:eastAsia="en-US" w:bidi="ar-SA"/>
+        </w:rPr>
+        <w:t>Planificación de actividades</w:t>
       </w:r>
     </w:p>
     <w:p>
@@ -4397,6 +4278,11 @@
         <w:spacing w:lineRule="auto" w:line="240"/>
         <w:jc w:val="left"/>
         <w:rPr>
+          <w:lang w:val="es-CO" w:bidi="ar-SA"/>
+        </w:rPr>
+      </w:pPr>
+      <w:r>
+        <w:rPr>
           <w:rFonts w:eastAsia="Times New Roman" w:cs="Times New Roman"/>
           <w:b w:val="false"/>
           <w:bCs w:val="false"/>
@@ -4404,19 +4290,7 @@
           <w:kern w:val="0"/>
           <w:sz w:val="24"/>
           <w:szCs w:val="32"/>
-          <w:lang w:eastAsia="en-US"/>
-        </w:rPr>
-      </w:pPr>
-      <w:r>
-        <w:rPr>
-          <w:rFonts w:eastAsia="Times New Roman" w:cs="Times New Roman"/>
-          <w:b w:val="false"/>
-          <w:bCs w:val="false"/>
-          <w:color w:val="auto"/>
-          <w:kern w:val="0"/>
-          <w:sz w:val="24"/>
-          <w:szCs w:val="32"/>
-          <w:lang w:eastAsia="en-US"/>
+          <w:lang w:val="es-CO" w:eastAsia="en-US" w:bidi="ar-SA"/>
         </w:rPr>
         <w:t>Desarrollo de funcionalidades</w:t>
       </w:r>
@@ -4434,6 +4308,11 @@
         <w:spacing w:lineRule="auto" w:line="240"/>
         <w:jc w:val="left"/>
         <w:rPr>
+          <w:lang w:val="es-CO" w:bidi="ar-SA"/>
+        </w:rPr>
+      </w:pPr>
+      <w:r>
+        <w:rPr>
           <w:rFonts w:eastAsia="Times New Roman" w:cs="Times New Roman"/>
           <w:b w:val="false"/>
           <w:bCs w:val="false"/>
@@ -4441,19 +4320,7 @@
           <w:kern w:val="0"/>
           <w:sz w:val="24"/>
           <w:szCs w:val="32"/>
-          <w:lang w:eastAsia="en-US"/>
-        </w:rPr>
-      </w:pPr>
-      <w:r>
-        <w:rPr>
-          <w:rFonts w:eastAsia="Times New Roman" w:cs="Times New Roman"/>
-          <w:b w:val="false"/>
-          <w:bCs w:val="false"/>
-          <w:color w:val="auto"/>
-          <w:kern w:val="0"/>
-          <w:sz w:val="24"/>
-          <w:szCs w:val="32"/>
-          <w:lang w:eastAsia="en-US"/>
+          <w:lang w:val="es-CO" w:eastAsia="en-US" w:bidi="ar-SA"/>
         </w:rPr>
         <w:t>Revisión de avances</w:t>
       </w:r>
@@ -4471,6 +4338,11 @@
         <w:spacing w:lineRule="auto" w:line="240"/>
         <w:jc w:val="left"/>
         <w:rPr>
+          <w:lang w:val="es-CO" w:bidi="ar-SA"/>
+        </w:rPr>
+      </w:pPr>
+      <w:r>
+        <w:rPr>
           <w:rFonts w:eastAsia="Times New Roman" w:cs="Times New Roman"/>
           <w:b w:val="false"/>
           <w:bCs w:val="false"/>
@@ -4478,19 +4350,7 @@
           <w:kern w:val="0"/>
           <w:sz w:val="24"/>
           <w:szCs w:val="32"/>
-          <w:lang w:eastAsia="en-US"/>
-        </w:rPr>
-      </w:pPr>
-      <w:r>
-        <w:rPr>
-          <w:rFonts w:eastAsia="Times New Roman" w:cs="Times New Roman"/>
-          <w:b w:val="false"/>
-          <w:bCs w:val="false"/>
-          <w:color w:val="auto"/>
-          <w:kern w:val="0"/>
-          <w:sz w:val="24"/>
-          <w:szCs w:val="32"/>
-          <w:lang w:eastAsia="en-US"/>
+          <w:lang w:val="es-CO" w:eastAsia="en-US" w:bidi="ar-SA"/>
         </w:rPr>
         <w:t xml:space="preserve">Evaluación de resultados </w:t>
       </w:r>
@@ -4511,7 +4371,7 @@
           <w:kern w:val="0"/>
           <w:sz w:val="24"/>
           <w:szCs w:val="32"/>
-          <w:lang w:eastAsia="en-US"/>
+          <w:lang w:val="es-CO" w:eastAsia="en-US" w:bidi="ar-SA"/>
         </w:rPr>
       </w:pPr>
       <w:r>
@@ -4523,7 +4383,7 @@
           <w:kern w:val="0"/>
           <w:sz w:val="24"/>
           <w:szCs w:val="32"/>
-          <w:lang w:eastAsia="en-US"/>
+          <w:lang w:val="es-CO" w:eastAsia="en-US" w:bidi="ar-SA"/>
         </w:rPr>
       </w:r>
     </w:p>
@@ -4536,6 +4396,11 @@
         <w:spacing w:lineRule="auto" w:line="240"/>
         <w:jc w:val="left"/>
         <w:rPr>
+          <w:lang w:val="es-CO" w:bidi="ar-SA"/>
+        </w:rPr>
+      </w:pPr>
+      <w:r>
+        <w:rPr>
           <w:rFonts w:eastAsia="Times New Roman" w:cs="Times New Roman"/>
           <w:b w:val="false"/>
           <w:bCs w:val="false"/>
@@ -4543,19 +4408,7 @@
           <w:kern w:val="0"/>
           <w:sz w:val="24"/>
           <w:szCs w:val="32"/>
-          <w:lang w:eastAsia="en-US"/>
-        </w:rPr>
-      </w:pPr>
-      <w:r>
-        <w:rPr>
-          <w:rFonts w:eastAsia="Times New Roman" w:cs="Times New Roman"/>
-          <w:b w:val="false"/>
-          <w:bCs w:val="false"/>
-          <w:color w:val="auto"/>
-          <w:kern w:val="0"/>
-          <w:sz w:val="24"/>
-          <w:szCs w:val="32"/>
-          <w:lang w:eastAsia="en-US"/>
+          <w:lang w:val="es-CO" w:eastAsia="en-US" w:bidi="ar-SA"/>
         </w:rPr>
         <w:t>Esto ayudara a tener una visión clara y real del progreso del proyecto.</w:t>
       </w:r>
@@ -4576,7 +4429,7 @@
           <w:kern w:val="0"/>
           <w:sz w:val="24"/>
           <w:szCs w:val="32"/>
-          <w:lang w:eastAsia="en-US"/>
+          <w:lang w:val="es-CO" w:eastAsia="en-US" w:bidi="ar-SA"/>
         </w:rPr>
       </w:pPr>
       <w:r>
@@ -4588,7 +4441,7 @@
           <w:kern w:val="0"/>
           <w:sz w:val="24"/>
           <w:szCs w:val="32"/>
-          <w:lang w:eastAsia="en-US"/>
+          <w:lang w:val="es-CO" w:eastAsia="en-US" w:bidi="ar-SA"/>
         </w:rPr>
       </w:r>
     </w:p>
@@ -4601,26 +4454,12 @@
         <w:spacing w:lineRule="auto" w:line="240"/>
         <w:jc w:val="left"/>
         <w:rPr>
-          <w:rFonts w:eastAsia="Times New Roman" w:cs="Times New Roman"/>
-          <w:b w:val="false"/>
-          <w:bCs w:val="false"/>
-          <w:color w:val="auto"/>
-          <w:kern w:val="0"/>
-          <w:sz w:val="24"/>
-          <w:szCs w:val="32"/>
-          <w:lang w:eastAsia="en-US"/>
-        </w:rPr>
-      </w:pPr>
-      <w:r>
-        <w:rPr>
-          <w:rFonts w:eastAsia="Times New Roman" w:cs="Times New Roman"/>
-          <w:b w:val="false"/>
-          <w:bCs w:val="false"/>
-          <w:color w:val="auto"/>
-          <w:kern w:val="0"/>
-          <w:sz w:val="24"/>
-          <w:szCs w:val="32"/>
-          <w:lang w:eastAsia="en-US"/>
+          <w:lang w:val="es-CO" w:bidi="ar-SA"/>
+        </w:rPr>
+      </w:pPr>
+      <w:r>
+        <w:rPr>
+          <w:lang w:val="es-CO" w:bidi="ar-SA"/>
         </w:rPr>
         <w:drawing>
           <wp:inline distT="0" distB="0" distL="0" distR="0">
@@ -4670,16 +4509,7 @@
         <w:bidi w:val="0"/>
         <w:spacing w:lineRule="auto" w:line="240"/>
         <w:jc w:val="left"/>
-        <w:rPr>
-          <w:rFonts w:eastAsia="Times New Roman" w:cs="Times New Roman"/>
-          <w:b w:val="false"/>
-          <w:bCs w:val="false"/>
-          <w:color w:val="auto"/>
-          <w:kern w:val="0"/>
-          <w:sz w:val="24"/>
-          <w:szCs w:val="32"/>
-          <w:lang w:eastAsia="en-US"/>
-        </w:rPr>
+        <w:rPr/>
       </w:pPr>
       <w:hyperlink r:id="rId4">
         <w:r>
@@ -4692,7 +4522,7 @@
             <w:kern w:val="0"/>
             <w:sz w:val="24"/>
             <w:szCs w:val="32"/>
-            <w:lang w:eastAsia="en-US"/>
+            <w:lang w:val="es-CO" w:eastAsia="en-US" w:bidi="ar-SA"/>
           </w:rPr>
           <w:t>EduTech - Tablero de scrum - Jira</w:t>
         </w:r>
@@ -4706,7 +4536,7 @@
           <w:kern w:val="0"/>
           <w:sz w:val="24"/>
           <w:szCs w:val="32"/>
-          <w:lang w:eastAsia="en-US"/>
+          <w:lang w:val="es-CO" w:eastAsia="en-US" w:bidi="ar-SA"/>
         </w:rPr>
         <w:t xml:space="preserve"> </w:t>
       </w:r>
@@ -4727,7 +4557,7 @@
           <w:kern w:val="0"/>
           <w:sz w:val="24"/>
           <w:szCs w:val="32"/>
-          <w:lang w:eastAsia="en-US"/>
+          <w:lang w:val="es-CO" w:eastAsia="en-US" w:bidi="ar-SA"/>
         </w:rPr>
       </w:pPr>
       <w:r>
@@ -4739,7 +4569,7 @@
           <w:kern w:val="0"/>
           <w:sz w:val="24"/>
           <w:szCs w:val="32"/>
-          <w:lang w:eastAsia="en-US"/>
+          <w:lang w:val="es-CO" w:eastAsia="en-US" w:bidi="ar-SA"/>
         </w:rPr>
       </w:r>
     </w:p>
@@ -4752,36 +4582,16 @@
         <w:spacing w:lineRule="auto" w:line="240"/>
         <w:jc w:val="left"/>
         <w:rPr>
-          <w:rFonts w:eastAsia="Times New Roman" w:cs="Times New Roman"/>
-          <w:b w:val="false"/>
-          <w:bCs w:val="false"/>
-          <w:color w:val="auto"/>
-          <w:kern w:val="0"/>
-          <w:sz w:val="24"/>
-          <w:szCs w:val="32"/>
-          <w:lang w:val="es-CO" w:eastAsia="en-US" w:bidi="ar-SA"/>
+          <w:lang w:val="es-CO" w:bidi="ar-SA"/>
         </w:rPr>
       </w:pPr>
       <w:r>
         <w:rPr>
           <w:b/>
           <w:bCs/>
-        </w:rPr>
-        <w:t>4.</w:t>
-      </w:r>
-      <w:r>
-        <w:rPr>
-          <w:b/>
-          <w:bCs/>
-        </w:rPr>
-        <w:t>4</w:t>
-      </w:r>
-      <w:r>
-        <w:rPr>
-          <w:b/>
-          <w:bCs/>
-        </w:rPr>
-        <w:t xml:space="preserve"> Herramientas de gestión del proyecto</w:t>
+          <w:lang w:val="es-CO" w:bidi="ar-SA"/>
+        </w:rPr>
+        <w:t>4.4 Herramientas de gestión del proyecto</w:t>
       </w:r>
     </w:p>
     <w:p>
@@ -4793,20 +4603,14 @@
         <w:spacing w:lineRule="auto" w:line="240"/>
         <w:jc w:val="left"/>
         <w:rPr>
-          <w:rFonts w:eastAsia="Times New Roman" w:cs="Times New Roman"/>
-          <w:b w:val="false"/>
-          <w:bCs w:val="false"/>
-          <w:color w:val="auto"/>
-          <w:kern w:val="0"/>
-          <w:sz w:val="24"/>
-          <w:szCs w:val="32"/>
-          <w:lang w:val="es-CO" w:eastAsia="en-US" w:bidi="ar-SA"/>
-        </w:rPr>
-      </w:pPr>
-      <w:r>
-        <w:rPr>
-          <w:b w:val="false"/>
-          <w:bCs w:val="false"/>
+          <w:lang w:val="es-CO" w:bidi="ar-SA"/>
+        </w:rPr>
+      </w:pPr>
+      <w:r>
+        <w:rPr>
+          <w:b w:val="false"/>
+          <w:bCs w:val="false"/>
+          <w:lang w:val="es-CO" w:bidi="ar-SA"/>
         </w:rPr>
         <w:t>Para el desarrollo del proyecto se utilizaran las siguientes herramientas:</w:t>
       </w:r>
@@ -4821,7 +4625,7 @@
         </w:numPr>
         <w:suppressAutoHyphens w:val="true"/>
         <w:bidi w:val="0"/>
-        <w:spacing w:lineRule="auto" w:line="240" w:before="132" w:after="12"/>
+        <w:spacing w:lineRule="auto" w:line="240"/>
         <w:jc w:val="left"/>
         <w:rPr>
           <w:rFonts w:ascii="Times New Roman" w:hAnsi="Times New Roman" w:eastAsia="Times New Roman" w:cs="Times New Roman"/>
@@ -4832,14 +4636,12 @@
           <w:sz w:val="24"/>
           <w:szCs w:val="24"/>
           <w:u w:val="none"/>
-          <w:lang w:val="es-EC" w:eastAsia="en-US" w:bidi="ar-SA"/>
-        </w:rPr>
-      </w:pPr>
-      <w:r>
-        <w:rPr>
-          <w:rFonts w:eastAsia="Times New Roman" w:cs="Times New Roman"/>
-          <w:b/>
-          <w:bCs/>
+          <w:lang w:val="es-CO" w:eastAsia="en-US" w:bidi="ar-SA"/>
+        </w:rPr>
+      </w:pPr>
+      <w:r>
+        <w:rPr>
+          <w:rFonts w:eastAsia="Times New Roman" w:cs="Times New Roman"/>
           <w:i w:val="false"/>
           <w:iCs w:val="false"/>
           <w:color w:val="auto"/>
@@ -4847,23 +4649,9 @@
           <w:sz w:val="24"/>
           <w:szCs w:val="24"/>
           <w:u w:val="none"/>
-          <w:lang w:val="es-EC" w:eastAsia="en-US" w:bidi="ar-SA"/>
-        </w:rPr>
-        <w:t>Jira</w:t>
-      </w:r>
-      <w:r>
-        <w:rPr>
-          <w:rFonts w:eastAsia="Times New Roman" w:cs="Times New Roman"/>
-          <w:i w:val="false"/>
-          <w:iCs w:val="false"/>
-          <w:color w:val="auto"/>
-          <w:kern w:val="0"/>
-          <w:sz w:val="24"/>
-          <w:szCs w:val="24"/>
-          <w:u w:val="none"/>
-          <w:lang w:val="es-EC" w:eastAsia="en-US" w:bidi="ar-SA"/>
-        </w:rPr>
-        <w:t>: Se utilizara para la gestión de tareas, organizando trabajo en sprints para poder evidenciar el progreso del proyecto.</w:t>
+          <w:lang w:val="es-CO" w:eastAsia="en-US" w:bidi="ar-SA"/>
+        </w:rPr>
+        <w:t>Jira: Se utilizara para la gestión de tareas, organizando trabajo en sprints para poder evidenciar el progreso del proyecto.</w:t>
       </w:r>
     </w:p>
     <w:p>
@@ -4876,7 +4664,7 @@
         </w:numPr>
         <w:suppressAutoHyphens w:val="true"/>
         <w:bidi w:val="0"/>
-        <w:spacing w:lineRule="auto" w:line="240" w:before="132" w:after="12"/>
+        <w:spacing w:lineRule="auto" w:line="240"/>
         <w:jc w:val="left"/>
         <w:rPr>
           <w:rFonts w:ascii="Times New Roman" w:hAnsi="Times New Roman" w:eastAsia="Times New Roman" w:cs="Times New Roman"/>
@@ -4887,14 +4675,12 @@
           <w:sz w:val="24"/>
           <w:szCs w:val="24"/>
           <w:u w:val="none"/>
-          <w:lang w:val="es-EC" w:eastAsia="en-US" w:bidi="ar-SA"/>
-        </w:rPr>
-      </w:pPr>
-      <w:r>
-        <w:rPr>
-          <w:rFonts w:eastAsia="Times New Roman" w:cs="Times New Roman"/>
-          <w:b/>
-          <w:bCs/>
+          <w:lang w:val="es-CO" w:eastAsia="en-US" w:bidi="ar-SA"/>
+        </w:rPr>
+      </w:pPr>
+      <w:r>
+        <w:rPr>
+          <w:rFonts w:eastAsia="Times New Roman" w:cs="Times New Roman"/>
           <w:i w:val="false"/>
           <w:iCs w:val="false"/>
           <w:color w:val="auto"/>
@@ -4902,23 +4688,9 @@
           <w:sz w:val="24"/>
           <w:szCs w:val="24"/>
           <w:u w:val="none"/>
-          <w:lang w:val="es-EC" w:eastAsia="en-US" w:bidi="ar-SA"/>
-        </w:rPr>
-        <w:t>GitHub</w:t>
-      </w:r>
-      <w:r>
-        <w:rPr>
-          <w:rFonts w:eastAsia="Times New Roman" w:cs="Times New Roman"/>
-          <w:i w:val="false"/>
-          <w:iCs w:val="false"/>
-          <w:color w:val="auto"/>
-          <w:kern w:val="0"/>
-          <w:sz w:val="24"/>
-          <w:szCs w:val="24"/>
-          <w:u w:val="none"/>
-          <w:lang w:val="es-EC" w:eastAsia="en-US" w:bidi="ar-SA"/>
-        </w:rPr>
-        <w:t>: Se utilizara para el control de versiones de código, documentación de forma colaborativa entre los integrantes del equipo.</w:t>
+          <w:lang w:val="es-CO" w:eastAsia="en-US" w:bidi="ar-SA"/>
+        </w:rPr>
+        <w:t>GitHub: Se utilizara para el control de versiones de código, documentación de forma colaborativa entre los integrantes del equipo.</w:t>
       </w:r>
     </w:p>
     <w:p>
@@ -4931,12 +4703,10 @@
         </w:numPr>
         <w:suppressAutoHyphens w:val="true"/>
         <w:bidi w:val="0"/>
-        <w:spacing w:lineRule="auto" w:line="240" w:before="132" w:after="12"/>
+        <w:spacing w:lineRule="auto" w:line="240"/>
         <w:jc w:val="left"/>
         <w:rPr>
           <w:rFonts w:ascii="Times New Roman" w:hAnsi="Times New Roman" w:eastAsia="Times New Roman" w:cs="Times New Roman"/>
-          <w:b/>
-          <w:bCs/>
           <w:i w:val="false"/>
           <w:iCs w:val="false"/>
           <w:color w:val="auto"/>
@@ -4944,14 +4714,12 @@
           <w:sz w:val="24"/>
           <w:szCs w:val="24"/>
           <w:u w:val="none"/>
-          <w:lang w:val="es-EC" w:eastAsia="en-US" w:bidi="ar-SA"/>
-        </w:rPr>
-      </w:pPr>
-      <w:r>
-        <w:rPr>
-          <w:rFonts w:eastAsia="Times New Roman" w:cs="Times New Roman"/>
-          <w:b/>
-          <w:bCs/>
+          <w:lang w:val="es-CO" w:eastAsia="en-US" w:bidi="ar-SA"/>
+        </w:rPr>
+      </w:pPr>
+      <w:r>
+        <w:rPr>
+          <w:rFonts w:eastAsia="Times New Roman" w:cs="Times New Roman"/>
           <w:i w:val="false"/>
           <w:iCs w:val="false"/>
           <w:color w:val="auto"/>
@@ -4959,25 +4727,9 @@
           <w:sz w:val="24"/>
           <w:szCs w:val="24"/>
           <w:u w:val="none"/>
-          <w:lang w:val="es-EC" w:eastAsia="en-US" w:bidi="ar-SA"/>
-        </w:rPr>
-        <w:t xml:space="preserve">Node.js y Express: </w:t>
-      </w:r>
-      <w:r>
-        <w:rPr>
-          <w:rFonts w:eastAsia="Times New Roman" w:cs="Times New Roman"/>
-          <w:b w:val="false"/>
-          <w:bCs w:val="false"/>
-          <w:i w:val="false"/>
-          <w:iCs w:val="false"/>
-          <w:color w:val="auto"/>
-          <w:kern w:val="0"/>
-          <w:sz w:val="24"/>
-          <w:szCs w:val="24"/>
-          <w:u w:val="none"/>
-          <w:lang w:val="es-EC" w:eastAsia="en-US" w:bidi="ar-SA"/>
-        </w:rPr>
-        <w:t>Se utilizaran para el desarrollo del backend, permitiendo la gestión de lógica del server.</w:t>
+          <w:lang w:val="es-CO" w:eastAsia="en-US" w:bidi="ar-SA"/>
+        </w:rPr>
+        <w:t>Node.js y Express: Se utilizaran para el desarrollo del backend, permitiendo la gestión de lógica del server.</w:t>
       </w:r>
     </w:p>
     <w:p>
@@ -4990,12 +4742,10 @@
         </w:numPr>
         <w:suppressAutoHyphens w:val="true"/>
         <w:bidi w:val="0"/>
-        <w:spacing w:lineRule="auto" w:line="240" w:before="132" w:after="12"/>
+        <w:spacing w:lineRule="auto" w:line="240"/>
         <w:jc w:val="left"/>
         <w:rPr>
           <w:rFonts w:ascii="Times New Roman" w:hAnsi="Times New Roman" w:eastAsia="Times New Roman" w:cs="Times New Roman"/>
-          <w:b w:val="false"/>
-          <w:bCs w:val="false"/>
           <w:i w:val="false"/>
           <w:iCs w:val="false"/>
           <w:color w:val="auto"/>
@@ -5003,14 +4753,12 @@
           <w:sz w:val="24"/>
           <w:szCs w:val="24"/>
           <w:u w:val="none"/>
-          <w:lang w:val="es-EC" w:eastAsia="en-US" w:bidi="ar-SA"/>
-        </w:rPr>
-      </w:pPr>
-      <w:r>
-        <w:rPr>
-          <w:rFonts w:eastAsia="Times New Roman" w:cs="Times New Roman"/>
-          <w:b/>
-          <w:bCs/>
+          <w:lang w:val="es-CO" w:eastAsia="en-US" w:bidi="ar-SA"/>
+        </w:rPr>
+      </w:pPr>
+      <w:r>
+        <w:rPr>
+          <w:rFonts w:eastAsia="Times New Roman" w:cs="Times New Roman"/>
           <w:i w:val="false"/>
           <w:iCs w:val="false"/>
           <w:color w:val="auto"/>
@@ -5018,25 +4766,9 @@
           <w:sz w:val="24"/>
           <w:szCs w:val="24"/>
           <w:u w:val="none"/>
-          <w:lang w:val="es-EC" w:eastAsia="en-US" w:bidi="ar-SA"/>
-        </w:rPr>
-        <w:t>React</w:t>
-      </w:r>
-      <w:r>
-        <w:rPr>
-          <w:rFonts w:eastAsia="Times New Roman" w:cs="Times New Roman"/>
-          <w:b w:val="false"/>
-          <w:bCs w:val="false"/>
-          <w:i w:val="false"/>
-          <w:iCs w:val="false"/>
-          <w:color w:val="auto"/>
-          <w:kern w:val="0"/>
-          <w:sz w:val="24"/>
-          <w:szCs w:val="24"/>
-          <w:u w:val="none"/>
-          <w:lang w:val="es-EC" w:eastAsia="en-US" w:bidi="ar-SA"/>
-        </w:rPr>
-        <w:t>: Se utilizara para el desarrollo del frontend ayudando a la creación de la interfaz de usuario IU sea dianmica e interactiva.</w:t>
+          <w:lang w:val="es-CO" w:eastAsia="en-US" w:bidi="ar-SA"/>
+        </w:rPr>
+        <w:t>React: Se utilizara para el desarrollo del frontend ayudando a la creación de la interfaz de usuario IU sea dianmica e interactiva.</w:t>
       </w:r>
     </w:p>
     <w:p>
@@ -5049,12 +4781,10 @@
         </w:numPr>
         <w:suppressAutoHyphens w:val="true"/>
         <w:bidi w:val="0"/>
-        <w:spacing w:lineRule="auto" w:line="240" w:before="132" w:after="12"/>
+        <w:spacing w:lineRule="auto" w:line="240"/>
         <w:jc w:val="left"/>
         <w:rPr>
           <w:rFonts w:ascii="Times New Roman" w:hAnsi="Times New Roman" w:eastAsia="Times New Roman" w:cs="Times New Roman"/>
-          <w:b w:val="false"/>
-          <w:bCs w:val="false"/>
           <w:i w:val="false"/>
           <w:iCs w:val="false"/>
           <w:color w:val="auto"/>
@@ -5062,14 +4792,12 @@
           <w:sz w:val="24"/>
           <w:szCs w:val="24"/>
           <w:u w:val="none"/>
-          <w:lang w:val="es-EC" w:eastAsia="en-US" w:bidi="ar-SA"/>
-        </w:rPr>
-      </w:pPr>
-      <w:r>
-        <w:rPr>
-          <w:rFonts w:eastAsia="Times New Roman" w:cs="Times New Roman"/>
-          <w:b/>
-          <w:bCs/>
+          <w:lang w:val="es-CO" w:eastAsia="en-US" w:bidi="ar-SA"/>
+        </w:rPr>
+      </w:pPr>
+      <w:r>
+        <w:rPr>
+          <w:rFonts w:eastAsia="Times New Roman" w:cs="Times New Roman"/>
           <w:i w:val="false"/>
           <w:iCs w:val="false"/>
           <w:color w:val="auto"/>
@@ -5077,41 +4805,9 @@
           <w:sz w:val="24"/>
           <w:szCs w:val="24"/>
           <w:u w:val="none"/>
-          <w:lang w:val="es-EC" w:eastAsia="en-US" w:bidi="ar-SA"/>
-        </w:rPr>
-        <w:t>Mongo</w:t>
-      </w:r>
-      <w:r>
-        <w:rPr>
-          <w:rFonts w:eastAsia="Times New Roman" w:cs="Times New Roman"/>
-          <w:b w:val="false"/>
-          <w:bCs w:val="false"/>
-          <w:i w:val="false"/>
-          <w:iCs w:val="false"/>
-          <w:color w:val="auto"/>
-          <w:kern w:val="0"/>
-          <w:sz w:val="24"/>
-          <w:szCs w:val="24"/>
-          <w:u w:val="none"/>
-          <w:lang w:val="es-EC" w:eastAsia="en-US" w:bidi="ar-SA"/>
-        </w:rPr>
-        <w:t>:  Se utiliza</w:t>
-      </w:r>
-      <w:r>
-        <w:rPr>
-          <w:rFonts w:eastAsia="Times New Roman" w:cs="Times New Roman"/>
-          <w:b w:val="false"/>
-          <w:bCs w:val="false"/>
-          <w:i w:val="false"/>
-          <w:iCs w:val="false"/>
-          <w:color w:val="auto"/>
-          <w:kern w:val="0"/>
-          <w:sz w:val="24"/>
-          <w:szCs w:val="24"/>
-          <w:u w:val="none"/>
-          <w:lang w:val="es-EC" w:eastAsia="en-US" w:bidi="ar-SA"/>
-        </w:rPr>
-        <w:t>ra para el almacenamiento y gestión de la información.</w:t>
+          <w:lang w:val="es-CO" w:eastAsia="en-US" w:bidi="ar-SA"/>
+        </w:rPr>
+        <w:t>Mongo:  Se utilizara para el almacenamiento y gestión de la información.</w:t>
       </w:r>
     </w:p>
     <w:p>
@@ -5124,12 +4820,10 @@
         </w:numPr>
         <w:suppressAutoHyphens w:val="true"/>
         <w:bidi w:val="0"/>
-        <w:spacing w:lineRule="auto" w:line="240" w:before="132" w:after="12"/>
+        <w:spacing w:lineRule="auto" w:line="240"/>
         <w:jc w:val="left"/>
         <w:rPr>
           <w:rFonts w:ascii="Times New Roman" w:hAnsi="Times New Roman" w:eastAsia="Times New Roman" w:cs="Times New Roman"/>
-          <w:b w:val="false"/>
-          <w:bCs w:val="false"/>
           <w:i w:val="false"/>
           <w:iCs w:val="false"/>
           <w:color w:val="auto"/>
@@ -5137,14 +4831,12 @@
           <w:sz w:val="24"/>
           <w:szCs w:val="24"/>
           <w:u w:val="none"/>
-          <w:lang w:val="es-EC" w:eastAsia="en-US" w:bidi="ar-SA"/>
-        </w:rPr>
-      </w:pPr>
-      <w:r>
-        <w:rPr>
-          <w:rFonts w:eastAsia="Times New Roman" w:cs="Times New Roman"/>
-          <w:b/>
-          <w:bCs/>
+          <w:lang w:val="es-CO" w:eastAsia="en-US" w:bidi="ar-SA"/>
+        </w:rPr>
+      </w:pPr>
+      <w:r>
+        <w:rPr>
+          <w:rFonts w:eastAsia="Times New Roman" w:cs="Times New Roman"/>
           <w:i w:val="false"/>
           <w:iCs w:val="false"/>
           <w:color w:val="auto"/>
@@ -5152,25 +4844,9 @@
           <w:sz w:val="24"/>
           <w:szCs w:val="24"/>
           <w:u w:val="none"/>
-          <w:lang w:val="es-EC" w:eastAsia="en-US" w:bidi="ar-SA"/>
-        </w:rPr>
-        <w:t>Figma</w:t>
-      </w:r>
-      <w:r>
-        <w:rPr>
-          <w:rFonts w:eastAsia="Times New Roman" w:cs="Times New Roman"/>
-          <w:b w:val="false"/>
-          <w:bCs w:val="false"/>
-          <w:i w:val="false"/>
-          <w:iCs w:val="false"/>
-          <w:color w:val="auto"/>
-          <w:kern w:val="0"/>
-          <w:sz w:val="24"/>
-          <w:szCs w:val="24"/>
-          <w:u w:val="none"/>
-          <w:lang w:val="es-EC" w:eastAsia="en-US" w:bidi="ar-SA"/>
-        </w:rPr>
-        <w:t>: Se utilizara para el diseño de interfaces y prototipos, ayudando a la planeación de la experiencia del usuario UX.</w:t>
+          <w:lang w:val="es-CO" w:eastAsia="en-US" w:bidi="ar-SA"/>
+        </w:rPr>
+        <w:t>Figma: Se utilizara para el diseño de interfaces y prototipos, ayudando a la planeación de la experiencia del usuario UX.</w:t>
       </w:r>
     </w:p>
     <w:p>
@@ -5183,12 +4859,10 @@
         </w:numPr>
         <w:suppressAutoHyphens w:val="true"/>
         <w:bidi w:val="0"/>
-        <w:spacing w:lineRule="auto" w:line="240" w:before="132" w:after="12"/>
+        <w:spacing w:lineRule="auto" w:line="240"/>
         <w:jc w:val="left"/>
         <w:rPr>
           <w:rFonts w:ascii="Times New Roman" w:hAnsi="Times New Roman" w:eastAsia="Times New Roman" w:cs="Times New Roman"/>
-          <w:b w:val="false"/>
-          <w:bCs w:val="false"/>
           <w:i w:val="false"/>
           <w:iCs w:val="false"/>
           <w:color w:val="auto"/>
@@ -5196,14 +4870,12 @@
           <w:sz w:val="24"/>
           <w:szCs w:val="24"/>
           <w:u w:val="none"/>
-          <w:lang w:val="es-EC" w:eastAsia="en-US" w:bidi="ar-SA"/>
-        </w:rPr>
-      </w:pPr>
-      <w:r>
-        <w:rPr>
-          <w:rFonts w:eastAsia="Times New Roman" w:cs="Times New Roman"/>
-          <w:b/>
-          <w:bCs/>
+          <w:lang w:val="es-CO" w:eastAsia="en-US" w:bidi="ar-SA"/>
+        </w:rPr>
+      </w:pPr>
+      <w:r>
+        <w:rPr>
+          <w:rFonts w:eastAsia="Times New Roman" w:cs="Times New Roman"/>
           <w:i w:val="false"/>
           <w:iCs w:val="false"/>
           <w:color w:val="auto"/>
@@ -5211,25 +4883,9 @@
           <w:sz w:val="24"/>
           <w:szCs w:val="24"/>
           <w:u w:val="none"/>
-          <w:lang w:val="es-EC" w:eastAsia="en-US" w:bidi="ar-SA"/>
-        </w:rPr>
-        <w:t>DevOps</w:t>
-      </w:r>
-      <w:r>
-        <w:rPr>
-          <w:rFonts w:eastAsia="Times New Roman" w:cs="Times New Roman"/>
-          <w:b w:val="false"/>
-          <w:bCs w:val="false"/>
-          <w:i w:val="false"/>
-          <w:iCs w:val="false"/>
-          <w:color w:val="auto"/>
-          <w:kern w:val="0"/>
-          <w:sz w:val="24"/>
-          <w:szCs w:val="24"/>
-          <w:u w:val="none"/>
-          <w:lang w:val="es-EC" w:eastAsia="en-US" w:bidi="ar-SA"/>
-        </w:rPr>
-        <w:t>: Se aplicaran practicas básica para la integración y despliegue del sistema, optimizando el proceso de desarrollo.</w:t>
+          <w:lang w:val="es-CO" w:eastAsia="en-US" w:bidi="ar-SA"/>
+        </w:rPr>
+        <w:t>DevOps: Se aplicaran practicas básica para la integración y despliegue del sistema, optimizando el proceso de desarrollo.</w:t>
       </w:r>
     </w:p>
     <w:p>
@@ -5248,7 +4904,7 @@
           <w:kern w:val="0"/>
           <w:sz w:val="24"/>
           <w:szCs w:val="32"/>
-          <w:lang w:eastAsia="en-US"/>
+          <w:lang w:val="es-CO" w:eastAsia="en-US" w:bidi="ar-SA"/>
         </w:rPr>
       </w:pPr>
       <w:r>
@@ -5260,7 +4916,7 @@
           <w:kern w:val="0"/>
           <w:sz w:val="24"/>
           <w:szCs w:val="32"/>
-          <w:lang w:eastAsia="en-US"/>
+          <w:lang w:val="es-CO" w:eastAsia="en-US" w:bidi="ar-SA"/>
         </w:rPr>
       </w:r>
     </w:p>
@@ -5280,7 +4936,7 @@
           <w:kern w:val="0"/>
           <w:sz w:val="24"/>
           <w:szCs w:val="32"/>
-          <w:lang w:eastAsia="en-US"/>
+          <w:lang w:val="es-CO" w:eastAsia="en-US" w:bidi="ar-SA"/>
         </w:rPr>
       </w:pPr>
       <w:r>
@@ -5292,7 +4948,7 @@
           <w:kern w:val="0"/>
           <w:sz w:val="24"/>
           <w:szCs w:val="32"/>
-          <w:lang w:eastAsia="en-US"/>
+          <w:lang w:val="es-CO" w:eastAsia="en-US" w:bidi="ar-SA"/>
         </w:rPr>
       </w:r>
     </w:p>
@@ -5339,16 +4995,7 @@
         <w:spacing w:lineRule="auto" w:line="240" w:before="132" w:after="12"/>
         <w:jc w:val="both"/>
         <w:rPr>
-          <w:rFonts w:ascii="Times New Roman" w:hAnsi="Times New Roman" w:eastAsia="Times New Roman" w:cs="Times New Roman"/>
-          <w:b/>
-          <w:bCs/>
-          <w:i w:val="false"/>
-          <w:iCs w:val="false"/>
-          <w:color w:val="auto"/>
-          <w:kern w:val="0"/>
-          <w:sz w:val="24"/>
-          <w:szCs w:val="32"/>
-          <w:lang w:val="es-CO" w:eastAsia="en-US" w:bidi="ar-SA"/>
+          <w:lang w:val="es-CO" w:bidi="ar-SA"/>
         </w:rPr>
       </w:pPr>
       <w:r>
@@ -5506,7 +5153,7 @@
           <w:lang w:val="es-CO" w:eastAsia="en-US" w:bidi="ar-SA"/>
         </w:rPr>
         <w:drawing>
-          <wp:anchor distT="0" distB="0" distL="0" distR="0" simplePos="0" relativeHeight="25" behindDoc="0" locked="0" layoutInCell="0" allowOverlap="1">
+          <wp:anchor distT="0" distB="0" distL="0" distR="0" simplePos="0" relativeHeight="29" behindDoc="0" locked="0" layoutInCell="0" allowOverlap="1">
             <wp:simplePos x="0" y="0"/>
             <wp:positionH relativeFrom="column">
               <wp:posOffset>-15240</wp:posOffset>
@@ -5514,7 +5161,7 @@
             <wp:positionV relativeFrom="paragraph">
               <wp:posOffset>635</wp:posOffset>
             </wp:positionV>
-            <wp:extent cx="6009640" cy="2203450"/>
+            <wp:extent cx="6009640" cy="2823845"/>
             <wp:effectExtent l="0" t="0" r="0" b="0"/>
             <wp:wrapSquare wrapText="largest"/>
             <wp:docPr id="3" name="Imagen1"/>
@@ -5539,7 +5186,7 @@
                   <pic:spPr bwMode="auto">
                     <a:xfrm>
                       <a:off x="0" y="0"/>
-                      <a:ext cx="6009640" cy="2203450"/>
+                      <a:ext cx="6009640" cy="2823845"/>
                     </a:xfrm>
                     <a:prstGeom prst="rect">
                       <a:avLst/>
@@ -5577,21 +5224,7 @@
           <w:u w:val="none"/>
           <w:lang w:val="es-CO" w:eastAsia="en-US" w:bidi="ar-SA"/>
         </w:rPr>
-        <w:t>5</w:t>
-      </w:r>
-      <w:r>
-        <w:rPr>
-          <w:rFonts w:eastAsia="Times New Roman" w:cs="Times New Roman"/>
-          <w:b/>
-          <w:bCs/>
-          <w:color w:val="auto"/>
-          <w:kern w:val="0"/>
-          <w:sz w:val="24"/>
-          <w:szCs w:val="24"/>
-          <w:u w:val="none"/>
-          <w:lang w:val="es-CO" w:eastAsia="en-US" w:bidi="ar-SA"/>
-        </w:rPr>
-        <w:t>.2 Url Requisitos No Funcionales</w:t>
+        <w:t>5.2 Url Requisitos No Funcionales</w:t>
       </w:r>
     </w:p>
     <w:p>
@@ -5653,27 +5286,35 @@
         <w:pStyle w:val="APALevel2"/>
         <w:jc w:val="both"/>
         <w:rPr>
-          <w:b w:val="false"/>
-          <w:bCs w:val="false"/>
-          <w:lang w:val="es-CO" w:bidi="ar-SA"/>
-        </w:rPr>
-      </w:pPr>
-      <w:r>
-        <w:rPr>
-          <w:b w:val="false"/>
-          <w:bCs w:val="false"/>
-          <w:lang w:val="es-CO" w:bidi="ar-SA"/>
+          <w:rFonts w:eastAsia="Times New Roman" w:cs="Times New Roman"/>
+          <w:color w:val="auto"/>
+          <w:kern w:val="0"/>
+          <w:sz w:val="24"/>
+          <w:szCs w:val="32"/>
+          <w:u w:val="none"/>
+          <w:lang w:val="es-CO" w:eastAsia="en-US" w:bidi="ar-SA"/>
+        </w:rPr>
+      </w:pPr>
+      <w:r>
+        <w:rPr>
+          <w:rFonts w:eastAsia="Times New Roman" w:cs="Times New Roman"/>
+          <w:color w:val="auto"/>
+          <w:kern w:val="0"/>
+          <w:sz w:val="24"/>
+          <w:szCs w:val="32"/>
+          <w:u w:val="none"/>
+          <w:lang w:val="es-CO" w:eastAsia="en-US" w:bidi="ar-SA"/>
         </w:rPr>
         <w:drawing>
-          <wp:anchor distT="0" distB="0" distL="0" distR="0" simplePos="0" relativeHeight="26" behindDoc="0" locked="0" layoutInCell="0" allowOverlap="1">
+          <wp:anchor distT="0" distB="0" distL="0" distR="0" simplePos="0" relativeHeight="30" behindDoc="0" locked="0" layoutInCell="0" allowOverlap="1">
             <wp:simplePos x="0" y="0"/>
             <wp:positionH relativeFrom="column">
               <wp:posOffset>-5715</wp:posOffset>
             </wp:positionH>
             <wp:positionV relativeFrom="paragraph">
-              <wp:posOffset>208915</wp:posOffset>
+              <wp:posOffset>10160</wp:posOffset>
             </wp:positionV>
-            <wp:extent cx="6009640" cy="2379345"/>
+            <wp:extent cx="6009640" cy="2466340"/>
             <wp:effectExtent l="0" t="0" r="0" b="0"/>
             <wp:wrapSquare wrapText="largest"/>
             <wp:docPr id="4" name="Imagen2"/>
@@ -5698,7 +5339,7 @@
                   <pic:spPr bwMode="auto">
                     <a:xfrm>
                       <a:off x="0" y="0"/>
-                      <a:ext cx="6009640" cy="2379345"/>
+                      <a:ext cx="6009640" cy="2466340"/>
                     </a:xfrm>
                     <a:prstGeom prst="rect">
                       <a:avLst/>
@@ -5740,32 +5381,6 @@
     </w:p>
     <w:p>
       <w:pPr>
-        <w:pStyle w:val="APALevel2"/>
-        <w:jc w:val="both"/>
-        <w:rPr>
-          <w:rFonts w:eastAsia="Times New Roman" w:cs="Times New Roman"/>
-          <w:color w:val="auto"/>
-          <w:kern w:val="0"/>
-          <w:sz w:val="24"/>
-          <w:szCs w:val="32"/>
-          <w:u w:val="none"/>
-          <w:lang w:val="es-CO" w:eastAsia="en-US" w:bidi="ar-SA"/>
-        </w:rPr>
-      </w:pPr>
-      <w:r>
-        <w:rPr>
-          <w:rFonts w:eastAsia="Times New Roman" w:cs="Times New Roman"/>
-          <w:color w:val="auto"/>
-          <w:kern w:val="0"/>
-          <w:sz w:val="24"/>
-          <w:szCs w:val="32"/>
-          <w:u w:val="none"/>
-          <w:lang w:val="es-CO" w:eastAsia="en-US" w:bidi="ar-SA"/>
-        </w:rPr>
-      </w:r>
-    </w:p>
-    <w:p>
-      <w:pPr>
         <w:pStyle w:val="BodyText"/>
         <w:ind w:hanging="0"/>
         <w:jc w:val="center"/>
@@ -5823,7 +5438,7 @@
       </w:pPr>
       <w:r>
         <w:drawing>
-          <wp:anchor distT="0" distB="0" distL="114300" distR="114300" simplePos="0" relativeHeight="21" behindDoc="0" locked="0" layoutInCell="0" allowOverlap="1">
+          <wp:anchor distT="0" distB="0" distL="114300" distR="114300" simplePos="0" relativeHeight="26" behindDoc="0" locked="0" layoutInCell="0" allowOverlap="1">
             <wp:simplePos x="0" y="0"/>
             <wp:positionH relativeFrom="column">
               <wp:posOffset>-23495</wp:posOffset>
@@ -5835,11 +5450,11 @@
             <wp:effectExtent l="0" t="0" r="0" b="0"/>
             <wp:wrapThrough wrapText="bothSides">
               <wp:wrapPolygon edited="0">
-                <wp:start x="-81" y="0"/>
-                <wp:lineTo x="-81" y="21324"/>
-                <wp:lineTo x="21557" y="21324"/>
+                <wp:start x="-102" y="0"/>
+                <wp:lineTo x="-102" y="21287"/>
+                <wp:lineTo x="21557" y="21287"/>
                 <wp:lineTo x="21557" y="0"/>
-                <wp:lineTo x="-81" y="0"/>
+                <wp:lineTo x="-102" y="0"/>
               </wp:wrapPolygon>
             </wp:wrapThrough>
             <wp:docPr id="5" name="Imagen 1"/>
@@ -6232,7 +5847,9 @@
         </w:rPr>
       </w:pPr>
       <w:r>
-        <w:rPr/>
+        <w:rPr>
+          <w:lang w:val="es-CO" w:bidi="ar-SA"/>
+        </w:rPr>
       </w:r>
     </w:p>
     <w:p>
@@ -6246,8 +5863,6 @@
       </w:pPr>
       <w:r>
         <w:rPr>
-          <w:b/>
-          <w:bCs/>
           <w:lang w:val="es-CO" w:bidi="ar-SA"/>
         </w:rPr>
       </w:r>
@@ -6279,16 +5894,7 @@
         <w:spacing w:lineRule="auto" w:line="240" w:before="360" w:after="240"/>
         <w:jc w:val="both"/>
         <w:rPr>
-          <w:rFonts w:ascii="Times New Roman" w:hAnsi="Times New Roman" w:eastAsia="Times New Roman" w:cs="Times New Roman"/>
-          <w:b/>
-          <w:bCs w:val="false"/>
-          <w:i w:val="false"/>
-          <w:iCs w:val="false"/>
-          <w:color w:val="2315DA"/>
-          <w:kern w:val="0"/>
-          <w:sz w:val="24"/>
-          <w:szCs w:val="24"/>
-          <w:lang w:val="es-CO" w:eastAsia="en-US" w:bidi="ar-SA"/>
+          <w:lang w:val="es-CO" w:bidi="ar-SA"/>
         </w:rPr>
       </w:pPr>
       <w:r>
@@ -6358,7 +5964,7 @@
           <w:lang w:val="es-CO" w:eastAsia="en-US" w:bidi="ar-SA"/>
         </w:rPr>
         <w:drawing>
-          <wp:anchor distT="0" distB="0" distL="0" distR="0" simplePos="0" relativeHeight="23" behindDoc="0" locked="0" layoutInCell="0" allowOverlap="1">
+          <wp:anchor distT="0" distB="0" distL="0" distR="0" simplePos="0" relativeHeight="28" behindDoc="0" locked="0" layoutInCell="0" allowOverlap="1">
             <wp:simplePos x="0" y="0"/>
             <wp:positionH relativeFrom="column">
               <wp:posOffset>0</wp:posOffset>
@@ -6366,7 +5972,7 @@
             <wp:positionV relativeFrom="paragraph">
               <wp:posOffset>92075</wp:posOffset>
             </wp:positionV>
-            <wp:extent cx="5904865" cy="2527935"/>
+            <wp:extent cx="5904865" cy="2396490"/>
             <wp:effectExtent l="0" t="0" r="0" b="0"/>
             <wp:wrapSquare wrapText="largest"/>
             <wp:docPr id="6" name="Imagen3"/>
@@ -6391,7 +5997,7 @@
                   <pic:spPr bwMode="auto">
                     <a:xfrm>
                       <a:off x="0" y="0"/>
-                      <a:ext cx="5904865" cy="2527935"/>
+                      <a:ext cx="5904865" cy="2396490"/>
                     </a:xfrm>
                     <a:prstGeom prst="rect">
                       <a:avLst/>
@@ -6407,6 +6013,159 @@
     </w:p>
     <w:p>
       <w:pPr>
+        <w:pStyle w:val="BodyText"/>
+        <w:ind w:hanging="0"/>
+        <w:jc w:val="center"/>
+        <w:rPr>
+          <w:b/>
+          <w:bCs/>
+          <w:lang w:val="es-CO" w:bidi="ar-SA"/>
+        </w:rPr>
+      </w:pPr>
+      <w:r>
+        <w:rPr>
+          <w:b/>
+          <w:bCs/>
+          <w:lang w:val="es-CO" w:bidi="ar-SA"/>
+        </w:rPr>
+        <w:t xml:space="preserve">8. </w:t>
+      </w:r>
+      <w:bookmarkStart w:id="38" w:name="yui_3_17_2_1_1775225196518_356"/>
+      <w:bookmarkEnd w:id="38"/>
+      <w:r>
+        <w:rPr>
+          <w:b/>
+          <w:bCs/>
+          <w:sz w:val="24"/>
+          <w:szCs w:val="24"/>
+          <w:lang w:val="es-CO" w:eastAsia="en-US" w:bidi="ar-SA"/>
+        </w:rPr>
+        <w:t>Flujos de solución</w:t>
+      </w:r>
+    </w:p>
+    <w:p>
+      <w:pPr>
+        <w:pStyle w:val="BodyText"/>
+        <w:ind w:hanging="0"/>
+        <w:jc w:val="center"/>
+        <w:rPr>
+          <w:b/>
+          <w:bCs/>
+          <w:lang w:val="es-CO" w:bidi="ar-SA"/>
+        </w:rPr>
+      </w:pPr>
+      <w:r>
+        <w:rPr>
+          <w:b/>
+          <w:bCs/>
+          <w:lang w:val="es-CO" w:bidi="ar-SA"/>
+        </w:rPr>
+      </w:r>
+    </w:p>
+    <w:p>
+      <w:pPr>
+        <w:pStyle w:val="BodyText"/>
+        <w:ind w:hanging="0"/>
+        <w:jc w:val="left"/>
+        <w:rPr>
+          <w:b w:val="false"/>
+          <w:bCs w:val="false"/>
+          <w:lang w:val="es-CO" w:bidi="ar-SA"/>
+        </w:rPr>
+      </w:pPr>
+      <w:r>
+        <w:rPr>
+          <w:b w:val="false"/>
+          <w:bCs w:val="false"/>
+          <w:lang w:val="es-CO" w:bidi="ar-SA"/>
+        </w:rPr>
+        <w:t>El flujo de solución representa el funcionamiento general de la plataforma Edutech, mostrando la interacción del usuario, las acciones principales y como este interactúa con el sistema. Para esta representación , se utilizaron los siguientes diagramas que ayudan a visualizar tanto el recorrido del usuario dentro de la plataforma.</w:t>
+      </w:r>
+    </w:p>
+    <w:p>
+      <w:pPr>
+        <w:pStyle w:val="APALevel2"/>
+        <w:widowControl/>
+        <w:suppressAutoHyphens w:val="true"/>
+        <w:bidi w:val="0"/>
+        <w:spacing w:lineRule="auto" w:line="240" w:before="189" w:after="69"/>
+        <w:jc w:val="both"/>
+        <w:rPr>
+          <w:lang w:val="es-CO" w:bidi="ar-SA"/>
+        </w:rPr>
+      </w:pPr>
+      <w:r>
+        <w:rPr>
+          <w:rFonts w:eastAsia="Times New Roman" w:cs="Times New Roman"/>
+          <w:b/>
+          <w:bCs/>
+          <w:i w:val="false"/>
+          <w:iCs w:val="false"/>
+          <w:color w:val="auto"/>
+          <w:kern w:val="0"/>
+          <w:sz w:val="24"/>
+          <w:szCs w:val="24"/>
+          <w:u w:val="none"/>
+          <w:lang w:val="es-CO" w:eastAsia="en-US" w:bidi="ar-SA"/>
+        </w:rPr>
+        <w:t>8.1 User Flow</w:t>
+      </w:r>
+      <w:r>
+        <w:rPr>
+          <w:rFonts w:eastAsia="Times New Roman" w:cs="Times New Roman"/>
+          <w:i w:val="false"/>
+          <w:iCs w:val="false"/>
+          <w:color w:val="auto"/>
+          <w:kern w:val="0"/>
+          <w:sz w:val="24"/>
+          <w:szCs w:val="24"/>
+          <w:u w:val="none"/>
+          <w:lang w:val="es-CO" w:eastAsia="en-US" w:bidi="ar-SA"/>
+        </w:rPr>
+        <w:t xml:space="preserve"> </w:t>
+      </w:r>
+    </w:p>
+    <w:p>
+      <w:pPr>
+        <w:pStyle w:val="APALevel2"/>
+        <w:widowControl/>
+        <w:suppressAutoHyphens w:val="true"/>
+        <w:bidi w:val="0"/>
+        <w:spacing w:lineRule="auto" w:line="240"/>
+        <w:jc w:val="both"/>
+        <w:rPr>
+          <w:rFonts w:ascii="Times New Roman" w:hAnsi="Times New Roman" w:eastAsia="Times New Roman" w:cs="Times New Roman"/>
+          <w:b w:val="false"/>
+          <w:bCs w:val="false"/>
+          <w:i w:val="false"/>
+          <w:iCs w:val="false"/>
+          <w:color w:val="auto"/>
+          <w:kern w:val="0"/>
+          <w:sz w:val="24"/>
+          <w:szCs w:val="24"/>
+          <w:u w:val="none"/>
+          <w:lang w:val="es-CO" w:eastAsia="en-US" w:bidi="ar-SA"/>
+        </w:rPr>
+      </w:pPr>
+      <w:r>
+        <w:rPr>
+          <w:rFonts w:eastAsia="Times New Roman" w:cs="Times New Roman"/>
+          <w:b w:val="false"/>
+          <w:bCs w:val="false"/>
+          <w:i w:val="false"/>
+          <w:iCs w:val="false"/>
+          <w:color w:val="auto"/>
+          <w:kern w:val="0"/>
+          <w:sz w:val="24"/>
+          <w:szCs w:val="24"/>
+          <w:u w:val="none"/>
+          <w:lang w:val="es-CO" w:eastAsia="en-US" w:bidi="ar-SA"/>
+        </w:rPr>
+        <w:t>Este diagrama representa el flujo de navegación del usuario dentro de la plataforma Edutech, mostrando las acciones principales dependiendo el rol.</w:t>
+      </w:r>
+    </w:p>
+    <w:p>
+      <w:pPr>
         <w:pStyle w:val="APALevel2"/>
         <w:widowControl/>
         <w:suppressAutoHyphens w:val="true"/>
@@ -6414,17 +6173,485 @@
         <w:spacing w:lineRule="auto" w:line="240" w:before="360" w:after="240"/>
         <w:jc w:val="both"/>
         <w:rPr>
+          <w:rFonts w:eastAsia="Times New Roman" w:cs="Times New Roman"/>
+          <w:b w:val="false"/>
+          <w:bCs w:val="false"/>
+          <w:color w:val="auto"/>
+          <w:kern w:val="0"/>
+          <w:sz w:val="24"/>
+          <w:szCs w:val="24"/>
+          <w:u w:val="none"/>
+          <w:lang w:val="es-CO" w:eastAsia="en-US" w:bidi="ar-SA"/>
+        </w:rPr>
+      </w:pPr>
+      <w:r>
+        <w:rPr>
+          <w:rFonts w:eastAsia="Times New Roman" w:cs="Times New Roman"/>
+          <w:b w:val="false"/>
+          <w:bCs w:val="false"/>
+          <w:color w:val="auto"/>
+          <w:kern w:val="0"/>
+          <w:sz w:val="24"/>
+          <w:szCs w:val="24"/>
+          <w:u w:val="none"/>
+          <w:lang w:val="es-CO" w:eastAsia="en-US" w:bidi="ar-SA"/>
+        </w:rPr>
+        <w:drawing>
+          <wp:anchor distT="0" distB="0" distL="0" distR="0" simplePos="0" relativeHeight="31" behindDoc="0" locked="0" layoutInCell="0" allowOverlap="1">
+            <wp:simplePos x="0" y="0"/>
+            <wp:positionH relativeFrom="column">
+              <wp:posOffset>32385</wp:posOffset>
+            </wp:positionH>
+            <wp:positionV relativeFrom="paragraph">
+              <wp:posOffset>54610</wp:posOffset>
+            </wp:positionV>
+            <wp:extent cx="6001385" cy="2767965"/>
+            <wp:effectExtent l="0" t="0" r="0" b="0"/>
+            <wp:wrapSquare wrapText="largest"/>
+            <wp:docPr id="7" name="Imagen8"/>
+            <wp:cNvGraphicFramePr>
+              <a:graphicFrameLocks xmlns:a="http://schemas.openxmlformats.org/drawingml/2006/main" noChangeAspect="1"/>
+            </wp:cNvGraphicFramePr>
+            <a:graphic xmlns:a="http://schemas.openxmlformats.org/drawingml/2006/main">
+              <a:graphicData uri="http://schemas.openxmlformats.org/drawingml/2006/picture">
+                <pic:pic xmlns:pic="http://schemas.openxmlformats.org/drawingml/2006/picture">
+                  <pic:nvPicPr>
+                    <pic:cNvPr id="7" name="Imagen8"/>
+                    <pic:cNvPicPr>
+                      <a:picLocks noChangeAspect="1" noChangeArrowheads="1"/>
+                    </pic:cNvPicPr>
+                  </pic:nvPicPr>
+                  <pic:blipFill>
+                    <a:blip r:embed="rId9"/>
+                    <a:stretch>
+                      <a:fillRect/>
+                    </a:stretch>
+                  </pic:blipFill>
+                  <pic:spPr bwMode="auto">
+                    <a:xfrm>
+                      <a:off x="0" y="0"/>
+                      <a:ext cx="6001385" cy="2767965"/>
+                    </a:xfrm>
+                    <a:prstGeom prst="rect">
+                      <a:avLst/>
+                    </a:prstGeom>
+                    <a:noFill/>
+                  </pic:spPr>
+                </pic:pic>
+              </a:graphicData>
+            </a:graphic>
+          </wp:anchor>
+        </w:drawing>
+      </w:r>
+    </w:p>
+    <w:p>
+      <w:pPr>
+        <w:pStyle w:val="APALevel2"/>
+        <w:widowControl/>
+        <w:suppressAutoHyphens w:val="true"/>
+        <w:bidi w:val="0"/>
+        <w:spacing w:lineRule="auto" w:line="240" w:before="360" w:after="240"/>
+        <w:jc w:val="left"/>
+        <w:rPr>
           <w:rFonts w:ascii="Times New Roman" w:hAnsi="Times New Roman" w:eastAsia="Times New Roman" w:cs="Times New Roman"/>
           <w:color w:val="auto"/>
           <w:kern w:val="0"/>
           <w:sz w:val="24"/>
+          <w:szCs w:val="32"/>
+          <w:u w:val="none"/>
+          <w:lang w:val="es-EC" w:eastAsia="en-US" w:bidi="ar-SA"/>
+        </w:rPr>
+      </w:pPr>
+      <w:hyperlink r:id="rId10">
+        <w:r>
+          <w:rPr>
+            <w:rStyle w:val="Hyperlink"/>
+            <w:szCs w:val="32"/>
+            <w:lang w:val="es-EC"/>
+          </w:rPr>
+          <w:t>Diagrama de flujo de sitio web: Lucidspark</w:t>
+        </w:r>
+      </w:hyperlink>
+      <w:r>
+        <w:rPr>
+          <w:szCs w:val="32"/>
+          <w:lang w:val="es-EC"/>
+        </w:rPr>
+        <w:t xml:space="preserve"> </w:t>
+      </w:r>
+    </w:p>
+    <w:p>
+      <w:pPr>
+        <w:pStyle w:val="APALevel2"/>
+        <w:widowControl/>
+        <w:suppressAutoHyphens w:val="true"/>
+        <w:bidi w:val="0"/>
+        <w:spacing w:lineRule="auto" w:line="240" w:before="189" w:after="69"/>
+        <w:jc w:val="both"/>
+        <w:rPr>
+          <w:rFonts w:ascii="Times New Roman" w:hAnsi="Times New Roman" w:eastAsia="Times New Roman" w:cs="Times New Roman"/>
+          <w:i w:val="false"/>
+          <w:iCs w:val="false"/>
+          <w:color w:val="auto"/>
+          <w:kern w:val="0"/>
+          <w:sz w:val="24"/>
           <w:szCs w:val="24"/>
           <w:u w:val="none"/>
           <w:lang w:val="es-CO" w:eastAsia="en-US" w:bidi="ar-SA"/>
         </w:rPr>
       </w:pPr>
       <w:r>
-        <w:rPr/>
+        <w:rPr>
+          <w:rFonts w:eastAsia="Times New Roman" w:cs="Times New Roman"/>
+          <w:i w:val="false"/>
+          <w:iCs w:val="false"/>
+          <w:color w:val="auto"/>
+          <w:kern w:val="0"/>
+          <w:sz w:val="24"/>
+          <w:szCs w:val="24"/>
+          <w:u w:val="none"/>
+          <w:lang w:val="es-CO" w:eastAsia="en-US" w:bidi="ar-SA"/>
+        </w:rPr>
+      </w:r>
+    </w:p>
+    <w:p>
+      <w:pPr>
+        <w:pStyle w:val="APALevel2"/>
+        <w:widowControl/>
+        <w:suppressAutoHyphens w:val="true"/>
+        <w:bidi w:val="0"/>
+        <w:spacing w:lineRule="auto" w:line="240" w:before="189" w:after="69"/>
+        <w:jc w:val="both"/>
+        <w:rPr>
+          <w:rFonts w:ascii="Times New Roman" w:hAnsi="Times New Roman" w:eastAsia="Times New Roman" w:cs="Times New Roman"/>
+          <w:i w:val="false"/>
+          <w:iCs w:val="false"/>
+          <w:color w:val="auto"/>
+          <w:kern w:val="0"/>
+          <w:sz w:val="24"/>
+          <w:szCs w:val="24"/>
+          <w:u w:val="none"/>
+          <w:lang w:val="es-CO" w:eastAsia="en-US" w:bidi="ar-SA"/>
+        </w:rPr>
+      </w:pPr>
+      <w:r>
+        <w:rPr>
+          <w:rFonts w:eastAsia="Times New Roman" w:cs="Times New Roman"/>
+          <w:b/>
+          <w:bCs/>
+          <w:i w:val="false"/>
+          <w:iCs w:val="false"/>
+          <w:color w:val="auto"/>
+          <w:kern w:val="0"/>
+          <w:sz w:val="24"/>
+          <w:szCs w:val="24"/>
+          <w:u w:val="none"/>
+          <w:lang w:val="es-CO" w:eastAsia="en-US" w:bidi="ar-SA"/>
+        </w:rPr>
+        <w:t>8</w:t>
+      </w:r>
+      <w:r>
+        <w:rPr>
+          <w:rFonts w:eastAsia="Times New Roman" w:cs="Times New Roman"/>
+          <w:b/>
+          <w:bCs/>
+          <w:i w:val="false"/>
+          <w:iCs w:val="false"/>
+          <w:color w:val="auto"/>
+          <w:kern w:val="0"/>
+          <w:sz w:val="24"/>
+          <w:szCs w:val="24"/>
+          <w:u w:val="none"/>
+          <w:lang w:val="es-CO" w:eastAsia="en-US" w:bidi="ar-SA"/>
+        </w:rPr>
+        <w:t>.</w:t>
+      </w:r>
+      <w:r>
+        <w:rPr>
+          <w:rFonts w:eastAsia="Times New Roman" w:cs="Times New Roman"/>
+          <w:b/>
+          <w:bCs/>
+          <w:i w:val="false"/>
+          <w:iCs w:val="false"/>
+          <w:color w:val="auto"/>
+          <w:kern w:val="0"/>
+          <w:sz w:val="24"/>
+          <w:szCs w:val="24"/>
+          <w:u w:val="none"/>
+          <w:lang w:val="es-CO" w:eastAsia="en-US" w:bidi="ar-SA"/>
+        </w:rPr>
+        <w:t>2</w:t>
+      </w:r>
+      <w:r>
+        <w:rPr>
+          <w:rFonts w:eastAsia="Times New Roman" w:cs="Times New Roman"/>
+          <w:i w:val="false"/>
+          <w:iCs w:val="false"/>
+          <w:color w:val="auto"/>
+          <w:kern w:val="0"/>
+          <w:sz w:val="24"/>
+          <w:szCs w:val="24"/>
+          <w:u w:val="none"/>
+          <w:lang w:val="es-CO" w:eastAsia="en-US" w:bidi="ar-SA"/>
+        </w:rPr>
+        <w:t xml:space="preserve"> </w:t>
+      </w:r>
+      <w:r>
+        <w:rPr>
+          <w:rFonts w:eastAsia="Times New Roman" w:cs="Times New Roman"/>
+          <w:b/>
+          <w:bCs/>
+          <w:i w:val="false"/>
+          <w:iCs w:val="false"/>
+          <w:color w:val="auto"/>
+          <w:kern w:val="0"/>
+          <w:sz w:val="24"/>
+          <w:szCs w:val="24"/>
+          <w:u w:val="none"/>
+          <w:lang w:val="es-CO" w:eastAsia="en-US" w:bidi="ar-SA"/>
+        </w:rPr>
+        <w:t>Diagrama de flujo del sistema</w:t>
+      </w:r>
+    </w:p>
+    <w:p>
+      <w:pPr>
+        <w:pStyle w:val="APALevel2"/>
+        <w:widowControl/>
+        <w:suppressAutoHyphens w:val="true"/>
+        <w:bidi w:val="0"/>
+        <w:spacing w:lineRule="auto" w:line="240"/>
+        <w:jc w:val="both"/>
+        <w:rPr>
+          <w:rFonts w:ascii="Times New Roman" w:hAnsi="Times New Roman" w:eastAsia="Times New Roman" w:cs="Times New Roman"/>
+          <w:b w:val="false"/>
+          <w:bCs w:val="false"/>
+          <w:i w:val="false"/>
+          <w:iCs w:val="false"/>
+          <w:color w:val="auto"/>
+          <w:kern w:val="0"/>
+          <w:sz w:val="24"/>
+          <w:szCs w:val="24"/>
+          <w:u w:val="none"/>
+          <w:lang w:val="es-CO" w:eastAsia="en-US" w:bidi="ar-SA"/>
+        </w:rPr>
+      </w:pPr>
+      <w:r>
+        <w:rPr>
+          <w:rFonts w:eastAsia="Times New Roman" w:cs="Times New Roman"/>
+          <w:b w:val="false"/>
+          <w:bCs w:val="false"/>
+          <w:i w:val="false"/>
+          <w:iCs w:val="false"/>
+          <w:color w:val="auto"/>
+          <w:kern w:val="0"/>
+          <w:sz w:val="24"/>
+          <w:szCs w:val="24"/>
+          <w:u w:val="none"/>
+          <w:lang w:val="es-CO" w:eastAsia="en-US" w:bidi="ar-SA"/>
+        </w:rPr>
+        <w:t xml:space="preserve">Este diagrama representa el </w:t>
+      </w:r>
+      <w:r>
+        <w:rPr>
+          <w:rFonts w:eastAsia="Times New Roman" w:cs="Times New Roman"/>
+          <w:b w:val="false"/>
+          <w:bCs w:val="false"/>
+          <w:i w:val="false"/>
+          <w:iCs w:val="false"/>
+          <w:color w:val="auto"/>
+          <w:kern w:val="0"/>
+          <w:sz w:val="24"/>
+          <w:szCs w:val="24"/>
+          <w:u w:val="none"/>
+          <w:lang w:val="es-CO" w:eastAsia="en-US" w:bidi="ar-SA"/>
+        </w:rPr>
+        <w:t>funcionamiento</w:t>
+      </w:r>
+      <w:r>
+        <w:rPr>
+          <w:rFonts w:eastAsia="Times New Roman" w:cs="Times New Roman"/>
+          <w:b w:val="false"/>
+          <w:bCs w:val="false"/>
+          <w:i w:val="false"/>
+          <w:iCs w:val="false"/>
+          <w:color w:val="auto"/>
+          <w:kern w:val="0"/>
+          <w:sz w:val="24"/>
+          <w:szCs w:val="24"/>
+          <w:u w:val="none"/>
+          <w:lang w:val="es-CO" w:eastAsia="en-US" w:bidi="ar-SA"/>
+        </w:rPr>
+        <w:t xml:space="preserve"> </w:t>
+      </w:r>
+      <w:r>
+        <w:rPr>
+          <w:rFonts w:eastAsia="Times New Roman" w:cs="Times New Roman"/>
+          <w:b w:val="false"/>
+          <w:bCs w:val="false"/>
+          <w:i w:val="false"/>
+          <w:iCs w:val="false"/>
+          <w:color w:val="auto"/>
+          <w:kern w:val="0"/>
+          <w:sz w:val="24"/>
+          <w:szCs w:val="24"/>
+          <w:u w:val="none"/>
+          <w:lang w:val="es-CO" w:eastAsia="en-US" w:bidi="ar-SA"/>
+        </w:rPr>
+        <w:t>del sistema.</w:t>
+      </w:r>
+      <w:r>
+        <w:rPr>
+          <w:rFonts w:eastAsia="Times New Roman" w:cs="Times New Roman"/>
+          <w:b w:val="false"/>
+          <w:bCs w:val="false"/>
+          <w:i w:val="false"/>
+          <w:iCs w:val="false"/>
+          <w:color w:val="auto"/>
+          <w:kern w:val="0"/>
+          <w:sz w:val="24"/>
+          <w:szCs w:val="24"/>
+          <w:u w:val="none"/>
+          <w:lang w:val="es-CO" w:eastAsia="en-US" w:bidi="ar-SA"/>
+        </w:rPr>
+        <w:t xml:space="preserve"> </w:t>
+      </w:r>
+      <w:r>
+        <w:rPr>
+          <w:rFonts w:eastAsia="Times New Roman" w:cs="Times New Roman"/>
+          <w:b w:val="false"/>
+          <w:bCs w:val="false"/>
+          <w:i w:val="false"/>
+          <w:iCs w:val="false"/>
+          <w:color w:val="auto"/>
+          <w:kern w:val="0"/>
+          <w:sz w:val="24"/>
+          <w:szCs w:val="24"/>
+          <w:u w:val="none"/>
+          <w:lang w:val="es-CO" w:eastAsia="en-US" w:bidi="ar-SA"/>
+        </w:rPr>
+        <w:t>Incluyendo los procesos y decisiones que se ejecutan durante la interacción del usuario con la plataforma.</w:t>
+      </w:r>
+    </w:p>
+    <w:p>
+      <w:pPr>
+        <w:pStyle w:val="APALevel2"/>
+        <w:widowControl/>
+        <w:suppressAutoHyphens w:val="true"/>
+        <w:bidi w:val="0"/>
+        <w:spacing w:lineRule="auto" w:line="240"/>
+        <w:jc w:val="both"/>
+        <w:rPr>
+          <w:rFonts w:ascii="Times New Roman" w:hAnsi="Times New Roman" w:eastAsia="Times New Roman" w:cs="Times New Roman"/>
+          <w:b w:val="false"/>
+          <w:bCs w:val="false"/>
+          <w:i w:val="false"/>
+          <w:iCs w:val="false"/>
+          <w:color w:val="auto"/>
+          <w:kern w:val="0"/>
+          <w:sz w:val="24"/>
+          <w:szCs w:val="24"/>
+          <w:u w:val="none"/>
+          <w:lang w:val="es-CO" w:eastAsia="en-US" w:bidi="ar-SA"/>
+        </w:rPr>
+      </w:pPr>
+      <w:r>
+        <w:rPr>
+          <w:rFonts w:eastAsia="Times New Roman" w:cs="Times New Roman"/>
+          <w:b w:val="false"/>
+          <w:bCs w:val="false"/>
+          <w:i w:val="false"/>
+          <w:iCs w:val="false"/>
+          <w:color w:val="auto"/>
+          <w:kern w:val="0"/>
+          <w:sz w:val="24"/>
+          <w:szCs w:val="24"/>
+          <w:u w:val="none"/>
+          <w:lang w:val="es-CO" w:eastAsia="en-US" w:bidi="ar-SA"/>
+        </w:rPr>
+      </w:r>
+    </w:p>
+    <w:p>
+      <w:pPr>
+        <w:pStyle w:val="APALevel2"/>
+        <w:widowControl/>
+        <w:suppressAutoHyphens w:val="true"/>
+        <w:bidi w:val="0"/>
+        <w:spacing w:lineRule="auto" w:line="240"/>
+        <w:jc w:val="both"/>
+        <w:rPr>
+          <w:rFonts w:ascii="Times New Roman" w:hAnsi="Times New Roman" w:eastAsia="Times New Roman" w:cs="Times New Roman"/>
+          <w:b w:val="false"/>
+          <w:bCs w:val="false"/>
+          <w:i w:val="false"/>
+          <w:iCs w:val="false"/>
+          <w:color w:val="auto"/>
+          <w:kern w:val="0"/>
+          <w:sz w:val="24"/>
+          <w:szCs w:val="24"/>
+          <w:u w:val="none"/>
+          <w:lang w:val="es-CO" w:eastAsia="en-US" w:bidi="ar-SA"/>
+        </w:rPr>
+      </w:pPr>
+      <w:r>
+        <w:rPr>
+          <w:rFonts w:eastAsia="Times New Roman" w:cs="Times New Roman"/>
+          <w:b w:val="false"/>
+          <w:bCs w:val="false"/>
+          <w:i w:val="false"/>
+          <w:iCs w:val="false"/>
+          <w:color w:val="auto"/>
+          <w:kern w:val="0"/>
+          <w:sz w:val="24"/>
+          <w:szCs w:val="24"/>
+          <w:u w:val="none"/>
+          <w:lang w:val="es-CO" w:eastAsia="en-US" w:bidi="ar-SA"/>
+        </w:rPr>
+        <w:drawing>
+          <wp:anchor distT="0" distB="0" distL="0" distR="0" simplePos="0" relativeHeight="32" behindDoc="0" locked="0" layoutInCell="0" allowOverlap="1">
+            <wp:simplePos x="0" y="0"/>
+            <wp:positionH relativeFrom="column">
+              <wp:posOffset>0</wp:posOffset>
+            </wp:positionH>
+            <wp:positionV relativeFrom="paragraph">
+              <wp:posOffset>111125</wp:posOffset>
+            </wp:positionV>
+            <wp:extent cx="5993765" cy="3633470"/>
+            <wp:effectExtent l="0" t="0" r="0" b="0"/>
+            <wp:wrapSquare wrapText="largest"/>
+            <wp:docPr id="8" name="Imagen5"/>
+            <wp:cNvGraphicFramePr>
+              <a:graphicFrameLocks xmlns:a="http://schemas.openxmlformats.org/drawingml/2006/main" noChangeAspect="1"/>
+            </wp:cNvGraphicFramePr>
+            <a:graphic xmlns:a="http://schemas.openxmlformats.org/drawingml/2006/main">
+              <a:graphicData uri="http://schemas.openxmlformats.org/drawingml/2006/picture">
+                <pic:pic xmlns:pic="http://schemas.openxmlformats.org/drawingml/2006/picture">
+                  <pic:nvPicPr>
+                    <pic:cNvPr id="8" name="Imagen5"/>
+                    <pic:cNvPicPr>
+                      <a:picLocks noChangeAspect="1" noChangeArrowheads="1"/>
+                    </pic:cNvPicPr>
+                  </pic:nvPicPr>
+                  <pic:blipFill>
+                    <a:blip r:embed="rId11"/>
+                    <a:stretch>
+                      <a:fillRect/>
+                    </a:stretch>
+                  </pic:blipFill>
+                  <pic:spPr bwMode="auto">
+                    <a:xfrm>
+                      <a:off x="0" y="0"/>
+                      <a:ext cx="5993765" cy="3633470"/>
+                    </a:xfrm>
+                    <a:prstGeom prst="rect">
+                      <a:avLst/>
+                    </a:prstGeom>
+                    <a:noFill/>
+                  </pic:spPr>
+                </pic:pic>
+              </a:graphicData>
+            </a:graphic>
+          </wp:anchor>
+        </w:drawing>
       </w:r>
     </w:p>
     <w:p>
@@ -6442,6 +6669,45 @@
           <w:sz w:val="24"/>
           <w:szCs w:val="24"/>
           <w:u w:val="none"/>
+          <w:lang w:val="es-EC" w:eastAsia="en-US" w:bidi="ar-SA"/>
+        </w:rPr>
+      </w:pPr>
+      <w:hyperlink r:id="rId12">
+        <w:r>
+          <w:rPr>
+            <w:rStyle w:val="Hyperlink"/>
+            <w:color w:val="auto"/>
+            <w:u w:val="none"/>
+            <w:lang w:val="es-EC"/>
+          </w:rPr>
+          <w:t>Diagrama de flujo de la solución web: Lucidchart</w:t>
+        </w:r>
+      </w:hyperlink>
+      <w:r>
+        <w:rPr>
+          <w:rStyle w:val="Hyperlink"/>
+          <w:color w:val="auto"/>
+          <w:u w:val="none"/>
+          <w:lang w:val="es-EC"/>
+        </w:rPr>
+        <w:t xml:space="preserve"> </w:t>
+      </w:r>
+    </w:p>
+    <w:p>
+      <w:pPr>
+        <w:pStyle w:val="APALevel2"/>
+        <w:widowControl/>
+        <w:suppressAutoHyphens w:val="true"/>
+        <w:bidi w:val="0"/>
+        <w:spacing w:lineRule="auto" w:line="240" w:before="360" w:after="240"/>
+        <w:jc w:val="both"/>
+        <w:rPr>
+          <w:rFonts w:ascii="Times New Roman" w:hAnsi="Times New Roman" w:eastAsia="Times New Roman" w:cs="Times New Roman"/>
+          <w:color w:val="auto"/>
+          <w:kern w:val="0"/>
+          <w:sz w:val="24"/>
+          <w:szCs w:val="24"/>
+          <w:u w:val="none"/>
           <w:lang w:val="es-CO" w:eastAsia="en-US" w:bidi="ar-SA"/>
         </w:rPr>
       </w:pPr>
@@ -6472,7 +6738,15 @@
           <w:bCs/>
           <w:lang w:val="es-CO" w:bidi="ar-SA"/>
         </w:rPr>
-        <w:t>8. Conclusiones</w:t>
+        <w:t>11</w:t>
+      </w:r>
+      <w:r>
+        <w:rPr>
+          <w:b/>
+          <w:bCs/>
+          <w:lang w:val="es-CO" w:bidi="ar-SA"/>
+        </w:rPr>
+        <w:t>. Conclusiones</w:t>
       </w:r>
     </w:p>
     <w:p>
@@ -6685,12 +6959,12 @@
       </w:r>
     </w:p>
     <w:sectPr>
-      <w:headerReference w:type="even" r:id="rId9"/>
-      <w:headerReference w:type="default" r:id="rId10"/>
-      <w:headerReference w:type="first" r:id="rId11"/>
-      <w:footerReference w:type="even" r:id="rId12"/>
-      <w:footerReference w:type="default" r:id="rId13"/>
-      <w:footerReference w:type="first" r:id="rId14"/>
+      <w:headerReference w:type="even" r:id="rId13"/>
+      <w:headerReference w:type="default" r:id="rId14"/>
+      <w:headerReference w:type="first" r:id="rId15"/>
+      <w:footerReference w:type="even" r:id="rId16"/>
+      <w:footerReference w:type="default" r:id="rId17"/>
+      <w:footerReference w:type="first" r:id="rId18"/>
       <w:type w:val="nextPage"/>
       <w:pgSz w:w="11906" w:h="16838"/>
       <w:pgMar w:left="1440" w:right="1440" w:gutter="0" w:header="720" w:top="1440" w:footer="1440" w:bottom="1497"/>
@@ -6771,7 +7045,7 @@
               <wp:extent cx="14605" cy="14605"/>
               <wp:effectExtent l="0" t="0" r="0" b="0"/>
               <wp:wrapSquare wrapText="bothSides"/>
-              <wp:docPr id="7" name="Marco2"/>
+              <wp:docPr id="9" name="Marco2"/>
               <a:graphic xmlns:a="http://schemas.openxmlformats.org/drawingml/2006/main">
                 <a:graphicData uri="http://schemas.microsoft.com/office/word/2010/wordprocessingShape">
                   <wps:wsp>
@@ -6930,7 +7204,7 @@
       <mc:AlternateContent>
         <mc:Choice Requires="wps">
           <w:drawing>
-            <wp:anchor distT="0" distB="0" distL="0" distR="0" simplePos="0" relativeHeight="19" behindDoc="1" locked="0" layoutInCell="0" allowOverlap="1">
+            <wp:anchor distT="0" distB="0" distL="0" distR="0" simplePos="0" relativeHeight="23" behindDoc="1" locked="0" layoutInCell="0" allowOverlap="1">
               <wp:simplePos x="0" y="0"/>
               <wp:positionH relativeFrom="margin">
                 <wp:align>right</wp:align>
@@ -6938,10 +7212,10 @@
               <wp:positionV relativeFrom="paragraph">
                 <wp:posOffset>635</wp:posOffset>
               </wp:positionV>
-              <wp:extent cx="76835" cy="175260"/>
+              <wp:extent cx="76835" cy="349250"/>
               <wp:effectExtent l="0" t="0" r="0" b="0"/>
               <wp:wrapSquare wrapText="bothSides"/>
-              <wp:docPr id="8" name="Marco3"/>
+              <wp:docPr id="10" name="Marco3"/>
               <a:graphic xmlns:a="http://schemas.openxmlformats.org/drawingml/2006/main">
                 <a:graphicData uri="http://schemas.microsoft.com/office/word/2010/wordprocessingShape">
                   <wps:wsp>
@@ -6949,7 +7223,7 @@
                     <wps:spPr>
                       <a:xfrm>
                         <a:off x="0" y="0"/>
-                        <a:ext cx="76680" cy="175320"/>
+                        <a:ext cx="76680" cy="349200"/>
                       </a:xfrm>
                       <a:prstGeom prst="rect">
                         <a:avLst/>
@@ -7000,7 +7274,7 @@
                               <w:rStyle w:val="PageNumber"/>
                               <w:color w:val="000000"/>
                             </w:rPr>
-                            <w:t>10</w:t>
+                            <w:t>12</w:t>
                           </w:r>
                           <w:r>
                             <w:rPr>
@@ -7023,7 +7297,7 @@
         </mc:Choice>
         <mc:Fallback>
           <w:pict>
-            <v:rect id="shape_0" stroked="f" o:allowincell="f" style="position:absolute;margin-left:445.2pt;margin-top:0.05pt;width:6pt;height:13.75pt;mso-wrap-style:square;v-text-anchor:top;mso-position-horizontal:right;mso-position-horizontal-relative:margin">
+            <v:rect id="shape_0" stroked="f" o:allowincell="f" style="position:absolute;margin-left:445.2pt;margin-top:0.05pt;width:6pt;height:27.45pt;mso-wrap-style:square;v-text-anchor:top;mso-position-horizontal:right;mso-position-horizontal-relative:margin">
               <v:fill o:detectmouseclick="t" on="false"/>
               <v:stroke color="#3465a4" joinstyle="round" endcap="flat"/>
               <v:textbox>
@@ -7061,7 +7335,7 @@
                         <w:rStyle w:val="PageNumber"/>
                         <w:color w:val="000000"/>
                       </w:rPr>
-                      <w:t>10</w:t>
+                      <w:t>12</w:t>
                     </w:r>
                     <w:r>
                       <w:rPr>
@@ -9255,8 +9529,8 @@
       <w:u w:val="single"/>
     </w:rPr>
   </w:style>
-  <w:style w:type="character" w:styleId="Caracteresdenotaalpieuser">
-    <w:name w:val="Caracteres de nota al pie (user)"/>
+  <w:style w:type="character" w:styleId="Caracteresdenotaalpie">
+    <w:name w:val="Caracteres de nota al pie"/>
     <w:semiHidden/>
     <w:qFormat/>
     <w:rsid w:val="004d41be"/>
@@ -9264,8 +9538,8 @@
       <w:vertAlign w:val="superscript"/>
     </w:rPr>
   </w:style>
-  <w:style w:type="character" w:styleId="Caracteresdenotaalpie">
-    <w:name w:val="Caracteres de nota al pie"/>
+  <w:style w:type="character" w:styleId="Caracteresdenotaalpieuser">
+    <w:name w:val="Caracteres de nota al pie (user)"/>
     <w:qFormat/>
     <w:rPr>
       <w:vertAlign w:val="superscript"/>
@@ -9419,13 +9693,13 @@
       <w:shd w:fill="E1DFDD" w:val="clear"/>
     </w:rPr>
   </w:style>
-  <w:style w:type="character" w:styleId="Enlacedelndiceuser">
-    <w:name w:val="Enlace del índice (user)"/>
+  <w:style w:type="character" w:styleId="Enlacedelndice">
+    <w:name w:val="Enlace del índice"/>
     <w:qFormat/>
     <w:rPr/>
   </w:style>
-  <w:style w:type="character" w:styleId="Bolosuser">
-    <w:name w:val="Bolos (user)"/>
+  <w:style w:type="character" w:styleId="Bolos">
+    <w:name w:val="Bolos"/>
     <w:qFormat/>
     <w:rPr>
       <w:rFonts w:ascii="OpenSymbol" w:hAnsi="OpenSymbol" w:eastAsia="OpenSymbol" w:cs="OpenSymbol"/>
@@ -9439,25 +9713,25 @@
       <w:iCs/>
     </w:rPr>
   </w:style>
-  <w:style w:type="character" w:styleId="Textooriginaluser">
-    <w:name w:val="Texto original (user)"/>
+  <w:style w:type="character" w:styleId="Textooriginal">
+    <w:name w:val="Texto original"/>
     <w:qFormat/>
     <w:rPr>
       <w:rFonts w:ascii="Liberation Mono" w:hAnsi="Liberation Mono" w:eastAsia="Liberation Mono" w:cs="Liberation Mono"/>
     </w:rPr>
   </w:style>
-  <w:style w:type="character" w:styleId="Smbolosdenumeracinuser">
-    <w:name w:val="Símbolos de numeración (user)"/>
+  <w:style w:type="character" w:styleId="Smbolosdenumeracin">
+    <w:name w:val="Símbolos de numeración"/>
     <w:qFormat/>
     <w:rPr/>
   </w:style>
-  <w:style w:type="character" w:styleId="Enlacedelndice">
-    <w:name w:val="Enlace del índice"/>
+  <w:style w:type="character" w:styleId="Enlacedelndiceuser">
+    <w:name w:val="Enlace del índice (user)"/>
     <w:qFormat/>
     <w:rPr/>
   </w:style>
-  <w:style w:type="character" w:styleId="Bolos">
-    <w:name w:val="Bolos"/>
+  <w:style w:type="character" w:styleId="Bolosuser">
+    <w:name w:val="Bolos (user)"/>
     <w:qFormat/>
     <w:rPr>
       <w:rFonts w:ascii="OpenSymbol" w:hAnsi="OpenSymbol" w:eastAsia="OpenSymbol" w:cs="OpenSymbol"/>
@@ -9637,7 +9911,7 @@
       <w:widowControl/>
       <w:suppressAutoHyphens w:val="true"/>
       <w:bidi w:val="0"/>
-      <w:spacing w:lineRule="auto" w:line="240" w:before="132" w:after="12"/>
+      <w:spacing w:lineRule="auto" w:line="240" w:before="75" w:after="0"/>
       <w:jc w:val="left"/>
     </w:pPr>
     <w:rPr>
@@ -9770,15 +10044,15 @@
       <w:lang w:val="es-ES_tradnl" w:eastAsia="es-ES_tradnl" w:bidi="ar-SA"/>
     </w:rPr>
   </w:style>
-  <w:style w:type="paragraph" w:styleId="Cabeceraypieuser">
-    <w:name w:val="Cabecera y pie (user)"/>
+  <w:style w:type="paragraph" w:styleId="Cabeceraypie">
+    <w:name w:val="Cabecera y pie"/>
     <w:basedOn w:val="Normal"/>
     <w:qFormat/>
     <w:pPr/>
     <w:rPr/>
   </w:style>
-  <w:style w:type="paragraph" w:styleId="Cabeceraypie">
-    <w:name w:val="Cabecera y pie"/>
+  <w:style w:type="paragraph" w:styleId="Cabeceraypieuser">
+    <w:name w:val="Cabecera y pie (user)"/>
     <w:basedOn w:val="Normal"/>
     <w:qFormat/>
     <w:pPr/>
@@ -10348,7 +10622,7 @@
   </w:style>
   <w:style w:type="paragraph" w:styleId="IndexHeading">
     <w:name w:val="index heading"/>
-    <w:basedOn w:val="Ttulouser"/>
+    <w:basedOn w:val="Ttulo"/>
     <w:pPr/>
     <w:rPr/>
   </w:style>
@@ -10374,15 +10648,15 @@
       <w:szCs w:val="28"/>
     </w:rPr>
   </w:style>
-  <w:style w:type="paragraph" w:styleId="Contenidodelmarcouser">
-    <w:name w:val="Contenido del marco (user)"/>
+  <w:style w:type="paragraph" w:styleId="Contenidodelmarco">
+    <w:name w:val="Contenido del marco"/>
     <w:basedOn w:val="Normal"/>
     <w:qFormat/>
     <w:pPr/>
     <w:rPr/>
   </w:style>
-  <w:style w:type="paragraph" w:styleId="Contenidodelmarco">
-    <w:name w:val="Contenido del marco"/>
+  <w:style w:type="paragraph" w:styleId="Contenidodelmarcouser">
+    <w:name w:val="Contenido del marco (user)"/>
     <w:basedOn w:val="Normal"/>
     <w:qFormat/>
     <w:pPr/>
@@ -10406,8 +10680,8 @@
       <w:lang w:val="es-CO"/>
     </w:rPr>
   </w:style>
-  <w:style w:type="numbering" w:styleId="Ningunalista" w:default="1">
-    <w:name w:val="Ninguna lista"/>
+  <w:style w:type="numbering" w:styleId="Ningunalistauser" w:default="1">
+    <w:name w:val="Ninguna lista (user)"/>
     <w:uiPriority w:val="99"/>
     <w:semiHidden/>
     <w:unhideWhenUsed/>

</xml_diff>

<commit_message>
cambios en el archivo punto 10
</commit_message>
<xml_diff>
--- a/Actividad 2 - Documento de formulación del proyecto.docx
+++ b/Actividad 2 - Documento de formulación del proyecto.docx
@@ -2979,10 +2979,7 @@
         <w:pStyle w:val="APALevel2"/>
       </w:pPr>
       <w:r>
-        <w:t>5</w:t>
-      </w:r>
-      <w:r>
-        <w:t xml:space="preserve">.2 </w:t>
+        <w:t xml:space="preserve">5.2 </w:t>
       </w:r>
       <w:proofErr w:type="spellStart"/>
       <w:r>
@@ -4153,6 +4150,94 @@
           <w:lang w:val="es-CO"/>
         </w:rPr>
       </w:pPr>
+      <w:r>
+        <w:rPr>
+          <w:lang w:val="es-CO"/>
+        </w:rPr>
+        <w:t xml:space="preserve">Diagrama de secuencia </w:t>
+      </w:r>
+    </w:p>
+    <w:p>
+      <w:pPr>
+        <w:pStyle w:val="Textoindependiente"/>
+        <w:jc w:val="both"/>
+        <w:rPr>
+          <w:lang w:val="es-CO"/>
+        </w:rPr>
+      </w:pPr>
+    </w:p>
+    <w:p>
+      <w:pPr>
+        <w:pStyle w:val="Textoindependiente"/>
+        <w:jc w:val="both"/>
+        <w:rPr>
+          <w:lang w:val="es-CO"/>
+        </w:rPr>
+      </w:pPr>
+    </w:p>
+    <w:p>
+      <w:pPr>
+        <w:pStyle w:val="Textoindependiente"/>
+        <w:spacing w:after="0"/>
+        <w:jc w:val="both"/>
+        <w:rPr>
+          <w:lang w:val="es-CO"/>
+        </w:rPr>
+      </w:pPr>
+      <w:r>
+        <w:rPr>
+          <w:lang w:val="es-CO"/>
+        </w:rPr>
+        <w:lastRenderedPageBreak/>
+        <w:drawing>
+          <wp:inline distT="0" distB="0" distL="0" distR="0" wp14:anchorId="3DAEE419" wp14:editId="08EEF2A7">
+            <wp:extent cx="5731510" cy="8104505"/>
+            <wp:effectExtent l="0" t="0" r="0" b="0"/>
+            <wp:docPr id="1347111597" name="Imagen 3"/>
+            <wp:cNvGraphicFramePr>
+              <a:graphicFrameLocks xmlns:a="http://schemas.openxmlformats.org/drawingml/2006/main" noChangeAspect="1"/>
+            </wp:cNvGraphicFramePr>
+            <a:graphic xmlns:a="http://schemas.openxmlformats.org/drawingml/2006/main">
+              <a:graphicData uri="http://schemas.openxmlformats.org/drawingml/2006/picture">
+                <pic:pic xmlns:pic="http://schemas.openxmlformats.org/drawingml/2006/picture">
+                  <pic:nvPicPr>
+                    <pic:cNvPr id="0" name="Picture 8"/>
+                    <pic:cNvPicPr>
+                      <a:picLocks noChangeAspect="1" noChangeArrowheads="1"/>
+                    </pic:cNvPicPr>
+                  </pic:nvPicPr>
+                  <pic:blipFill>
+                    <a:blip r:embed="rId17" cstate="print">
+                      <a:extLst>
+                        <a:ext uri="{28A0092B-C50C-407E-A947-70E740481C1C}">
+                          <a14:useLocalDpi xmlns:a14="http://schemas.microsoft.com/office/drawing/2010/main" val="0"/>
+                        </a:ext>
+                      </a:extLst>
+                    </a:blip>
+                    <a:srcRect/>
+                    <a:stretch>
+                      <a:fillRect/>
+                    </a:stretch>
+                  </pic:blipFill>
+                  <pic:spPr bwMode="auto">
+                    <a:xfrm>
+                      <a:off x="0" y="0"/>
+                      <a:ext cx="5731510" cy="8104505"/>
+                    </a:xfrm>
+                    <a:prstGeom prst="rect">
+                      <a:avLst/>
+                    </a:prstGeom>
+                    <a:noFill/>
+                    <a:ln>
+                      <a:noFill/>
+                    </a:ln>
+                  </pic:spPr>
+                </pic:pic>
+              </a:graphicData>
+            </a:graphic>
+          </wp:inline>
+        </w:drawing>
+      </w:r>
     </w:p>
     <w:p>
       <w:pPr>
@@ -4173,14 +4258,546 @@
           <w:lang w:val="es-CO"/>
         </w:rPr>
       </w:pPr>
+      <w:r>
+        <w:rPr>
+          <w:noProof/>
+        </w:rPr>
+        <w:lastRenderedPageBreak/>
+        <w:drawing>
+          <wp:inline distT="0" distB="0" distL="0" distR="0" wp14:anchorId="346C069F" wp14:editId="2F7847D0">
+            <wp:extent cx="5731510" cy="4516755"/>
+            <wp:effectExtent l="0" t="0" r="0" b="0"/>
+            <wp:docPr id="1777836868" name="Imagen 1"/>
+            <wp:cNvGraphicFramePr>
+              <a:graphicFrameLocks xmlns:a="http://schemas.openxmlformats.org/drawingml/2006/main" noChangeAspect="1"/>
+            </wp:cNvGraphicFramePr>
+            <a:graphic xmlns:a="http://schemas.openxmlformats.org/drawingml/2006/main">
+              <a:graphicData uri="http://schemas.openxmlformats.org/drawingml/2006/picture">
+                <pic:pic xmlns:pic="http://schemas.openxmlformats.org/drawingml/2006/picture">
+                  <pic:nvPicPr>
+                    <pic:cNvPr id="1777836868" name=""/>
+                    <pic:cNvPicPr/>
+                  </pic:nvPicPr>
+                  <pic:blipFill>
+                    <a:blip r:embed="rId18"/>
+                    <a:stretch>
+                      <a:fillRect/>
+                    </a:stretch>
+                  </pic:blipFill>
+                  <pic:spPr>
+                    <a:xfrm>
+                      <a:off x="0" y="0"/>
+                      <a:ext cx="5731510" cy="4516755"/>
+                    </a:xfrm>
+                    <a:prstGeom prst="rect">
+                      <a:avLst/>
+                    </a:prstGeom>
+                  </pic:spPr>
+                </pic:pic>
+              </a:graphicData>
+            </a:graphic>
+          </wp:inline>
+        </w:drawing>
+      </w:r>
+    </w:p>
+    <w:p>
+      <w:pPr>
+        <w:pStyle w:val="Textoindependiente"/>
+        <w:spacing w:after="0" w:line="240" w:lineRule="auto"/>
+        <w:jc w:val="both"/>
+        <w:rPr>
+          <w:lang w:val="es-CO"/>
+        </w:rPr>
+      </w:pPr>
+    </w:p>
+    <w:p>
+      <w:pPr>
+        <w:pStyle w:val="Textoindependiente"/>
+        <w:spacing w:after="0" w:line="240" w:lineRule="auto"/>
+        <w:jc w:val="both"/>
+        <w:rPr>
+          <w:lang w:val="es-CO"/>
+        </w:rPr>
+      </w:pPr>
+    </w:p>
+    <w:p>
+      <w:pPr>
+        <w:pStyle w:val="Textoindependiente"/>
+        <w:spacing w:after="0" w:line="240" w:lineRule="auto"/>
+        <w:jc w:val="both"/>
+        <w:rPr>
+          <w:lang w:val="es-CO"/>
+        </w:rPr>
+      </w:pPr>
+    </w:p>
+    <w:p>
+      <w:pPr>
+        <w:pStyle w:val="Textoindependiente"/>
+        <w:spacing w:after="0" w:line="240" w:lineRule="auto"/>
+        <w:jc w:val="both"/>
+        <w:rPr>
+          <w:lang w:val="es-CO"/>
+        </w:rPr>
+      </w:pPr>
+    </w:p>
+    <w:p>
+      <w:pPr>
+        <w:pStyle w:val="Textoindependiente"/>
+        <w:spacing w:after="0" w:line="240" w:lineRule="auto"/>
+        <w:jc w:val="both"/>
+        <w:rPr>
+          <w:lang w:val="es-CO"/>
+        </w:rPr>
+      </w:pPr>
+    </w:p>
+    <w:p>
+      <w:pPr>
+        <w:pStyle w:val="Textoindependiente"/>
+        <w:spacing w:after="0"/>
+        <w:jc w:val="both"/>
+        <w:rPr>
+          <w:lang w:val="es-CO"/>
+        </w:rPr>
+      </w:pPr>
+      <w:r>
+        <w:rPr>
+          <w:lang w:val="es-CO"/>
+        </w:rPr>
+        <w:lastRenderedPageBreak/>
+        <w:drawing>
+          <wp:inline distT="0" distB="0" distL="0" distR="0" wp14:anchorId="4479CF6B" wp14:editId="625A5762">
+            <wp:extent cx="5731510" cy="4210685"/>
+            <wp:effectExtent l="0" t="0" r="0" b="0"/>
+            <wp:docPr id="801562702" name="Imagen 4"/>
+            <wp:cNvGraphicFramePr>
+              <a:graphicFrameLocks xmlns:a="http://schemas.openxmlformats.org/drawingml/2006/main" noChangeAspect="1"/>
+            </wp:cNvGraphicFramePr>
+            <a:graphic xmlns:a="http://schemas.openxmlformats.org/drawingml/2006/main">
+              <a:graphicData uri="http://schemas.openxmlformats.org/drawingml/2006/picture">
+                <pic:pic xmlns:pic="http://schemas.openxmlformats.org/drawingml/2006/picture">
+                  <pic:nvPicPr>
+                    <pic:cNvPr id="0" name="Picture 10"/>
+                    <pic:cNvPicPr>
+                      <a:picLocks noChangeAspect="1" noChangeArrowheads="1"/>
+                    </pic:cNvPicPr>
+                  </pic:nvPicPr>
+                  <pic:blipFill>
+                    <a:blip r:embed="rId19" cstate="print">
+                      <a:extLst>
+                        <a:ext uri="{28A0092B-C50C-407E-A947-70E740481C1C}">
+                          <a14:useLocalDpi xmlns:a14="http://schemas.microsoft.com/office/drawing/2010/main" val="0"/>
+                        </a:ext>
+                      </a:extLst>
+                    </a:blip>
+                    <a:srcRect/>
+                    <a:stretch>
+                      <a:fillRect/>
+                    </a:stretch>
+                  </pic:blipFill>
+                  <pic:spPr bwMode="auto">
+                    <a:xfrm>
+                      <a:off x="0" y="0"/>
+                      <a:ext cx="5731510" cy="4210685"/>
+                    </a:xfrm>
+                    <a:prstGeom prst="rect">
+                      <a:avLst/>
+                    </a:prstGeom>
+                    <a:noFill/>
+                    <a:ln>
+                      <a:noFill/>
+                    </a:ln>
+                  </pic:spPr>
+                </pic:pic>
+              </a:graphicData>
+            </a:graphic>
+          </wp:inline>
+        </w:drawing>
+      </w:r>
+    </w:p>
+    <w:p>
+      <w:pPr>
+        <w:pStyle w:val="Textoindependiente"/>
+        <w:spacing w:after="0"/>
+        <w:jc w:val="both"/>
+        <w:rPr>
+          <w:lang w:val="es-CO"/>
+        </w:rPr>
+      </w:pPr>
+    </w:p>
+    <w:p>
+      <w:pPr>
+        <w:pStyle w:val="Textoindependiente"/>
+        <w:spacing w:after="0"/>
+        <w:jc w:val="both"/>
+        <w:rPr>
+          <w:lang w:val="es-CO"/>
+        </w:rPr>
+      </w:pPr>
+    </w:p>
+    <w:p>
+      <w:pPr>
+        <w:pStyle w:val="Textoindependiente"/>
+        <w:spacing w:after="0"/>
+        <w:jc w:val="both"/>
+        <w:rPr>
+          <w:lang w:val="es-CO"/>
+        </w:rPr>
+      </w:pPr>
+    </w:p>
+    <w:p>
+      <w:pPr>
+        <w:pStyle w:val="Textoindependiente"/>
+        <w:spacing w:after="0"/>
+        <w:jc w:val="both"/>
+      </w:pPr>
+      <w:proofErr w:type="spellStart"/>
+      <w:r>
+        <w:t>Descripción</w:t>
+      </w:r>
+      <w:proofErr w:type="spellEnd"/>
+      <w:r>
+        <w:t xml:space="preserve"> general de las </w:t>
+      </w:r>
+      <w:proofErr w:type="spellStart"/>
+      <w:r>
+        <w:t>entidades</w:t>
+      </w:r>
+      <w:proofErr w:type="spellEnd"/>
+      <w:r>
+        <w:t xml:space="preserve"> </w:t>
+      </w:r>
+      <w:proofErr w:type="spellStart"/>
+      <w:r>
+        <w:t>principales</w:t>
+      </w:r>
+      <w:proofErr w:type="spellEnd"/>
+      <w:r>
+        <w:t xml:space="preserve"> del </w:t>
+      </w:r>
+      <w:r>
+        <w:t>Sistema</w:t>
+      </w:r>
+    </w:p>
+    <w:p>
+      <w:pPr>
+        <w:pStyle w:val="Textoindependiente"/>
+        <w:spacing w:after="0"/>
+        <w:jc w:val="both"/>
+      </w:pPr>
+    </w:p>
+    <w:p>
+      <w:pPr>
+        <w:pStyle w:val="Textoindependiente"/>
+        <w:spacing w:after="0"/>
+        <w:jc w:val="both"/>
+        <w:rPr>
+          <w:lang w:val="es-CO"/>
+        </w:rPr>
+      </w:pPr>
+      <w:r>
+        <w:t xml:space="preserve">El Sistema de </w:t>
+      </w:r>
+      <w:proofErr w:type="spellStart"/>
+      <w:r>
+        <w:t>EduTech</w:t>
+      </w:r>
+      <w:proofErr w:type="spellEnd"/>
+      <w:r>
+        <w:t xml:space="preserve"> se </w:t>
+      </w:r>
+      <w:proofErr w:type="spellStart"/>
+      <w:r>
+        <w:t>compone</w:t>
+      </w:r>
+      <w:proofErr w:type="spellEnd"/>
+      <w:r>
+        <w:t xml:space="preserve"> de cuatro </w:t>
+      </w:r>
+      <w:proofErr w:type="spellStart"/>
+      <w:r>
+        <w:t>entidades</w:t>
+      </w:r>
+      <w:proofErr w:type="spellEnd"/>
+      <w:r>
+        <w:t xml:space="preserve"> principals </w:t>
+      </w:r>
+      <w:proofErr w:type="spellStart"/>
+      <w:r>
+        <w:t>usuarios</w:t>
+      </w:r>
+      <w:proofErr w:type="spellEnd"/>
+      <w:r>
+        <w:t xml:space="preserve">, </w:t>
+      </w:r>
+      <w:proofErr w:type="spellStart"/>
+      <w:r>
+        <w:t>actividades</w:t>
+      </w:r>
+      <w:proofErr w:type="spellEnd"/>
+      <w:r>
+        <w:t xml:space="preserve">, </w:t>
+      </w:r>
+      <w:proofErr w:type="spellStart"/>
+      <w:r>
+        <w:t>entregas,calificaciones</w:t>
+      </w:r>
+      <w:proofErr w:type="spellEnd"/>
+      <w:r>
+        <w:t xml:space="preserve"> </w:t>
+      </w:r>
+      <w:r>
+        <w:t xml:space="preserve">la </w:t>
+      </w:r>
+      <w:proofErr w:type="spellStart"/>
+      <w:r>
+        <w:t>entidad</w:t>
+      </w:r>
+      <w:proofErr w:type="spellEnd"/>
+      <w:r>
+        <w:t xml:space="preserve"> </w:t>
+      </w:r>
+      <w:proofErr w:type="spellStart"/>
+      <w:r>
+        <w:t>usuarios</w:t>
+      </w:r>
+      <w:proofErr w:type="spellEnd"/>
+      <w:r>
+        <w:t xml:space="preserve"> es </w:t>
+      </w:r>
+      <w:proofErr w:type="spellStart"/>
+      <w:r>
+        <w:t>muy</w:t>
+      </w:r>
+      <w:proofErr w:type="spellEnd"/>
+      <w:r>
+        <w:t xml:space="preserve"> </w:t>
+      </w:r>
+      <w:proofErr w:type="spellStart"/>
+      <w:r>
+        <w:t>importante</w:t>
+      </w:r>
+      <w:proofErr w:type="spellEnd"/>
+      <w:r>
+        <w:t xml:space="preserve"> </w:t>
+      </w:r>
+      <w:proofErr w:type="spellStart"/>
+      <w:r>
+        <w:t>ya</w:t>
+      </w:r>
+      <w:proofErr w:type="spellEnd"/>
+      <w:r>
+        <w:t xml:space="preserve"> </w:t>
+      </w:r>
+      <w:proofErr w:type="spellStart"/>
+      <w:r>
+        <w:t>que</w:t>
+      </w:r>
+      <w:proofErr w:type="spellEnd"/>
+      <w:r>
+        <w:t xml:space="preserve"> </w:t>
+      </w:r>
+      <w:proofErr w:type="spellStart"/>
+      <w:r>
+        <w:t>gestiona</w:t>
+      </w:r>
+      <w:proofErr w:type="spellEnd"/>
+      <w:r>
+        <w:t xml:space="preserve"> </w:t>
+      </w:r>
+      <w:proofErr w:type="spellStart"/>
+      <w:r>
+        <w:t>diferentes</w:t>
+      </w:r>
+      <w:proofErr w:type="spellEnd"/>
+      <w:r>
+        <w:t xml:space="preserve"> </w:t>
+      </w:r>
+      <w:proofErr w:type="spellStart"/>
+      <w:r>
+        <w:t>tipos</w:t>
+      </w:r>
+      <w:proofErr w:type="spellEnd"/>
+      <w:r>
+        <w:t xml:space="preserve"> de roles </w:t>
+      </w:r>
+      <w:proofErr w:type="spellStart"/>
+      <w:r>
+        <w:t>dentro</w:t>
+      </w:r>
+      <w:proofErr w:type="spellEnd"/>
+      <w:r>
+        <w:t xml:space="preserve"> de </w:t>
+      </w:r>
+      <w:proofErr w:type="spellStart"/>
+      <w:r>
+        <w:t>el</w:t>
+      </w:r>
+      <w:proofErr w:type="spellEnd"/>
+      <w:r>
+        <w:t xml:space="preserve"> Sistema </w:t>
+      </w:r>
+      <w:proofErr w:type="spellStart"/>
+      <w:r>
+        <w:t>esto</w:t>
+      </w:r>
+      <w:proofErr w:type="spellEnd"/>
+      <w:r>
+        <w:t xml:space="preserve"> </w:t>
+      </w:r>
+      <w:proofErr w:type="spellStart"/>
+      <w:r>
+        <w:t>hace</w:t>
+      </w:r>
+      <w:proofErr w:type="spellEnd"/>
+      <w:r>
+        <w:t xml:space="preserve"> </w:t>
+      </w:r>
+      <w:proofErr w:type="spellStart"/>
+      <w:r>
+        <w:t>que</w:t>
+      </w:r>
+      <w:proofErr w:type="spellEnd"/>
+      <w:r>
+        <w:t xml:space="preserve"> </w:t>
+      </w:r>
+      <w:proofErr w:type="spellStart"/>
+      <w:r>
+        <w:t>dependiendo</w:t>
+      </w:r>
+      <w:proofErr w:type="spellEnd"/>
+      <w:r>
+        <w:t xml:space="preserve"> de </w:t>
+      </w:r>
+      <w:proofErr w:type="spellStart"/>
+      <w:r>
+        <w:t>el</w:t>
+      </w:r>
+      <w:proofErr w:type="spellEnd"/>
+      <w:r>
+        <w:t xml:space="preserve"> </w:t>
+      </w:r>
+      <w:proofErr w:type="spellStart"/>
+      <w:r>
+        <w:t>rol</w:t>
+      </w:r>
+      <w:proofErr w:type="spellEnd"/>
+      <w:r>
+        <w:t xml:space="preserve"> </w:t>
+      </w:r>
+      <w:proofErr w:type="spellStart"/>
+      <w:r>
+        <w:t>que</w:t>
+      </w:r>
+      <w:proofErr w:type="spellEnd"/>
+      <w:r>
+        <w:t xml:space="preserve"> </w:t>
+      </w:r>
+      <w:proofErr w:type="spellStart"/>
+      <w:r>
+        <w:t>tengas</w:t>
+      </w:r>
+      <w:proofErr w:type="spellEnd"/>
+      <w:r>
+        <w:t xml:space="preserve"> </w:t>
+      </w:r>
+      <w:proofErr w:type="spellStart"/>
+      <w:r>
+        <w:t>tengas</w:t>
+      </w:r>
+      <w:proofErr w:type="spellEnd"/>
+      <w:r>
+        <w:t xml:space="preserve"> </w:t>
+      </w:r>
+      <w:proofErr w:type="spellStart"/>
+      <w:r>
+        <w:t>diferentes</w:t>
+      </w:r>
+      <w:proofErr w:type="spellEnd"/>
+      <w:r>
+        <w:t xml:space="preserve"> </w:t>
+      </w:r>
+      <w:proofErr w:type="spellStart"/>
+      <w:r>
+        <w:t>funcionalidades</w:t>
+      </w:r>
+      <w:proofErr w:type="spellEnd"/>
+      <w:r>
+        <w:t xml:space="preserve"> </w:t>
+      </w:r>
+      <w:proofErr w:type="spellStart"/>
+      <w:r>
+        <w:t>en</w:t>
+      </w:r>
+      <w:proofErr w:type="spellEnd"/>
+      <w:r>
+        <w:t xml:space="preserve"> </w:t>
+      </w:r>
+      <w:proofErr w:type="spellStart"/>
+      <w:r>
+        <w:t>el</w:t>
+      </w:r>
+      <w:proofErr w:type="spellEnd"/>
+      <w:r>
+        <w:t xml:space="preserve"> Sistema </w:t>
+      </w:r>
+      <w:proofErr w:type="spellStart"/>
+      <w:r>
+        <w:t>esto</w:t>
+      </w:r>
+      <w:proofErr w:type="spellEnd"/>
+      <w:r>
+        <w:t xml:space="preserve"> </w:t>
+      </w:r>
+      <w:proofErr w:type="spellStart"/>
+      <w:r>
+        <w:t>permite</w:t>
+      </w:r>
+      <w:proofErr w:type="spellEnd"/>
+      <w:r>
+        <w:t xml:space="preserve"> </w:t>
+      </w:r>
+      <w:proofErr w:type="spellStart"/>
+      <w:r>
+        <w:t>una</w:t>
+      </w:r>
+      <w:proofErr w:type="spellEnd"/>
+      <w:r>
+        <w:t xml:space="preserve"> gestion </w:t>
+      </w:r>
+      <w:proofErr w:type="spellStart"/>
+      <w:r>
+        <w:t>organizada</w:t>
+      </w:r>
+      <w:proofErr w:type="spellEnd"/>
+      <w:r>
+        <w:t xml:space="preserve"> y un Desarrollo </w:t>
+      </w:r>
+      <w:proofErr w:type="spellStart"/>
+      <w:r>
+        <w:t>limpio</w:t>
+      </w:r>
+      <w:proofErr w:type="spellEnd"/>
+      <w:r>
+        <w:t>.</w:t>
+      </w:r>
+    </w:p>
+    <w:p>
+      <w:pPr>
+        <w:pStyle w:val="Textoindependiente"/>
+        <w:spacing w:after="0" w:line="240" w:lineRule="auto"/>
+        <w:jc w:val="both"/>
+        <w:rPr>
+          <w:lang w:val="es-CO"/>
+        </w:rPr>
+      </w:pPr>
     </w:p>
     <w:sectPr>
-      <w:headerReference w:type="even" r:id="rId17"/>
-      <w:headerReference w:type="default" r:id="rId18"/>
-      <w:footerReference w:type="even" r:id="rId19"/>
-      <w:footerReference w:type="default" r:id="rId20"/>
-      <w:headerReference w:type="first" r:id="rId21"/>
-      <w:footerReference w:type="first" r:id="rId22"/>
+      <w:headerReference w:type="even" r:id="rId20"/>
+      <w:headerReference w:type="default" r:id="rId21"/>
+      <w:footerReference w:type="even" r:id="rId22"/>
+      <w:footerReference w:type="default" r:id="rId23"/>
+      <w:headerReference w:type="first" r:id="rId24"/>
+      <w:footerReference w:type="first" r:id="rId25"/>
       <w:pgSz w:w="11906" w:h="16838"/>
       <w:pgMar w:top="1440" w:right="1440" w:bottom="1497" w:left="1440" w:header="720" w:footer="1440" w:gutter="0"/>
       <w:pgNumType w:start="1"/>
@@ -4274,7 +4891,7 @@
         <w:noProof/>
       </w:rPr>
       <w:pict w14:anchorId="47AE6B9C">
-        <v:rect id="Marco2" o:spid="_x0000_s1026" style="position:absolute;margin-left:-50.05pt;margin-top:.05pt;width:1.15pt;height:1.15pt;z-index:-503316478;visibility:visible;mso-wrap-style:square;mso-wrap-distance-left:0;mso-wrap-distance-top:0;mso-wrap-distance-right:0;mso-wrap-distance-bottom:0;mso-position-horizontal:right;mso-position-horizontal-relative:margin;mso-position-vertical:absolute;mso-position-vertical-relative:text;v-text-anchor:top" o:gfxdata="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" o:allowincell="f" filled="f" stroked="f" strokeweight="0">
+        <v:rect id="Marco2" o:spid="_x0000_s1026" style="position:absolute;margin-left:-100.1pt;margin-top:.05pt;width:1.15pt;height:1.15pt;z-index:-503316478;visibility:visible;mso-wrap-style:square;mso-wrap-distance-left:0;mso-wrap-distance-top:0;mso-wrap-distance-right:0;mso-wrap-distance-bottom:0;mso-position-horizontal:right;mso-position-horizontal-relative:margin;mso-position-vertical:absolute;mso-position-vertical-relative:text;v-text-anchor:top" o:gfxdata="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" o:allowincell="f" filled="f" stroked="f" strokeweight="0">
           <v:textbox style="mso-fit-shape-to-text:t" inset="0,0,0,0">
             <w:txbxContent>
               <w:p>
@@ -4345,7 +4962,7 @@
         <w:noProof/>
       </w:rPr>
       <w:pict w14:anchorId="73B3E454">
-        <v:rect id="Marco3" o:spid="_x0000_s1025" style="position:absolute;left:0;text-align:left;margin-left:-45.15pt;margin-top:.05pt;width:6.05pt;height:13.8pt;z-index:-503316461;visibility:visible;mso-wrap-style:square;mso-wrap-distance-left:0;mso-wrap-distance-top:0;mso-wrap-distance-right:0;mso-wrap-distance-bottom:0;mso-position-horizontal:right;mso-position-horizontal-relative:margin;mso-position-vertical:absolute;mso-position-vertical-relative:text;v-text-anchor:top" o:gfxdata="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" o:allowincell="f" filled="f" stroked="f" strokeweight="0">
+        <v:rect id="Marco3" o:spid="_x0000_s1025" style="position:absolute;left:0;text-align:left;margin-left:-90.3pt;margin-top:.05pt;width:6.05pt;height:13.8pt;z-index:-503316461;visibility:visible;mso-wrap-style:square;mso-wrap-distance-left:0;mso-wrap-distance-top:0;mso-wrap-distance-right:0;mso-wrap-distance-bottom:0;mso-position-horizontal:right;mso-position-horizontal-relative:margin;mso-position-vertical:absolute;mso-position-vertical-relative:text;v-text-anchor:top" o:gfxdata="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" o:allowincell="f" filled="f" stroked="f" strokeweight="0">
           <v:textbox style="mso-fit-shape-to-text:t" inset="0,0,0,0">
             <w:txbxContent>
               <w:p>

</xml_diff>